<commit_message>
Changed the status scheme; synced the docx with google docs
</commit_message>
<xml_diff>
--- a/res/template_medium.docx
+++ b/res/template_medium.docx
@@ -56,326 +56,349 @@
         <w:t>og</w:t>
       </w:r>
     </w:p>
-    <w:p>
-      <w:r>
-        <w:rPr>
-          <w:rFonts w:hint="eastAsia"/>
-        </w:rPr>
-        <w:t>Ticket number: {</w:t>
-      </w:r>
-      <w:r>
-        <w:rPr>
-          <w:rFonts w:hint="eastAsia"/>
-        </w:rPr>
-        <w:t>{</w:t>
-      </w:r>
-      <w:r>
-        <w:rPr>
-          <w:rFonts w:hint="eastAsia"/>
-        </w:rPr>
-        <w:t xml:space="preserve"> </w:t>
-      </w:r>
-      <w:r>
-        <w:t>project_info</w:t>
-      </w:r>
-      <w:r>
-        <w:rPr>
-          <w:rFonts w:hint="eastAsia"/>
-        </w:rPr>
-        <w:t>.</w:t>
-      </w:r>
-      <w:r>
-        <w:t>ticket_number</w:t>
-      </w:r>
-      <w:r>
-        <w:rPr>
-          <w:rFonts w:hint="eastAsia"/>
-        </w:rPr>
-        <w:t xml:space="preserve"> }</w:t>
-      </w:r>
-      <w:r>
-        <w:rPr>
-          <w:rFonts w:hint="eastAsia"/>
-        </w:rPr>
-        <w:t>}</w:t>
-      </w:r>
-    </w:p>
-    <w:p>
-      <w:r>
-        <w:t xml:space="preserve">Curator </w:t>
-      </w:r>
-      <w:r>
-        <w:rPr>
-          <w:rFonts w:hint="eastAsia"/>
-        </w:rPr>
-        <w:t>name</w:t>
-      </w:r>
-      <w:r>
-        <w:t>:</w:t>
-      </w:r>
-      <w:r>
-        <w:rPr>
-          <w:rFonts w:hint="eastAsia"/>
-        </w:rPr>
-        <w:t xml:space="preserve"> {{ </w:t>
-      </w:r>
-      <w:r>
-        <w:t>project_info</w:t>
-      </w:r>
-      <w:r>
-        <w:rPr>
-          <w:rFonts w:hint="eastAsia"/>
-        </w:rPr>
-        <w:t>.curator_name }}</w:t>
-      </w:r>
-    </w:p>
-    <w:p>
-      <w:r>
-        <w:rPr>
-          <w:rFonts w:hint="eastAsia"/>
-        </w:rPr>
-        <w:t xml:space="preserve">Curator email: {{ </w:t>
-      </w:r>
-      <w:r>
-        <w:t>project_info</w:t>
-      </w:r>
-      <w:r>
-        <w:rPr>
-          <w:rFonts w:hint="eastAsia"/>
-        </w:rPr>
-        <w:t>.</w:t>
-      </w:r>
-      <w:r>
-        <w:t>curator_email</w:t>
-      </w:r>
-      <w:r>
-        <w:rPr>
-          <w:rFonts w:hint="eastAsia"/>
-        </w:rPr>
-        <w:t xml:space="preserve"> }}</w:t>
-      </w:r>
-    </w:p>
-    <w:p>
-      <w:r>
-        <w:rPr>
-          <w:rFonts w:hint="eastAsia"/>
-        </w:rPr>
-        <w:t xml:space="preserve">Dataset title: </w:t>
-      </w:r>
-      <w:r>
-        <w:rPr>
-          <w:rFonts w:hint="eastAsia"/>
-        </w:rPr>
-        <w:t xml:space="preserve">{{ </w:t>
-      </w:r>
-      <w:r>
-        <w:rPr>
-          <w:rFonts w:hint="eastAsia"/>
-        </w:rPr>
-        <w:t>dataset.</w:t>
-      </w:r>
-      <w:r>
-        <w:t>DatasetTitle</w:t>
-      </w:r>
-      <w:r>
-        <w:rPr>
-          <w:rFonts w:hint="eastAsia"/>
-        </w:rPr>
-        <w:t xml:space="preserve"> </w:t>
-      </w:r>
-      <w:r>
-        <w:rPr>
-          <w:rFonts w:hint="eastAsia"/>
-        </w:rPr>
-        <w:t>}}</w:t>
-      </w:r>
-    </w:p>
-    <w:p>
-      <w:r>
-        <w:rPr>
-          <w:rFonts w:hint="eastAsia"/>
-        </w:rPr>
-        <w:t xml:space="preserve">Dataset </w:t>
-      </w:r>
-      <w:r>
-        <w:t>persistent</w:t>
-      </w:r>
-      <w:r>
-        <w:rPr>
-          <w:rFonts w:hint="eastAsia"/>
-        </w:rPr>
-        <w:t xml:space="preserve"> identifier</w:t>
-      </w:r>
-      <w:r>
-        <w:rPr>
-          <w:rFonts w:hint="eastAsia"/>
-        </w:rPr>
-        <w:t>: {</w:t>
-      </w:r>
-      <w:r>
-        <w:rPr>
-          <w:rFonts w:hint="eastAsia"/>
-        </w:rPr>
-        <w:t>{</w:t>
-      </w:r>
-      <w:r>
-        <w:rPr>
-          <w:rFonts w:hint="eastAsia"/>
-        </w:rPr>
-        <w:t xml:space="preserve"> </w:t>
-      </w:r>
-      <w:r>
-        <w:rPr>
-          <w:rFonts w:hint="eastAsia"/>
-        </w:rPr>
-        <w:t>dataset.</w:t>
-      </w:r>
-      <w:r>
-        <w:t>DatasetPersistentId</w:t>
-      </w:r>
-      <w:r>
-        <w:rPr>
-          <w:rFonts w:hint="eastAsia"/>
-        </w:rPr>
-        <w:t xml:space="preserve">  }</w:t>
-      </w:r>
-      <w:r>
-        <w:rPr>
-          <w:rFonts w:hint="eastAsia"/>
-        </w:rPr>
-        <w:t>}</w:t>
-      </w:r>
-    </w:p>
-    <w:p>
-      <w:r>
-        <w:rPr>
-          <w:rFonts w:hint="eastAsia"/>
-        </w:rPr>
-        <w:t>Dataset ID (versioned): {{ dataset.ID  }}</w:t>
-      </w:r>
-    </w:p>
-    <w:p>
-      <w:r>
-        <w:rPr>
-          <w:rFonts w:hint="eastAsia"/>
-        </w:rPr>
-        <w:t>Dataset access URL: {</w:t>
-      </w:r>
-      <w:r>
-        <w:rPr>
-          <w:rFonts w:hint="eastAsia"/>
-        </w:rPr>
-        <w:t>{</w:t>
-      </w:r>
-      <w:r>
-        <w:rPr>
-          <w:rFonts w:hint="eastAsia"/>
-        </w:rPr>
-        <w:t xml:space="preserve"> dataset.</w:t>
-      </w:r>
-      <w:r>
-        <w:t>DatasetURL</w:t>
-      </w:r>
-      <w:r>
-        <w:rPr>
-          <w:rFonts w:hint="eastAsia"/>
-        </w:rPr>
-        <w:t xml:space="preserve"> }</w:t>
-      </w:r>
-      <w:r>
-        <w:rPr>
-          <w:rFonts w:hint="eastAsia"/>
-        </w:rPr>
-        <w:t>}</w:t>
-      </w:r>
-    </w:p>
-    <w:p>
-      <w:r>
-        <w:rPr>
-          <w:rFonts w:hint="eastAsia"/>
-        </w:rPr>
-        <w:t>Log</w:t>
-      </w:r>
-      <w:r>
-        <w:rPr>
-          <w:rFonts w:hint="eastAsia"/>
-        </w:rPr>
-        <w:t xml:space="preserve"> </w:t>
-      </w:r>
-      <w:r>
-        <w:t>initial</w:t>
-      </w:r>
-      <w:r>
-        <w:rPr>
-          <w:rFonts w:hint="eastAsia"/>
-        </w:rPr>
-        <w:t xml:space="preserve"> generated</w:t>
-      </w:r>
-      <w:r>
-        <w:rPr>
-          <w:rFonts w:hint="eastAsia"/>
-        </w:rPr>
-        <w:t xml:space="preserve"> </w:t>
-      </w:r>
-      <w:r>
-        <w:rPr>
-          <w:rFonts w:hint="eastAsia"/>
-        </w:rPr>
-        <w:t xml:space="preserve">date: </w:t>
-      </w:r>
-      <w:r>
-        <w:rPr>
-          <w:rFonts w:hint="eastAsia"/>
-        </w:rPr>
-        <w:t>{</w:t>
-      </w:r>
-      <w:r>
-        <w:rPr>
-          <w:rFonts w:hint="eastAsia"/>
-        </w:rPr>
-        <w:t>{</w:t>
-      </w:r>
-      <w:r>
-        <w:rPr>
-          <w:rFonts w:hint="eastAsia"/>
-        </w:rPr>
-        <w:t xml:space="preserve"> </w:t>
-      </w:r>
-      <w:r>
-        <w:rPr>
-          <w:rFonts w:hint="eastAsia"/>
-        </w:rPr>
-        <w:t>timestamp</w:t>
-      </w:r>
-      <w:r>
-        <w:rPr>
-          <w:rFonts w:hint="eastAsia"/>
-        </w:rPr>
-        <w:t xml:space="preserve"> }</w:t>
-      </w:r>
-      <w:r>
-        <w:rPr>
-          <w:rFonts w:hint="eastAsia"/>
-        </w:rPr>
-        <w:t>}</w:t>
-      </w:r>
-    </w:p>
-    <w:p>
-      <w:r>
-        <w:rPr>
-          <w:rFonts w:hint="eastAsia"/>
-        </w:rPr>
-        <w:t xml:space="preserve">Log last updated date: </w:t>
-      </w:r>
-      <w:r>
-        <w:rPr>
-          <w:rFonts w:hint="eastAsia"/>
-          <w:color w:val="FF0000"/>
-          <w:highlight w:val="yellow"/>
-        </w:rPr>
-        <w:t>FILL IN THIS FIELD</w:t>
-      </w:r>
-    </w:p>
+    <w:tbl>
+      <w:tblPr>
+        <w:tblStyle w:val="TableGrid"/>
+        <w:tblW w:w="0" w:type="auto"/>
+        <w:tblBorders>
+          <w:top w:val="none" w:sz="0" w:space="0" w:color="auto"/>
+          <w:left w:val="none" w:sz="0" w:space="0" w:color="auto"/>
+          <w:bottom w:val="none" w:sz="0" w:space="0" w:color="auto"/>
+          <w:right w:val="none" w:sz="0" w:space="0" w:color="auto"/>
+          <w:insideH w:val="none" w:sz="0" w:space="0" w:color="auto"/>
+          <w:insideV w:val="none" w:sz="0" w:space="0" w:color="auto"/>
+        </w:tblBorders>
+        <w:tblLook w:val="04A0" w:firstRow="1" w:lastRow="0" w:firstColumn="1" w:lastColumn="0" w:noHBand="0" w:noVBand="1"/>
+      </w:tblPr>
+      <w:tblGrid>
+        <w:gridCol w:w="11180"/>
+        <w:gridCol w:w="11181"/>
+      </w:tblGrid>
+      <w:tr>
+        <w:tc>
+          <w:tcPr>
+            <w:tcW w:w="11180" w:type="dxa"/>
+          </w:tcPr>
+          <w:p>
+            <w:pPr>
+              <w:spacing w:line="480" w:lineRule="auto"/>
+            </w:pPr>
+            <w:r>
+              <w:rPr>
+                <w:rFonts w:hint="eastAsia"/>
+              </w:rPr>
+              <w:t xml:space="preserve">Ticket number: {{ </w:t>
+            </w:r>
+            <w:r>
+              <w:t>project_info</w:t>
+            </w:r>
+            <w:r>
+              <w:rPr>
+                <w:rFonts w:hint="eastAsia"/>
+              </w:rPr>
+              <w:t>.</w:t>
+            </w:r>
+            <w:r>
+              <w:t>ticket_number</w:t>
+            </w:r>
+            <w:r>
+              <w:rPr>
+                <w:rFonts w:hint="eastAsia"/>
+              </w:rPr>
+              <w:t xml:space="preserve"> }}</w:t>
+            </w:r>
+          </w:p>
+          <w:p>
+            <w:pPr>
+              <w:spacing w:line="480" w:lineRule="auto"/>
+            </w:pPr>
+            <w:r>
+              <w:t xml:space="preserve">Curator </w:t>
+            </w:r>
+            <w:r>
+              <w:rPr>
+                <w:rFonts w:hint="eastAsia"/>
+              </w:rPr>
+              <w:t>name</w:t>
+            </w:r>
+            <w:r>
+              <w:t>:</w:t>
+            </w:r>
+            <w:r>
+              <w:rPr>
+                <w:rFonts w:hint="eastAsia"/>
+              </w:rPr>
+              <w:t xml:space="preserve"> {{ </w:t>
+            </w:r>
+            <w:r>
+              <w:t>project_info</w:t>
+            </w:r>
+            <w:r>
+              <w:rPr>
+                <w:rFonts w:hint="eastAsia"/>
+              </w:rPr>
+              <w:t>.curator_name }}</w:t>
+            </w:r>
+          </w:p>
+          <w:p>
+            <w:pPr>
+              <w:spacing w:line="480" w:lineRule="auto"/>
+            </w:pPr>
+            <w:r>
+              <w:rPr>
+                <w:rFonts w:hint="eastAsia"/>
+              </w:rPr>
+              <w:t xml:space="preserve">Curator email: {{ </w:t>
+            </w:r>
+            <w:r>
+              <w:t>project_info</w:t>
+            </w:r>
+            <w:r>
+              <w:rPr>
+                <w:rFonts w:hint="eastAsia"/>
+              </w:rPr>
+              <w:t>.</w:t>
+            </w:r>
+            <w:r>
+              <w:t>curator_email</w:t>
+            </w:r>
+            <w:r>
+              <w:rPr>
+                <w:rFonts w:hint="eastAsia"/>
+              </w:rPr>
+              <w:t xml:space="preserve"> }}</w:t>
+            </w:r>
+          </w:p>
+          <w:p>
+            <w:pPr>
+              <w:spacing w:line="480" w:lineRule="auto"/>
+            </w:pPr>
+            <w:r>
+              <w:rPr>
+                <w:rFonts w:hint="eastAsia"/>
+              </w:rPr>
+              <w:t>Dataset title: {{ dataset.</w:t>
+            </w:r>
+            <w:r>
+              <w:t>DatasetTitle</w:t>
+            </w:r>
+            <w:r>
+              <w:rPr>
+                <w:rFonts w:hint="eastAsia"/>
+              </w:rPr>
+              <w:t xml:space="preserve"> }}</w:t>
+            </w:r>
+          </w:p>
+          <w:p>
+            <w:pPr>
+              <w:spacing w:line="480" w:lineRule="auto"/>
+            </w:pPr>
+            <w:r>
+              <w:rPr>
+                <w:rFonts w:hint="eastAsia"/>
+              </w:rPr>
+              <w:t xml:space="preserve">Dataset </w:t>
+            </w:r>
+            <w:r>
+              <w:t>persistent</w:t>
+            </w:r>
+            <w:r>
+              <w:rPr>
+                <w:rFonts w:hint="eastAsia"/>
+              </w:rPr>
+              <w:t xml:space="preserve"> identifier: {{ dataset.</w:t>
+            </w:r>
+            <w:r>
+              <w:t>DatasetPersistentId</w:t>
+            </w:r>
+            <w:r>
+              <w:rPr>
+                <w:rFonts w:hint="eastAsia"/>
+              </w:rPr>
+              <w:t xml:space="preserve">  }}</w:t>
+            </w:r>
+          </w:p>
+          <w:p>
+            <w:pPr>
+              <w:spacing w:line="480" w:lineRule="auto"/>
+            </w:pPr>
+            <w:r>
+              <w:rPr>
+                <w:rFonts w:hint="eastAsia"/>
+              </w:rPr>
+              <w:t>Dataset ID (versioned): {{ dataset.ID  }}</w:t>
+            </w:r>
+          </w:p>
+          <w:p>
+            <w:pPr>
+              <w:spacing w:line="480" w:lineRule="auto"/>
+            </w:pPr>
+            <w:r>
+              <w:rPr>
+                <w:rFonts w:hint="eastAsia"/>
+              </w:rPr>
+              <w:t>Dataset access URL: {{ dataset.</w:t>
+            </w:r>
+            <w:r>
+              <w:t>DatasetURL</w:t>
+            </w:r>
+            <w:r>
+              <w:rPr>
+                <w:rFonts w:hint="eastAsia"/>
+              </w:rPr>
+              <w:t xml:space="preserve"> }}</w:t>
+            </w:r>
+          </w:p>
+          <w:p>
+            <w:pPr>
+              <w:spacing w:line="480" w:lineRule="auto"/>
+            </w:pPr>
+            <w:r>
+              <w:rPr>
+                <w:rFonts w:hint="eastAsia"/>
+              </w:rPr>
+              <w:t xml:space="preserve">Log </w:t>
+            </w:r>
+            <w:r>
+              <w:t>initial</w:t>
+            </w:r>
+            <w:r>
+              <w:rPr>
+                <w:rFonts w:hint="eastAsia"/>
+              </w:rPr>
+              <w:t xml:space="preserve"> generated date: {{ timestamp }}</w:t>
+            </w:r>
+          </w:p>
+          <w:p>
+            <w:pPr>
+              <w:spacing w:line="480" w:lineRule="auto"/>
+            </w:pPr>
+            <w:r>
+              <w:rPr>
+                <w:rFonts w:hint="eastAsia"/>
+              </w:rPr>
+              <w:t xml:space="preserve">Log last updated date: </w:t>
+            </w:r>
+            <w:r>
+              <w:rPr>
+                <w:rFonts w:hint="eastAsia"/>
+                <w:color w:val="FF0000"/>
+                <w:highlight w:val="yellow"/>
+              </w:rPr>
+              <w:t>FILL IN THIS FIELD</w:t>
+            </w:r>
+          </w:p>
+        </w:tc>
+        <w:tc>
+          <w:tcPr>
+            <w:tcW w:w="11181" w:type="dxa"/>
+          </w:tcPr>
+          <w:p>
+            <w:pPr>
+              <w:spacing w:line="480" w:lineRule="auto"/>
+              <w:rPr>
+                <w:b/>
+                <w:bCs/>
+                <w:u w:val="single"/>
+              </w:rPr>
+            </w:pPr>
+            <w:r>
+              <w:rPr>
+                <w:rFonts w:hint="eastAsia"/>
+                <w:b/>
+                <w:bCs/>
+                <w:u w:val="single"/>
+              </w:rPr>
+              <w:t xml:space="preserve">Explanation of </w:t>
+            </w:r>
+            <w:r>
+              <w:rPr>
+                <w:rFonts w:hint="eastAsia"/>
+                <w:b/>
+                <w:bCs/>
+                <w:u w:val="single"/>
+              </w:rPr>
+              <w:t>Status</w:t>
+            </w:r>
+          </w:p>
+          <w:p>
+            <w:pPr>
+              <w:spacing w:line="480" w:lineRule="auto"/>
+            </w:pPr>
+            <w:r>
+              <w:rPr>
+                <w:b/>
+                <w:bCs/>
+              </w:rPr>
+              <w:t>P</w:t>
+            </w:r>
+            <w:r>
+              <w:t>: Passed</w:t>
+            </w:r>
+          </w:p>
+          <w:p>
+            <w:pPr>
+              <w:spacing w:line="480" w:lineRule="auto"/>
+            </w:pPr>
+            <w:r>
+              <w:rPr>
+                <w:b/>
+                <w:bCs/>
+              </w:rPr>
+              <w:t>RQU</w:t>
+            </w:r>
+            <w:r>
+              <w:t>:  Required Follow-up</w:t>
+            </w:r>
+          </w:p>
+          <w:p>
+            <w:pPr>
+              <w:spacing w:line="480" w:lineRule="auto"/>
+            </w:pPr>
+            <w:r>
+              <w:rPr>
+                <w:b/>
+                <w:bCs/>
+              </w:rPr>
+              <w:t>RCM</w:t>
+            </w:r>
+            <w:r>
+              <w:t>: Recommend Follow-up</w:t>
+            </w:r>
+          </w:p>
+          <w:p>
+            <w:pPr>
+              <w:spacing w:line="480" w:lineRule="auto"/>
+            </w:pPr>
+            <w:r>
+              <w:rPr>
+                <w:b/>
+                <w:bCs/>
+              </w:rPr>
+              <w:t>NS</w:t>
+            </w:r>
+            <w:r>
+              <w:t>: RQUt Sure</w:t>
+            </w:r>
+          </w:p>
+          <w:p>
+            <w:pPr>
+              <w:spacing w:line="480" w:lineRule="auto"/>
+            </w:pPr>
+            <w:r>
+              <w:rPr>
+                <w:b/>
+                <w:bCs/>
+              </w:rPr>
+              <w:t>NA</w:t>
+            </w:r>
+            <w:r>
+              <w:t>: Not applicable.</w:t>
+            </w:r>
+          </w:p>
+        </w:tc>
+      </w:tr>
+    </w:tbl>
     <w:p/>
     <w:tbl>
       <w:tblPr>
@@ -389,17 +412,17 @@
         <w:tblLook w:val="04A0" w:firstRow="1" w:lastRow="0" w:firstColumn="1" w:lastColumn="0" w:noHBand="0" w:noVBand="1"/>
       </w:tblPr>
       <w:tblGrid>
-        <w:gridCol w:w="489"/>
-        <w:gridCol w:w="1272"/>
-        <w:gridCol w:w="1694"/>
-        <w:gridCol w:w="3573"/>
-        <w:gridCol w:w="3104"/>
-        <w:gridCol w:w="3573"/>
-        <w:gridCol w:w="400"/>
-        <w:gridCol w:w="2357"/>
-        <w:gridCol w:w="4101"/>
-        <w:gridCol w:w="1038"/>
-        <w:gridCol w:w="750"/>
+        <w:gridCol w:w="487"/>
+        <w:gridCol w:w="1262"/>
+        <w:gridCol w:w="1851"/>
+        <w:gridCol w:w="3544"/>
+        <w:gridCol w:w="3080"/>
+        <w:gridCol w:w="3544"/>
+        <w:gridCol w:w="398"/>
+        <w:gridCol w:w="2339"/>
+        <w:gridCol w:w="4070"/>
+        <w:gridCol w:w="1031"/>
+        <w:gridCol w:w="745"/>
       </w:tblGrid>
       <w:tr>
         <w:trPr>
@@ -785,7 +808,7 @@
                 <w:bCs/>
                 <w:lang w:val="en-US"/>
               </w:rPr>
-              <w:t>Yes</w:t>
+              <w:t>P</w:t>
             </w:r>
           </w:p>
         </w:tc>
@@ -819,7 +842,7 @@
                 <w:bCs/>
                 <w:lang w:val="en-US"/>
               </w:rPr>
-              <w:t>No</w:t>
+              <w:t>RQU</w:t>
             </w:r>
           </w:p>
         </w:tc>
@@ -853,7 +876,7 @@
                 <w:bCs/>
                 <w:lang w:val="en-US"/>
               </w:rPr>
-              <w:t>SI</w:t>
+              <w:t>RCM</w:t>
             </w:r>
           </w:p>
         </w:tc>
@@ -1101,6 +1124,24 @@
               <w:t>Python scripted.</w:t>
             </w:r>
           </w:p>
+          <w:p>
+            <w:pPr>
+              <w:pStyle w:val="ListParagraph"/>
+              <w:numPr>
+                <w:ilvl w:val="0"/>
+                <w:numId w:val="33"/>
+              </w:numPr>
+              <w:rPr>
+                <w:lang w:val="en-US"/>
+              </w:rPr>
+            </w:pPr>
+            <w:r>
+              <w:rPr>
+                <w:lang w:val="en-US"/>
+              </w:rPr>
+              <w:t>Confirm whether the listed dataverse collection refers to the same researcher/author</w:t>
+            </w:r>
+          </w:p>
         </w:tc>
         <w:tc>
           <w:tcPr>
@@ -1189,6 +1230,31 @@
                 <w:lang w:val="en-US"/>
               </w:rPr>
             </w:pPr>
+          </w:p>
+        </w:tc>
+        <w:tc>
+          <w:tcPr>
+            <w:tcW w:w="0" w:type="auto"/>
+            <w:tcBorders>
+              <w:top w:val="single" w:sz="8" w:space="0" w:color="000000"/>
+              <w:left w:val="single" w:sz="8" w:space="0" w:color="000000"/>
+              <w:bottom w:val="single" w:sz="8" w:space="0" w:color="000000"/>
+              <w:right w:val="single" w:sz="8" w:space="0" w:color="000000"/>
+            </w:tcBorders>
+            <w:tcMar>
+              <w:top w:w="100" w:type="dxa"/>
+              <w:left w:w="100" w:type="dxa"/>
+              <w:bottom w:w="100" w:type="dxa"/>
+              <w:right w:w="100" w:type="dxa"/>
+            </w:tcMar>
+            <w:hideMark/>
+          </w:tcPr>
+          <w:p>
+            <w:pPr>
+              <w:rPr>
+                <w:lang w:val="en-US"/>
+              </w:rPr>
+            </w:pPr>
             <w:r>
               <w:rPr>
                 <w:lang w:val="en-US"/>
@@ -1222,31 +1288,6 @@
               <w:t xml:space="preserve"> 0 %}X{% endif %}</w:t>
             </w:r>
           </w:p>
-          <w:p>
-            <w:pPr>
-              <w:rPr>
-                <w:lang w:val="en-US"/>
-              </w:rPr>
-            </w:pPr>
-          </w:p>
-        </w:tc>
-        <w:tc>
-          <w:tcPr>
-            <w:tcW w:w="0" w:type="auto"/>
-            <w:tcBorders>
-              <w:top w:val="single" w:sz="8" w:space="0" w:color="000000"/>
-              <w:left w:val="single" w:sz="8" w:space="0" w:color="000000"/>
-              <w:bottom w:val="single" w:sz="8" w:space="0" w:color="000000"/>
-              <w:right w:val="single" w:sz="8" w:space="0" w:color="000000"/>
-            </w:tcBorders>
-            <w:tcMar>
-              <w:top w:w="100" w:type="dxa"/>
-              <w:left w:w="100" w:type="dxa"/>
-              <w:bottom w:w="100" w:type="dxa"/>
-              <w:right w:w="100" w:type="dxa"/>
-            </w:tcMar>
-            <w:hideMark/>
-          </w:tcPr>
           <w:p>
             <w:pPr>
               <w:rPr>
@@ -1559,14 +1600,14 @@
               <w:rPr>
                 <w:lang w:val="en-US"/>
               </w:rPr>
-              <w:t xml:space="preserve">If the dataset is deposited in a sub-dataverse collection, include </w:t>
+              <w:t>If the dataset is deposited in a sub-dataverse collectio</w:t>
             </w:r>
             <w:r>
               <w:rPr>
                 <w:lang w:val="en-US"/>
               </w:rPr>
               <w:lastRenderedPageBreak/>
-              <w:t>the name of the collection. </w:t>
+              <w:t>n, include the name of the collection. </w:t>
             </w:r>
           </w:p>
           <w:p>
@@ -1663,6 +1704,30 @@
               <w:bottom w:w="100" w:type="dxa"/>
               <w:right w:w="100" w:type="dxa"/>
             </w:tcMar>
+          </w:tcPr>
+          <w:p>
+            <w:pPr>
+              <w:rPr>
+                <w:lang w:val="en-US"/>
+              </w:rPr>
+            </w:pPr>
+          </w:p>
+        </w:tc>
+        <w:tc>
+          <w:tcPr>
+            <w:tcW w:w="0" w:type="auto"/>
+            <w:tcBorders>
+              <w:top w:val="single" w:sz="8" w:space="0" w:color="000000"/>
+              <w:left w:val="single" w:sz="8" w:space="0" w:color="000000"/>
+              <w:bottom w:val="single" w:sz="8" w:space="0" w:color="000000"/>
+              <w:right w:val="single" w:sz="8" w:space="0" w:color="000000"/>
+            </w:tcBorders>
+            <w:tcMar>
+              <w:top w:w="100" w:type="dxa"/>
+              <w:left w:w="100" w:type="dxa"/>
+              <w:bottom w:w="100" w:type="dxa"/>
+              <w:right w:w="100" w:type="dxa"/>
+            </w:tcMar>
             <w:hideMark/>
           </w:tcPr>
           <w:p>
@@ -1759,38 +1824,6 @@
               </w:rPr>
             </w:pPr>
           </w:p>
-          <w:p>
-            <w:pPr>
-              <w:rPr>
-                <w:lang w:val="en-US"/>
-              </w:rPr>
-            </w:pPr>
-          </w:p>
-        </w:tc>
-        <w:tc>
-          <w:tcPr>
-            <w:tcW w:w="0" w:type="auto"/>
-            <w:tcBorders>
-              <w:top w:val="single" w:sz="8" w:space="0" w:color="000000"/>
-              <w:left w:val="single" w:sz="8" w:space="0" w:color="000000"/>
-              <w:bottom w:val="single" w:sz="8" w:space="0" w:color="000000"/>
-              <w:right w:val="single" w:sz="8" w:space="0" w:color="000000"/>
-            </w:tcBorders>
-            <w:tcMar>
-              <w:top w:w="100" w:type="dxa"/>
-              <w:left w:w="100" w:type="dxa"/>
-              <w:bottom w:w="100" w:type="dxa"/>
-              <w:right w:w="100" w:type="dxa"/>
-            </w:tcMar>
-            <w:hideMark/>
-          </w:tcPr>
-          <w:p>
-            <w:pPr>
-              <w:rPr>
-                <w:lang w:val="en-US"/>
-              </w:rPr>
-            </w:pPr>
-          </w:p>
         </w:tc>
         <w:tc>
           <w:tcPr>
@@ -2114,14 +2147,14 @@
               <w:rPr>
                 <w:lang w:val="en-US"/>
               </w:rPr>
-              <w:t>Confirm with the deposit</w:t>
+              <w:t xml:space="preserve">Confirm with the depositor that they actually </w:t>
             </w:r>
             <w:r>
               <w:rPr>
                 <w:lang w:val="en-US"/>
               </w:rPr>
               <w:lastRenderedPageBreak/>
-              <w:t>or that they actually require a dataverse (e.g., will there be future deposits?)</w:t>
+              <w:t>require a dataverse (e.g., will there be future deposits?)</w:t>
             </w:r>
           </w:p>
         </w:tc>
@@ -2463,7 +2496,7 @@
                 <w:bCs/>
                 <w:lang w:val="en-US"/>
               </w:rPr>
-              <w:t>Yes</w:t>
+              <w:t>P</w:t>
             </w:r>
           </w:p>
         </w:tc>
@@ -2497,7 +2530,7 @@
                 <w:bCs/>
                 <w:lang w:val="en-US"/>
               </w:rPr>
-              <w:t>No</w:t>
+              <w:t>RQU</w:t>
             </w:r>
           </w:p>
         </w:tc>
@@ -2531,7 +2564,7 @@
                 <w:bCs/>
                 <w:lang w:val="en-US"/>
               </w:rPr>
-              <w:t>SI</w:t>
+              <w:t>RCM</w:t>
             </w:r>
           </w:p>
         </w:tc>
@@ -2834,37 +2867,37 @@
                 <w:lang w:val="en-US"/>
               </w:rPr>
             </w:pPr>
-          </w:p>
-        </w:tc>
-        <w:tc>
-          <w:tcPr>
-            <w:tcW w:w="0" w:type="auto"/>
-            <w:tcBorders>
-              <w:top w:val="single" w:sz="8" w:space="0" w:color="000000"/>
-              <w:left w:val="single" w:sz="8" w:space="0" w:color="000000"/>
-              <w:bottom w:val="single" w:sz="8" w:space="0" w:color="000000"/>
-              <w:right w:val="single" w:sz="8" w:space="0" w:color="000000"/>
-            </w:tcBorders>
-            <w:tcMar>
-              <w:top w:w="100" w:type="dxa"/>
-              <w:left w:w="100" w:type="dxa"/>
-              <w:bottom w:w="100" w:type="dxa"/>
-              <w:right w:w="100" w:type="dxa"/>
-            </w:tcMar>
-            <w:hideMark/>
-          </w:tcPr>
-          <w:p>
-            <w:pPr>
-              <w:rPr>
-                <w:lang w:val="en-US"/>
-              </w:rPr>
-            </w:pPr>
             <w:r>
               <w:rPr>
                 <w:lang w:val="en-US"/>
               </w:rPr>
               <w:t>{% if template_dict.file_ext.comments|length &gt; 0 %}X{% endif %}</w:t>
             </w:r>
+          </w:p>
+        </w:tc>
+        <w:tc>
+          <w:tcPr>
+            <w:tcW w:w="0" w:type="auto"/>
+            <w:tcBorders>
+              <w:top w:val="single" w:sz="8" w:space="0" w:color="000000"/>
+              <w:left w:val="single" w:sz="8" w:space="0" w:color="000000"/>
+              <w:bottom w:val="single" w:sz="8" w:space="0" w:color="000000"/>
+              <w:right w:val="single" w:sz="8" w:space="0" w:color="000000"/>
+            </w:tcBorders>
+            <w:tcMar>
+              <w:top w:w="100" w:type="dxa"/>
+              <w:left w:w="100" w:type="dxa"/>
+              <w:bottom w:w="100" w:type="dxa"/>
+              <w:right w:w="100" w:type="dxa"/>
+            </w:tcMar>
+            <w:hideMark/>
+          </w:tcPr>
+          <w:p>
+            <w:pPr>
+              <w:rPr>
+                <w:lang w:val="en-US"/>
+              </w:rPr>
+            </w:pPr>
           </w:p>
         </w:tc>
         <w:tc>
@@ -2974,13 +3007,7 @@
               <w:rPr>
                 <w:lang w:val="en-US"/>
               </w:rPr>
-              <w:t>{{ item.file_name }}</w:t>
-            </w:r>
-            <w:r>
-              <w:rPr>
-                <w:lang w:val="en-US"/>
-              </w:rPr>
-              <w:t>{% endfor %}</w:t>
+              <w:t>{{ item.file_name }}{% endfor %}</w:t>
             </w:r>
           </w:p>
           <w:p>
@@ -3579,34 +3606,59 @@
               <w:t>Python scripted.</w:t>
             </w:r>
           </w:p>
-        </w:tc>
-        <w:tc>
-          <w:tcPr>
-            <w:tcW w:w="0" w:type="auto"/>
-            <w:tcBorders>
-              <w:top w:val="single" w:sz="8" w:space="0" w:color="000000"/>
-              <w:left w:val="single" w:sz="8" w:space="0" w:color="000000"/>
-              <w:bottom w:val="single" w:sz="8" w:space="0" w:color="000000"/>
-              <w:right w:val="single" w:sz="8" w:space="0" w:color="000000"/>
-            </w:tcBorders>
-            <w:tcMar>
-              <w:top w:w="100" w:type="dxa"/>
-              <w:left w:w="100" w:type="dxa"/>
-              <w:bottom w:w="100" w:type="dxa"/>
-              <w:right w:w="100" w:type="dxa"/>
-            </w:tcMar>
-            <w:hideMark/>
-          </w:tcPr>
-          <w:p>
-            <w:pPr>
-              <w:rPr>
-                <w:lang w:val="en-US"/>
-              </w:rPr>
-            </w:pPr>
-            <w:r>
-              <w:rPr>
-                <w:lang w:val="en-US"/>
-              </w:rPr>
+          <w:p>
+            <w:pPr>
+              <w:numPr>
+                <w:ilvl w:val="0"/>
+                <w:numId w:val="8"/>
+              </w:numPr>
+              <w:rPr>
+                <w:lang w:val="en-US"/>
+              </w:rPr>
+            </w:pPr>
+            <w:r>
+              <w:rPr>
+                <w:lang w:val="en-US"/>
+              </w:rPr>
+              <w:t xml:space="preserve">Not all the files require a file extension (e.g. a README file can either be ‘README’ or </w:t>
+            </w:r>
+            <w:r>
+              <w:rPr>
+                <w:lang w:val="en-US"/>
+              </w:rPr>
+              <w:lastRenderedPageBreak/>
+              <w:t>‘README.md’). Curator needs to check on a case-by-case basis.</w:t>
+            </w:r>
+          </w:p>
+        </w:tc>
+        <w:tc>
+          <w:tcPr>
+            <w:tcW w:w="0" w:type="auto"/>
+            <w:tcBorders>
+              <w:top w:val="single" w:sz="8" w:space="0" w:color="000000"/>
+              <w:left w:val="single" w:sz="8" w:space="0" w:color="000000"/>
+              <w:bottom w:val="single" w:sz="8" w:space="0" w:color="000000"/>
+              <w:right w:val="single" w:sz="8" w:space="0" w:color="000000"/>
+            </w:tcBorders>
+            <w:tcMar>
+              <w:top w:w="100" w:type="dxa"/>
+              <w:left w:w="100" w:type="dxa"/>
+              <w:bottom w:w="100" w:type="dxa"/>
+              <w:right w:w="100" w:type="dxa"/>
+            </w:tcMar>
+            <w:hideMark/>
+          </w:tcPr>
+          <w:p>
+            <w:pPr>
+              <w:rPr>
+                <w:lang w:val="en-US"/>
+              </w:rPr>
+            </w:pPr>
+            <w:r>
+              <w:rPr>
+                <w:lang w:val="en-US"/>
+              </w:rPr>
+              <w:lastRenderedPageBreak/>
               <w:t xml:space="preserve">{% if template_dict.readme_file.comments|length </w:t>
             </w:r>
             <w:r>
@@ -3647,37 +3699,37 @@
                 <w:lang w:val="en-US"/>
               </w:rPr>
             </w:pPr>
-          </w:p>
-        </w:tc>
-        <w:tc>
-          <w:tcPr>
-            <w:tcW w:w="0" w:type="auto"/>
-            <w:tcBorders>
-              <w:top w:val="single" w:sz="8" w:space="0" w:color="000000"/>
-              <w:left w:val="single" w:sz="8" w:space="0" w:color="000000"/>
-              <w:bottom w:val="single" w:sz="8" w:space="0" w:color="000000"/>
-              <w:right w:val="single" w:sz="8" w:space="0" w:color="000000"/>
-            </w:tcBorders>
-            <w:tcMar>
-              <w:top w:w="100" w:type="dxa"/>
-              <w:left w:w="100" w:type="dxa"/>
-              <w:bottom w:w="100" w:type="dxa"/>
-              <w:right w:w="100" w:type="dxa"/>
-            </w:tcMar>
-            <w:hideMark/>
-          </w:tcPr>
-          <w:p>
-            <w:pPr>
-              <w:rPr>
-                <w:lang w:val="en-US"/>
-              </w:rPr>
-            </w:pPr>
             <w:r>
               <w:rPr>
                 <w:lang w:val="en-US"/>
               </w:rPr>
               <w:t>{% if template_dict.file_ext.comments|length &gt; 0 %}X{% endif %}</w:t>
             </w:r>
+          </w:p>
+        </w:tc>
+        <w:tc>
+          <w:tcPr>
+            <w:tcW w:w="0" w:type="auto"/>
+            <w:tcBorders>
+              <w:top w:val="single" w:sz="8" w:space="0" w:color="000000"/>
+              <w:left w:val="single" w:sz="8" w:space="0" w:color="000000"/>
+              <w:bottom w:val="single" w:sz="8" w:space="0" w:color="000000"/>
+              <w:right w:val="single" w:sz="8" w:space="0" w:color="000000"/>
+            </w:tcBorders>
+            <w:tcMar>
+              <w:top w:w="100" w:type="dxa"/>
+              <w:left w:w="100" w:type="dxa"/>
+              <w:bottom w:w="100" w:type="dxa"/>
+              <w:right w:w="100" w:type="dxa"/>
+            </w:tcMar>
+            <w:hideMark/>
+          </w:tcPr>
+          <w:p>
+            <w:pPr>
+              <w:rPr>
+                <w:lang w:val="en-US"/>
+              </w:rPr>
+            </w:pPr>
           </w:p>
         </w:tc>
         <w:tc>
@@ -3884,7 +3936,6 @@
                 <w:bCs/>
                 <w:lang w:val="en-US"/>
               </w:rPr>
-              <w:lastRenderedPageBreak/>
               <w:t>2.4</w:t>
             </w:r>
           </w:p>
@@ -4518,7 +4569,7 @@
               <w:rPr>
                 <w:lang w:val="en-US"/>
               </w:rPr>
-              <w:t>List the uncommon file format that has documentation file:</w:t>
+              <w:t>List the uncommon file format that has additional documentation:</w:t>
             </w:r>
           </w:p>
           <w:p>
@@ -4546,10 +4597,7 @@
               </w:rPr>
             </w:pPr>
             <w:r>
-              <w:rPr>
-                <w:lang w:val="en-US"/>
-              </w:rPr>
-              <w:t>List the uncommon file format that does not have a documentation file:</w:t>
+              <w:t>List the uncommon file format that does NOT have additional documentation:</w:t>
             </w:r>
           </w:p>
           <w:p>
@@ -4749,7 +4797,7 @@
                 <w:bCs/>
                 <w:lang w:val="en-US"/>
               </w:rPr>
-              <w:t>Yes</w:t>
+              <w:t>P</w:t>
             </w:r>
           </w:p>
         </w:tc>
@@ -4783,7 +4831,7 @@
                 <w:bCs/>
                 <w:lang w:val="en-US"/>
               </w:rPr>
-              <w:t>No</w:t>
+              <w:t>RQU</w:t>
             </w:r>
           </w:p>
         </w:tc>
@@ -4817,7 +4865,7 @@
                 <w:bCs/>
                 <w:lang w:val="en-US"/>
               </w:rPr>
-              <w:t>SI</w:t>
+              <w:t>RCM</w:t>
             </w:r>
           </w:p>
         </w:tc>
@@ -5373,6 +5421,7 @@
                 <w:bCs/>
                 <w:lang w:val="en-US"/>
               </w:rPr>
+              <w:lastRenderedPageBreak/>
               <w:t>4.0</w:t>
             </w:r>
           </w:p>
@@ -5467,7 +5516,7 @@
                 <w:bCs/>
                 <w:lang w:val="en-US"/>
               </w:rPr>
-              <w:t>Yes</w:t>
+              <w:t>P</w:t>
             </w:r>
           </w:p>
         </w:tc>
@@ -5501,7 +5550,7 @@
                 <w:bCs/>
                 <w:lang w:val="en-US"/>
               </w:rPr>
-              <w:t>No</w:t>
+              <w:t>RQU</w:t>
             </w:r>
           </w:p>
         </w:tc>
@@ -5535,7 +5584,7 @@
                 <w:bCs/>
                 <w:lang w:val="en-US"/>
               </w:rPr>
-              <w:t>SI</w:t>
+              <w:t>RCM</w:t>
             </w:r>
           </w:p>
         </w:tc>
@@ -5719,7 +5768,6 @@
                 <w:bCs/>
                 <w:lang w:val="en-US"/>
               </w:rPr>
-              <w:lastRenderedPageBreak/>
               <w:t>4.1</w:t>
             </w:r>
           </w:p>
@@ -5889,7 +5937,13 @@
               <w:rPr>
                 <w:lang w:val="en-US"/>
               </w:rPr>
-              <w:t>Notes</w:t>
+              <w:t>RQU</w:t>
+            </w:r>
+            <w:r>
+              <w:rPr>
+                <w:lang w:val="en-US"/>
+              </w:rPr>
+              <w:t>tes</w:t>
             </w:r>
           </w:p>
         </w:tc>
@@ -7072,7 +7126,7 @@
                 <w:bCs/>
                 <w:lang w:val="en-US"/>
               </w:rPr>
-              <w:t>No</w:t>
+              <w:t>RQU</w:t>
             </w:r>
           </w:p>
         </w:tc>
@@ -7106,7 +7160,7 @@
                 <w:bCs/>
                 <w:lang w:val="en-US"/>
               </w:rPr>
-              <w:t>SI</w:t>
+              <w:t>RCM</w:t>
             </w:r>
           </w:p>
         </w:tc>
@@ -7532,7 +7586,21 @@
               <w:rPr>
                 <w:lang w:val="en-US"/>
               </w:rPr>
-              <w:t>List fields/files below with the format ‘field/</w:t>
+              <w:t>List fields/files below with the format ‘</w:t>
+            </w:r>
+            <w:r>
+              <w:rPr>
+                <w:i/>
+                <w:iCs/>
+                <w:lang w:val="en-US"/>
+              </w:rPr>
+              <w:t>field</w:t>
+            </w:r>
+            <w:r>
+              <w:rPr>
+                <w:lang w:val="en-US"/>
+              </w:rPr>
+              <w:t>/</w:t>
             </w:r>
             <w:r>
               <w:rPr>
@@ -7684,16 +7752,7 @@
                 <w:bCs/>
                 <w:lang w:val="en-US"/>
               </w:rPr>
-              <w:t xml:space="preserve">*If something is flagged in the sensitive data review, does the depositor have REB approval to share </w:t>
-            </w:r>
-            <w:r>
-              <w:rPr>
-                <w:b/>
-                <w:bCs/>
-                <w:lang w:val="en-US"/>
-              </w:rPr>
-              <w:lastRenderedPageBreak/>
-              <w:t>the dataset?</w:t>
+              <w:t>*If something is flagged in the sensitive data review, does the depositor have REB approval to share the dataset?</w:t>
             </w:r>
           </w:p>
         </w:tc>
@@ -7728,15 +7787,14 @@
               <w:rPr>
                 <w:lang w:val="en-US"/>
               </w:rPr>
+              <w:t xml:space="preserve">If something is flagged in the sensitive data review (see question above), check the intake form to confirm information about </w:t>
+            </w:r>
+            <w:r>
+              <w:rPr>
+                <w:lang w:val="en-US"/>
+              </w:rPr>
               <w:lastRenderedPageBreak/>
-              <w:t xml:space="preserve">If something is flagged in the sensitive data review (see question above), check </w:t>
-            </w:r>
-            <w:r>
-              <w:rPr>
-                <w:lang w:val="en-US"/>
-              </w:rPr>
-              <w:lastRenderedPageBreak/>
-              <w:t>the intake form to confirm information about their REB status.</w:t>
+              <w:t>their REB status.</w:t>
             </w:r>
           </w:p>
         </w:tc>
@@ -8316,7 +8374,7 @@
               <w:tblLook w:val="04A0" w:firstRow="1" w:lastRow="0" w:firstColumn="1" w:lastColumn="0" w:noHBand="0" w:noVBand="1"/>
             </w:tblPr>
             <w:tblGrid>
-              <w:gridCol w:w="3891"/>
+              <w:gridCol w:w="3860"/>
             </w:tblGrid>
             <w:tr>
               <w:tc>
@@ -8485,47 +8543,37 @@
                 <w:bCs/>
                 <w:lang w:val="en-US"/>
               </w:rPr>
-              <w:t xml:space="preserve">*If there are restricted files in the dataset, is the Terms of Access </w:t>
-            </w:r>
-            <w:r>
-              <w:rPr>
-                <w:b/>
-                <w:bCs/>
-                <w:lang w:val="en-US"/>
-              </w:rPr>
-              <w:lastRenderedPageBreak/>
-              <w:t>field complete?</w:t>
-            </w:r>
-          </w:p>
-        </w:tc>
-        <w:tc>
-          <w:tcPr>
-            <w:tcW w:w="0" w:type="auto"/>
-            <w:tcBorders>
-              <w:top w:val="single" w:sz="8" w:space="0" w:color="000000"/>
-              <w:left w:val="single" w:sz="8" w:space="0" w:color="000000"/>
-              <w:bottom w:val="single" w:sz="8" w:space="0" w:color="000000"/>
-              <w:right w:val="single" w:sz="8" w:space="0" w:color="000000"/>
-            </w:tcBorders>
-            <w:tcMar>
-              <w:top w:w="100" w:type="dxa"/>
-              <w:left w:w="100" w:type="dxa"/>
-              <w:bottom w:w="100" w:type="dxa"/>
-              <w:right w:w="100" w:type="dxa"/>
-            </w:tcMar>
-            <w:hideMark/>
-          </w:tcPr>
-          <w:p>
-            <w:pPr>
-              <w:rPr>
-                <w:lang w:val="en-US"/>
-              </w:rPr>
-            </w:pPr>
-            <w:r>
-              <w:rPr>
-                <w:lang w:val="en-US"/>
-              </w:rPr>
-              <w:lastRenderedPageBreak/>
+              <w:t>*If there are restricted files in the dataset, is the Terms of Access field complete?</w:t>
+            </w:r>
+          </w:p>
+        </w:tc>
+        <w:tc>
+          <w:tcPr>
+            <w:tcW w:w="0" w:type="auto"/>
+            <w:tcBorders>
+              <w:top w:val="single" w:sz="8" w:space="0" w:color="000000"/>
+              <w:left w:val="single" w:sz="8" w:space="0" w:color="000000"/>
+              <w:bottom w:val="single" w:sz="8" w:space="0" w:color="000000"/>
+              <w:right w:val="single" w:sz="8" w:space="0" w:color="000000"/>
+            </w:tcBorders>
+            <w:tcMar>
+              <w:top w:w="100" w:type="dxa"/>
+              <w:left w:w="100" w:type="dxa"/>
+              <w:bottom w:w="100" w:type="dxa"/>
+              <w:right w:w="100" w:type="dxa"/>
+            </w:tcMar>
+            <w:hideMark/>
+          </w:tcPr>
+          <w:p>
+            <w:pPr>
+              <w:rPr>
+                <w:lang w:val="en-US"/>
+              </w:rPr>
+            </w:pPr>
+            <w:r>
+              <w:rPr>
+                <w:lang w:val="en-US"/>
+              </w:rPr>
               <w:t>Python scripted.</w:t>
             </w:r>
           </w:p>
@@ -8543,14 +8591,7 @@
               <w:rPr>
                 <w:lang w:val="en-US"/>
               </w:rPr>
-              <w:t xml:space="preserve">If there are restricted files </w:t>
-            </w:r>
-            <w:r>
-              <w:rPr>
-                <w:lang w:val="en-US"/>
-              </w:rPr>
-              <w:lastRenderedPageBreak/>
-              <w:t>and no Terms of Access, recommend including terms of access.</w:t>
+              <w:t>If there are restricted files and no Terms of Access, recommend including terms of access.</w:t>
             </w:r>
           </w:p>
         </w:tc>
@@ -8582,7 +8623,6 @@
                 <w:rFonts w:hint="eastAsia"/>
                 <w:lang w:val="en-US"/>
               </w:rPr>
-              <w:lastRenderedPageBreak/>
               <w:t xml:space="preserve">{% if </w:t>
             </w:r>
             <w:r>
@@ -8671,6 +8711,32 @@
           <w:p>
             <w:pPr>
               <w:rPr>
+                <w:rFonts w:hint="eastAsia"/>
+                <w:lang w:val="en-US"/>
+              </w:rPr>
+            </w:pPr>
+          </w:p>
+        </w:tc>
+        <w:tc>
+          <w:tcPr>
+            <w:tcW w:w="0" w:type="auto"/>
+            <w:tcBorders>
+              <w:top w:val="single" w:sz="8" w:space="0" w:color="000000"/>
+              <w:left w:val="single" w:sz="8" w:space="0" w:color="000000"/>
+              <w:bottom w:val="single" w:sz="8" w:space="0" w:color="000000"/>
+              <w:right w:val="single" w:sz="8" w:space="0" w:color="000000"/>
+            </w:tcBorders>
+            <w:tcMar>
+              <w:top w:w="100" w:type="dxa"/>
+              <w:left w:w="100" w:type="dxa"/>
+              <w:bottom w:w="100" w:type="dxa"/>
+              <w:right w:w="100" w:type="dxa"/>
+            </w:tcMar>
+            <w:hideMark/>
+          </w:tcPr>
+          <w:p>
+            <w:pPr>
+              <w:rPr>
                 <w:lang w:val="en-US"/>
               </w:rPr>
             </w:pPr>
@@ -8745,31 +8811,6 @@
             <w:r>
               <w:t>X{% endif %}</w:t>
             </w:r>
-          </w:p>
-        </w:tc>
-        <w:tc>
-          <w:tcPr>
-            <w:tcW w:w="0" w:type="auto"/>
-            <w:tcBorders>
-              <w:top w:val="single" w:sz="8" w:space="0" w:color="000000"/>
-              <w:left w:val="single" w:sz="8" w:space="0" w:color="000000"/>
-              <w:bottom w:val="single" w:sz="8" w:space="0" w:color="000000"/>
-              <w:right w:val="single" w:sz="8" w:space="0" w:color="000000"/>
-            </w:tcBorders>
-            <w:tcMar>
-              <w:top w:w="100" w:type="dxa"/>
-              <w:left w:w="100" w:type="dxa"/>
-              <w:bottom w:w="100" w:type="dxa"/>
-              <w:right w:w="100" w:type="dxa"/>
-            </w:tcMar>
-            <w:hideMark/>
-          </w:tcPr>
-          <w:p>
-            <w:pPr>
-              <w:rPr>
-                <w:lang w:val="en-US"/>
-              </w:rPr>
-            </w:pPr>
           </w:p>
         </w:tc>
         <w:tc>
@@ -8919,7 +8960,7 @@
               <w:tblLook w:val="04A0" w:firstRow="1" w:lastRow="0" w:firstColumn="1" w:lastColumn="0" w:noHBand="0" w:noVBand="1"/>
             </w:tblPr>
             <w:tblGrid>
-              <w:gridCol w:w="3891"/>
+              <w:gridCol w:w="3860"/>
             </w:tblGrid>
             <w:tr>
               <w:tc>
@@ -9038,6 +9079,56 @@
 </w:document>
 </file>
 
+<file path=word/endnotes.xml><?xml version="1.0" encoding="utf-8"?>
+<w:endnotes xmlns:wpc="http://schemas.microsoft.com/office/word/2010/wordprocessingCanvas" xmlns:cx="http://schemas.microsoft.com/office/drawing/2014/chartex" xmlns:cx1="http://schemas.microsoft.com/office/drawing/2015/9/8/chartex" xmlns:cx2="http://schemas.microsoft.com/office/drawing/2015/10/21/chartex" xmlns:cx3="http://schemas.microsoft.com/office/drawing/2016/5/9/chartex" xmlns:cx4="http://schemas.microsoft.com/office/drawing/2016/5/10/chartex" xmlns:cx5="http://schemas.microsoft.com/office/drawing/2016/5/11/chartex" xmlns:cx6="http://schemas.microsoft.com/office/drawing/2016/5/12/chartex" xmlns:cx7="http://schemas.microsoft.com/office/drawing/2016/5/13/chartex" xmlns:cx8="http://schemas.microsoft.com/office/drawing/2016/5/14/chartex" xmlns:mc="http://schemas.openxmlformats.org/markup-compatibility/2006" xmlns:aink="http://schemas.microsoft.com/office/drawing/2016/ink" xmlns:am3d="http://schemas.microsoft.com/office/drawing/2017/model3d" xmlns:o="urn:schemas-microsoft-com:office:office" xmlns:oel="http://schemas.microsoft.com/office/2019/extlst" xmlns:r="http://schemas.openxmlformats.org/officeDocument/2006/relationships" xmlns:m="http://schemas.openxmlformats.org/officeDocument/2006/math" xmlns:v="urn:schemas-microsoft-com:vml" xmlns:wp14="http://schemas.microsoft.com/office/word/2010/wordprocessingDrawing" xmlns:wp="http://schemas.openxmlformats.org/drawingml/2006/wordprocessingDrawing" xmlns:w10="urn:schemas-microsoft-com:office:word" xmlns:w="http://schemas.openxmlformats.org/wordprocessingml/2006/main" xmlns:w14="http://schemas.microsoft.com/office/word/2010/wordml" xmlns:w15="http://schemas.microsoft.com/office/word/2012/wordml" xmlns:w16cex="http://schemas.microsoft.com/office/word/2018/wordml/cex" xmlns:w16cid="http://schemas.microsoft.com/office/word/2016/wordml/cid" xmlns:w16="http://schemas.microsoft.com/office/word/2018/wordml" xmlns:w16du="http://schemas.microsoft.com/office/word/2023/wordml/word16du" xmlns:w16sdtdh="http://schemas.microsoft.com/office/word/2020/wordml/sdtdatahash" xmlns:w16sdtfl="http://schemas.microsoft.com/office/word/2024/wordml/sdtformatlock" xmlns:w16se="http://schemas.microsoft.com/office/word/2015/wordml/symex" xmlns:wpg="http://schemas.microsoft.com/office/word/2010/wordprocessingGroup" xmlns:wpi="http://schemas.microsoft.com/office/word/2010/wordprocessingInk" xmlns:wne="http://schemas.microsoft.com/office/word/2006/wordml" xmlns:wps="http://schemas.microsoft.com/office/word/2010/wordprocessingShape" mc:Ignorable="w14 w15 w16se w16cid w16 w16cex w16sdtdh w16sdtfl w16du wp14">
+  <w:endnote w:type="separator" w:id="-1">
+    <w:p>
+      <w:pPr>
+        <w:spacing w:after="0" w:line="240" w:lineRule="auto"/>
+      </w:pPr>
+      <w:r>
+        <w:separator/>
+      </w:r>
+    </w:p>
+  </w:endnote>
+  <w:endnote w:type="continuationSeparator" w:id="0">
+    <w:p>
+      <w:pPr>
+        <w:spacing w:after="0" w:line="240" w:lineRule="auto"/>
+      </w:pPr>
+      <w:r>
+        <w:continuationSeparator/>
+      </w:r>
+    </w:p>
+  </w:endnote>
+</w:endnotes>
+</file>
+
+<file path=word/footnotes.xml><?xml version="1.0" encoding="utf-8"?>
+<w:footnotes xmlns:wpc="http://schemas.microsoft.com/office/word/2010/wordprocessingCanvas" xmlns:cx="http://schemas.microsoft.com/office/drawing/2014/chartex" xmlns:cx1="http://schemas.microsoft.com/office/drawing/2015/9/8/chartex" xmlns:cx2="http://schemas.microsoft.com/office/drawing/2015/10/21/chartex" xmlns:cx3="http://schemas.microsoft.com/office/drawing/2016/5/9/chartex" xmlns:cx4="http://schemas.microsoft.com/office/drawing/2016/5/10/chartex" xmlns:cx5="http://schemas.microsoft.com/office/drawing/2016/5/11/chartex" xmlns:cx6="http://schemas.microsoft.com/office/drawing/2016/5/12/chartex" xmlns:cx7="http://schemas.microsoft.com/office/drawing/2016/5/13/chartex" xmlns:cx8="http://schemas.microsoft.com/office/drawing/2016/5/14/chartex" xmlns:mc="http://schemas.openxmlformats.org/markup-compatibility/2006" xmlns:aink="http://schemas.microsoft.com/office/drawing/2016/ink" xmlns:am3d="http://schemas.microsoft.com/office/drawing/2017/model3d" xmlns:o="urn:schemas-microsoft-com:office:office" xmlns:oel="http://schemas.microsoft.com/office/2019/extlst" xmlns:r="http://schemas.openxmlformats.org/officeDocument/2006/relationships" xmlns:m="http://schemas.openxmlformats.org/officeDocument/2006/math" xmlns:v="urn:schemas-microsoft-com:vml" xmlns:wp14="http://schemas.microsoft.com/office/word/2010/wordprocessingDrawing" xmlns:wp="http://schemas.openxmlformats.org/drawingml/2006/wordprocessingDrawing" xmlns:w10="urn:schemas-microsoft-com:office:word" xmlns:w="http://schemas.openxmlformats.org/wordprocessingml/2006/main" xmlns:w14="http://schemas.microsoft.com/office/word/2010/wordml" xmlns:w15="http://schemas.microsoft.com/office/word/2012/wordml" xmlns:w16cex="http://schemas.microsoft.com/office/word/2018/wordml/cex" xmlns:w16cid="http://schemas.microsoft.com/office/word/2016/wordml/cid" xmlns:w16="http://schemas.microsoft.com/office/word/2018/wordml" xmlns:w16du="http://schemas.microsoft.com/office/word/2023/wordml/word16du" xmlns:w16sdtdh="http://schemas.microsoft.com/office/word/2020/wordml/sdtdatahash" xmlns:w16sdtfl="http://schemas.microsoft.com/office/word/2024/wordml/sdtformatlock" xmlns:w16se="http://schemas.microsoft.com/office/word/2015/wordml/symex" xmlns:wpg="http://schemas.microsoft.com/office/word/2010/wordprocessingGroup" xmlns:wpi="http://schemas.microsoft.com/office/word/2010/wordprocessingInk" xmlns:wne="http://schemas.microsoft.com/office/word/2006/wordml" xmlns:wps="http://schemas.microsoft.com/office/word/2010/wordprocessingShape" mc:Ignorable="w14 w15 w16se w16cid w16 w16cex w16sdtdh w16sdtfl w16du wp14">
+  <w:footnote w:type="separator" w:id="-1">
+    <w:p>
+      <w:pPr>
+        <w:spacing w:after="0" w:line="240" w:lineRule="auto"/>
+      </w:pPr>
+      <w:r>
+        <w:separator/>
+      </w:r>
+    </w:p>
+  </w:footnote>
+  <w:footnote w:type="continuationSeparator" w:id="0">
+    <w:p>
+      <w:pPr>
+        <w:spacing w:after="0" w:line="240" w:lineRule="auto"/>
+      </w:pPr>
+      <w:r>
+        <w:continuationSeparator/>
+      </w:r>
+    </w:p>
+  </w:footnote>
+</w:footnotes>
+</file>
+
 <file path=word/numbering.xml><?xml version="1.0" encoding="utf-8"?>
 <w:numbering xmlns:wpc="http://schemas.microsoft.com/office/word/2010/wordprocessingCanvas" xmlns:cx="http://schemas.microsoft.com/office/drawing/2014/chartex" xmlns:cx1="http://schemas.microsoft.com/office/drawing/2015/9/8/chartex" xmlns:cx2="http://schemas.microsoft.com/office/drawing/2015/10/21/chartex" xmlns:cx3="http://schemas.microsoft.com/office/drawing/2016/5/9/chartex" xmlns:cx4="http://schemas.microsoft.com/office/drawing/2016/5/10/chartex" xmlns:cx5="http://schemas.microsoft.com/office/drawing/2016/5/11/chartex" xmlns:cx6="http://schemas.microsoft.com/office/drawing/2016/5/12/chartex" xmlns:cx7="http://schemas.microsoft.com/office/drawing/2016/5/13/chartex" xmlns:cx8="http://schemas.microsoft.com/office/drawing/2016/5/14/chartex" xmlns:mc="http://schemas.openxmlformats.org/markup-compatibility/2006" xmlns:aink="http://schemas.microsoft.com/office/drawing/2016/ink" xmlns:am3d="http://schemas.microsoft.com/office/drawing/2017/model3d" xmlns:o="urn:schemas-microsoft-com:office:office" xmlns:oel="http://schemas.microsoft.com/office/2019/extlst" xmlns:r="http://schemas.openxmlformats.org/officeDocument/2006/relationships" xmlns:m="http://schemas.openxmlformats.org/officeDocument/2006/math" xmlns:v="urn:schemas-microsoft-com:vml" xmlns:wp14="http://schemas.microsoft.com/office/word/2010/wordprocessingDrawing" xmlns:wp="http://schemas.openxmlformats.org/drawingml/2006/wordprocessingDrawing" xmlns:w10="urn:schemas-microsoft-com:office:word" xmlns:w="http://schemas.openxmlformats.org/wordprocessingml/2006/main" xmlns:w14="http://schemas.microsoft.com/office/word/2010/wordml" xmlns:w15="http://schemas.microsoft.com/office/word/2012/wordml" xmlns:w16cex="http://schemas.microsoft.com/office/word/2018/wordml/cex" xmlns:w16cid="http://schemas.microsoft.com/office/word/2016/wordml/cid" xmlns:w16="http://schemas.microsoft.com/office/word/2018/wordml" xmlns:w16du="http://schemas.microsoft.com/office/word/2023/wordml/word16du" xmlns:w16sdtdh="http://schemas.microsoft.com/office/word/2020/wordml/sdtdatahash" xmlns:w16sdtfl="http://schemas.microsoft.com/office/word/2024/wordml/sdtformatlock" xmlns:w16se="http://schemas.microsoft.com/office/word/2015/wordml/symex" xmlns:wpg="http://schemas.microsoft.com/office/word/2010/wordprocessingGroup" xmlns:wpi="http://schemas.microsoft.com/office/word/2010/wordprocessingInk" xmlns:wne="http://schemas.microsoft.com/office/word/2006/wordml" xmlns:wps="http://schemas.microsoft.com/office/word/2010/wordprocessingShape" mc:Ignorable="w14 w15 w16se w16cid w16 w16cex w16sdtdh w16sdtfl w16du wp14">
   <w:abstractNum w:abstractNumId="0" w15:restartNumberingAfterBreak="0">
@@ -11366,6 +11457,119 @@
     </w:lvl>
   </w:abstractNum>
   <w:abstractNum w:abstractNumId="20" w15:restartNumberingAfterBreak="0">
+    <w:nsid w:val="518805ED"/>
+    <w:multiLevelType w:val="hybridMultilevel"/>
+    <w:tmpl w:val="F1E46B5C"/>
+    <w:lvl w:ilvl="0" w:tplc="04090001">
+      <w:start w:val="1"/>
+      <w:numFmt w:val="bullet"/>
+      <w:lvlText w:val=""/>
+      <w:lvlJc w:val="left"/>
+      <w:pPr>
+        <w:ind w:left="720" w:hanging="360"/>
+      </w:pPr>
+      <w:rPr>
+        <w:rFonts w:ascii="Symbol" w:hAnsi="Symbol" w:hint="default"/>
+      </w:rPr>
+    </w:lvl>
+    <w:lvl w:ilvl="1" w:tplc="04090003" w:tentative="1">
+      <w:start w:val="1"/>
+      <w:numFmt w:val="bullet"/>
+      <w:lvlText w:val="o"/>
+      <w:lvlJc w:val="left"/>
+      <w:pPr>
+        <w:ind w:left="1440" w:hanging="360"/>
+      </w:pPr>
+      <w:rPr>
+        <w:rFonts w:ascii="Courier New" w:hAnsi="Courier New" w:cs="Courier New" w:hint="default"/>
+      </w:rPr>
+    </w:lvl>
+    <w:lvl w:ilvl="2" w:tplc="04090005" w:tentative="1">
+      <w:start w:val="1"/>
+      <w:numFmt w:val="bullet"/>
+      <w:lvlText w:val=""/>
+      <w:lvlJc w:val="left"/>
+      <w:pPr>
+        <w:ind w:left="2160" w:hanging="360"/>
+      </w:pPr>
+      <w:rPr>
+        <w:rFonts w:ascii="Wingdings" w:hAnsi="Wingdings" w:hint="default"/>
+      </w:rPr>
+    </w:lvl>
+    <w:lvl w:ilvl="3" w:tplc="04090001" w:tentative="1">
+      <w:start w:val="1"/>
+      <w:numFmt w:val="bullet"/>
+      <w:lvlText w:val=""/>
+      <w:lvlJc w:val="left"/>
+      <w:pPr>
+        <w:ind w:left="2880" w:hanging="360"/>
+      </w:pPr>
+      <w:rPr>
+        <w:rFonts w:ascii="Symbol" w:hAnsi="Symbol" w:hint="default"/>
+      </w:rPr>
+    </w:lvl>
+    <w:lvl w:ilvl="4" w:tplc="04090003" w:tentative="1">
+      <w:start w:val="1"/>
+      <w:numFmt w:val="bullet"/>
+      <w:lvlText w:val="o"/>
+      <w:lvlJc w:val="left"/>
+      <w:pPr>
+        <w:ind w:left="3600" w:hanging="360"/>
+      </w:pPr>
+      <w:rPr>
+        <w:rFonts w:ascii="Courier New" w:hAnsi="Courier New" w:cs="Courier New" w:hint="default"/>
+      </w:rPr>
+    </w:lvl>
+    <w:lvl w:ilvl="5" w:tplc="04090005" w:tentative="1">
+      <w:start w:val="1"/>
+      <w:numFmt w:val="bullet"/>
+      <w:lvlText w:val=""/>
+      <w:lvlJc w:val="left"/>
+      <w:pPr>
+        <w:ind w:left="4320" w:hanging="360"/>
+      </w:pPr>
+      <w:rPr>
+        <w:rFonts w:ascii="Wingdings" w:hAnsi="Wingdings" w:hint="default"/>
+      </w:rPr>
+    </w:lvl>
+    <w:lvl w:ilvl="6" w:tplc="04090001" w:tentative="1">
+      <w:start w:val="1"/>
+      <w:numFmt w:val="bullet"/>
+      <w:lvlText w:val=""/>
+      <w:lvlJc w:val="left"/>
+      <w:pPr>
+        <w:ind w:left="5040" w:hanging="360"/>
+      </w:pPr>
+      <w:rPr>
+        <w:rFonts w:ascii="Symbol" w:hAnsi="Symbol" w:hint="default"/>
+      </w:rPr>
+    </w:lvl>
+    <w:lvl w:ilvl="7" w:tplc="04090003" w:tentative="1">
+      <w:start w:val="1"/>
+      <w:numFmt w:val="bullet"/>
+      <w:lvlText w:val="o"/>
+      <w:lvlJc w:val="left"/>
+      <w:pPr>
+        <w:ind w:left="5760" w:hanging="360"/>
+      </w:pPr>
+      <w:rPr>
+        <w:rFonts w:ascii="Courier New" w:hAnsi="Courier New" w:cs="Courier New" w:hint="default"/>
+      </w:rPr>
+    </w:lvl>
+    <w:lvl w:ilvl="8" w:tplc="04090005" w:tentative="1">
+      <w:start w:val="1"/>
+      <w:numFmt w:val="bullet"/>
+      <w:lvlText w:val=""/>
+      <w:lvlJc w:val="left"/>
+      <w:pPr>
+        <w:ind w:left="6480" w:hanging="360"/>
+      </w:pPr>
+      <w:rPr>
+        <w:rFonts w:ascii="Wingdings" w:hAnsi="Wingdings" w:hint="default"/>
+      </w:rPr>
+    </w:lvl>
+  </w:abstractNum>
+  <w:abstractNum w:abstractNumId="21" w15:restartNumberingAfterBreak="0">
     <w:nsid w:val="561074E4"/>
     <w:multiLevelType w:val="hybridMultilevel"/>
     <w:tmpl w:val="4C4C890E"/>
@@ -11454,7 +11658,7 @@
       </w:pPr>
     </w:lvl>
   </w:abstractNum>
-  <w:abstractNum w:abstractNumId="21" w15:restartNumberingAfterBreak="0">
+  <w:abstractNum w:abstractNumId="22" w15:restartNumberingAfterBreak="0">
     <w:nsid w:val="572A226F"/>
     <w:multiLevelType w:val="multilevel"/>
     <w:tmpl w:val="81FC1D9E"/>
@@ -11567,7 +11771,7 @@
       </w:pPr>
     </w:lvl>
   </w:abstractNum>
-  <w:abstractNum w:abstractNumId="22" w15:restartNumberingAfterBreak="0">
+  <w:abstractNum w:abstractNumId="23" w15:restartNumberingAfterBreak="0">
     <w:nsid w:val="5BF5117B"/>
     <w:multiLevelType w:val="multilevel"/>
     <w:tmpl w:val="8A1481F6"/>
@@ -11680,7 +11884,7 @@
       </w:pPr>
     </w:lvl>
   </w:abstractNum>
-  <w:abstractNum w:abstractNumId="23" w15:restartNumberingAfterBreak="0">
+  <w:abstractNum w:abstractNumId="24" w15:restartNumberingAfterBreak="0">
     <w:nsid w:val="5D3E6FA0"/>
     <w:multiLevelType w:val="multilevel"/>
     <w:tmpl w:val="1DD496E8"/>
@@ -11793,7 +11997,7 @@
       </w:pPr>
     </w:lvl>
   </w:abstractNum>
-  <w:abstractNum w:abstractNumId="24" w15:restartNumberingAfterBreak="0">
+  <w:abstractNum w:abstractNumId="25" w15:restartNumberingAfterBreak="0">
     <w:nsid w:val="5F935511"/>
     <w:multiLevelType w:val="multilevel"/>
     <w:tmpl w:val="44AE5600"/>
@@ -11906,7 +12110,7 @@
       </w:pPr>
     </w:lvl>
   </w:abstractNum>
-  <w:abstractNum w:abstractNumId="25" w15:restartNumberingAfterBreak="0">
+  <w:abstractNum w:abstractNumId="26" w15:restartNumberingAfterBreak="0">
     <w:nsid w:val="62330FFA"/>
     <w:multiLevelType w:val="multilevel"/>
     <w:tmpl w:val="1354050A"/>
@@ -12019,7 +12223,7 @@
       </w:pPr>
     </w:lvl>
   </w:abstractNum>
-  <w:abstractNum w:abstractNumId="26" w15:restartNumberingAfterBreak="0">
+  <w:abstractNum w:abstractNumId="27" w15:restartNumberingAfterBreak="0">
     <w:nsid w:val="653571BB"/>
     <w:multiLevelType w:val="multilevel"/>
     <w:tmpl w:val="E0F0DCF4"/>
@@ -12132,7 +12336,7 @@
       </w:pPr>
     </w:lvl>
   </w:abstractNum>
-  <w:abstractNum w:abstractNumId="27" w15:restartNumberingAfterBreak="0">
+  <w:abstractNum w:abstractNumId="28" w15:restartNumberingAfterBreak="0">
     <w:nsid w:val="69731E7F"/>
     <w:multiLevelType w:val="multilevel"/>
     <w:tmpl w:val="4FEA352E"/>
@@ -12281,7 +12485,7 @@
       </w:rPr>
     </w:lvl>
   </w:abstractNum>
-  <w:abstractNum w:abstractNumId="28" w15:restartNumberingAfterBreak="0">
+  <w:abstractNum w:abstractNumId="29" w15:restartNumberingAfterBreak="0">
     <w:nsid w:val="6DE2596E"/>
     <w:multiLevelType w:val="hybridMultilevel"/>
     <w:tmpl w:val="0D9C62AE"/>
@@ -12370,7 +12574,7 @@
       </w:pPr>
     </w:lvl>
   </w:abstractNum>
-  <w:abstractNum w:abstractNumId="29" w15:restartNumberingAfterBreak="0">
+  <w:abstractNum w:abstractNumId="30" w15:restartNumberingAfterBreak="0">
     <w:nsid w:val="75520C24"/>
     <w:multiLevelType w:val="hybridMultilevel"/>
     <w:tmpl w:val="FCCE1BF6"/>
@@ -12459,7 +12663,7 @@
       </w:pPr>
     </w:lvl>
   </w:abstractNum>
-  <w:abstractNum w:abstractNumId="30" w15:restartNumberingAfterBreak="0">
+  <w:abstractNum w:abstractNumId="31" w15:restartNumberingAfterBreak="0">
     <w:nsid w:val="76FC0259"/>
     <w:multiLevelType w:val="multilevel"/>
     <w:tmpl w:val="79680AA4"/>
@@ -12572,7 +12776,7 @@
       </w:pPr>
     </w:lvl>
   </w:abstractNum>
-  <w:abstractNum w:abstractNumId="31" w15:restartNumberingAfterBreak="0">
+  <w:abstractNum w:abstractNumId="32" w15:restartNumberingAfterBreak="0">
     <w:nsid w:val="77A70C23"/>
     <w:multiLevelType w:val="multilevel"/>
     <w:tmpl w:val="8E221C46"/>
@@ -12692,19 +12896,19 @@
     <w:abstractNumId w:val="8"/>
   </w:num>
   <w:num w:numId="3" w16cid:durableId="1561554637">
-    <w:abstractNumId w:val="21"/>
+    <w:abstractNumId w:val="22"/>
   </w:num>
   <w:num w:numId="4" w16cid:durableId="1987002333">
-    <w:abstractNumId w:val="31"/>
+    <w:abstractNumId w:val="32"/>
   </w:num>
   <w:num w:numId="5" w16cid:durableId="1029794338">
     <w:abstractNumId w:val="15"/>
   </w:num>
   <w:num w:numId="6" w16cid:durableId="1650086756">
-    <w:abstractNumId w:val="23"/>
+    <w:abstractNumId w:val="24"/>
   </w:num>
   <w:num w:numId="7" w16cid:durableId="1476222975">
-    <w:abstractNumId w:val="30"/>
+    <w:abstractNumId w:val="31"/>
   </w:num>
   <w:num w:numId="8" w16cid:durableId="1533764241">
     <w:abstractNumId w:val="3"/>
@@ -12716,16 +12920,16 @@
     <w:abstractNumId w:val="4"/>
   </w:num>
   <w:num w:numId="11" w16cid:durableId="793057457">
-    <w:abstractNumId w:val="22"/>
+    <w:abstractNumId w:val="23"/>
   </w:num>
   <w:num w:numId="12" w16cid:durableId="2146773725">
-    <w:abstractNumId w:val="26"/>
+    <w:abstractNumId w:val="27"/>
   </w:num>
   <w:num w:numId="13" w16cid:durableId="1026561013">
     <w:abstractNumId w:val="11"/>
   </w:num>
   <w:num w:numId="14" w16cid:durableId="1192110950">
-    <w:abstractNumId w:val="24"/>
+    <w:abstractNumId w:val="25"/>
   </w:num>
   <w:num w:numId="15" w16cid:durableId="1262841238">
     <w:abstractNumId w:val="10"/>
@@ -12737,19 +12941,19 @@
     <w:abstractNumId w:val="16"/>
   </w:num>
   <w:num w:numId="18" w16cid:durableId="1409767320">
-    <w:abstractNumId w:val="27"/>
+    <w:abstractNumId w:val="28"/>
   </w:num>
   <w:num w:numId="19" w16cid:durableId="2045591211">
     <w:abstractNumId w:val="12"/>
   </w:num>
   <w:num w:numId="20" w16cid:durableId="1764063768">
-    <w:abstractNumId w:val="25"/>
+    <w:abstractNumId w:val="26"/>
   </w:num>
   <w:num w:numId="21" w16cid:durableId="218832961">
     <w:abstractNumId w:val="14"/>
   </w:num>
   <w:num w:numId="22" w16cid:durableId="2045669289">
-    <w:abstractNumId w:val="29"/>
+    <w:abstractNumId w:val="30"/>
   </w:num>
   <w:num w:numId="23" w16cid:durableId="953443745">
     <w:abstractNumId w:val="7"/>
@@ -12761,13 +12965,13 @@
     <w:abstractNumId w:val="2"/>
   </w:num>
   <w:num w:numId="26" w16cid:durableId="1365129283">
-    <w:abstractNumId w:val="28"/>
+    <w:abstractNumId w:val="29"/>
   </w:num>
   <w:num w:numId="27" w16cid:durableId="1202403600">
     <w:abstractNumId w:val="13"/>
   </w:num>
   <w:num w:numId="28" w16cid:durableId="282420373">
-    <w:abstractNumId w:val="20"/>
+    <w:abstractNumId w:val="21"/>
   </w:num>
   <w:num w:numId="29" w16cid:durableId="101195959">
     <w:abstractNumId w:val="17"/>
@@ -12780,6 +12984,9 @@
   </w:num>
   <w:num w:numId="32" w16cid:durableId="197356490">
     <w:abstractNumId w:val="1"/>
+  </w:num>
+  <w:num w:numId="33" w16cid:durableId="1872569341">
+    <w:abstractNumId w:val="20"/>
   </w:num>
 </w:numbering>
 </file>
@@ -13391,7 +13598,6 @@
   <w:style w:type="character" w:default="1" w:styleId="DefaultParagraphFont">
     <w:name w:val="Default Paragraph Font"/>
     <w:uiPriority w:val="1"/>
-    <w:semiHidden/>
     <w:unhideWhenUsed/>
   </w:style>
   <w:style w:type="table" w:default="1" w:styleId="TableNormal">
@@ -13737,6 +13943,56 @@
       </w:tblBorders>
     </w:tblPr>
   </w:style>
+  <w:style w:type="paragraph" w:styleId="Header">
+    <w:name w:val="header"/>
+    <w:basedOn w:val="Normal"/>
+    <w:link w:val="HeaderChar"/>
+    <w:uiPriority w:val="99"/>
+    <w:unhideWhenUsed/>
+    <w:rsid w:val="00997DD5"/>
+    <w:pPr>
+      <w:tabs>
+        <w:tab w:val="center" w:pos="4680"/>
+        <w:tab w:val="right" w:pos="9360"/>
+      </w:tabs>
+      <w:spacing w:after="0" w:line="240" w:lineRule="auto"/>
+    </w:pPr>
+  </w:style>
+  <w:style w:type="character" w:customStyle="1" w:styleId="HeaderChar">
+    <w:name w:val="Header Char"/>
+    <w:basedOn w:val="DefaultParagraphFont"/>
+    <w:link w:val="Header"/>
+    <w:uiPriority w:val="99"/>
+    <w:rsid w:val="00997DD5"/>
+    <w:rPr>
+      <w:lang w:val="en-CA"/>
+    </w:rPr>
+  </w:style>
+  <w:style w:type="paragraph" w:styleId="Footer">
+    <w:name w:val="footer"/>
+    <w:basedOn w:val="Normal"/>
+    <w:link w:val="FooterChar"/>
+    <w:uiPriority w:val="99"/>
+    <w:unhideWhenUsed/>
+    <w:rsid w:val="00997DD5"/>
+    <w:pPr>
+      <w:tabs>
+        <w:tab w:val="center" w:pos="4680"/>
+        <w:tab w:val="right" w:pos="9360"/>
+      </w:tabs>
+      <w:spacing w:after="0" w:line="240" w:lineRule="auto"/>
+    </w:pPr>
+  </w:style>
+  <w:style w:type="character" w:customStyle="1" w:styleId="FooterChar">
+    <w:name w:val="Footer Char"/>
+    <w:basedOn w:val="DefaultParagraphFont"/>
+    <w:link w:val="Footer"/>
+    <w:uiPriority w:val="99"/>
+    <w:rsid w:val="00997DD5"/>
+    <w:rPr>
+      <w:lang w:val="en-CA"/>
+    </w:rPr>
+  </w:style>
 </w:styles>
 </file>
 

</xml_diff>

<commit_message>
Changed the status scheme; synced the docx with google docs (#80)
</commit_message>
<xml_diff>
--- a/res/template_medium.docx
+++ b/res/template_medium.docx
@@ -56,326 +56,349 @@
         <w:t>og</w:t>
       </w:r>
     </w:p>
-    <w:p>
-      <w:r>
-        <w:rPr>
-          <w:rFonts w:hint="eastAsia"/>
-        </w:rPr>
-        <w:t>Ticket number: {</w:t>
-      </w:r>
-      <w:r>
-        <w:rPr>
-          <w:rFonts w:hint="eastAsia"/>
-        </w:rPr>
-        <w:t>{</w:t>
-      </w:r>
-      <w:r>
-        <w:rPr>
-          <w:rFonts w:hint="eastAsia"/>
-        </w:rPr>
-        <w:t xml:space="preserve"> </w:t>
-      </w:r>
-      <w:r>
-        <w:t>project_info</w:t>
-      </w:r>
-      <w:r>
-        <w:rPr>
-          <w:rFonts w:hint="eastAsia"/>
-        </w:rPr>
-        <w:t>.</w:t>
-      </w:r>
-      <w:r>
-        <w:t>ticket_number</w:t>
-      </w:r>
-      <w:r>
-        <w:rPr>
-          <w:rFonts w:hint="eastAsia"/>
-        </w:rPr>
-        <w:t xml:space="preserve"> }</w:t>
-      </w:r>
-      <w:r>
-        <w:rPr>
-          <w:rFonts w:hint="eastAsia"/>
-        </w:rPr>
-        <w:t>}</w:t>
-      </w:r>
-    </w:p>
-    <w:p>
-      <w:r>
-        <w:t xml:space="preserve">Curator </w:t>
-      </w:r>
-      <w:r>
-        <w:rPr>
-          <w:rFonts w:hint="eastAsia"/>
-        </w:rPr>
-        <w:t>name</w:t>
-      </w:r>
-      <w:r>
-        <w:t>:</w:t>
-      </w:r>
-      <w:r>
-        <w:rPr>
-          <w:rFonts w:hint="eastAsia"/>
-        </w:rPr>
-        <w:t xml:space="preserve"> {{ </w:t>
-      </w:r>
-      <w:r>
-        <w:t>project_info</w:t>
-      </w:r>
-      <w:r>
-        <w:rPr>
-          <w:rFonts w:hint="eastAsia"/>
-        </w:rPr>
-        <w:t>.curator_name }}</w:t>
-      </w:r>
-    </w:p>
-    <w:p>
-      <w:r>
-        <w:rPr>
-          <w:rFonts w:hint="eastAsia"/>
-        </w:rPr>
-        <w:t xml:space="preserve">Curator email: {{ </w:t>
-      </w:r>
-      <w:r>
-        <w:t>project_info</w:t>
-      </w:r>
-      <w:r>
-        <w:rPr>
-          <w:rFonts w:hint="eastAsia"/>
-        </w:rPr>
-        <w:t>.</w:t>
-      </w:r>
-      <w:r>
-        <w:t>curator_email</w:t>
-      </w:r>
-      <w:r>
-        <w:rPr>
-          <w:rFonts w:hint="eastAsia"/>
-        </w:rPr>
-        <w:t xml:space="preserve"> }}</w:t>
-      </w:r>
-    </w:p>
-    <w:p>
-      <w:r>
-        <w:rPr>
-          <w:rFonts w:hint="eastAsia"/>
-        </w:rPr>
-        <w:t xml:space="preserve">Dataset title: </w:t>
-      </w:r>
-      <w:r>
-        <w:rPr>
-          <w:rFonts w:hint="eastAsia"/>
-        </w:rPr>
-        <w:t xml:space="preserve">{{ </w:t>
-      </w:r>
-      <w:r>
-        <w:rPr>
-          <w:rFonts w:hint="eastAsia"/>
-        </w:rPr>
-        <w:t>dataset.</w:t>
-      </w:r>
-      <w:r>
-        <w:t>DatasetTitle</w:t>
-      </w:r>
-      <w:r>
-        <w:rPr>
-          <w:rFonts w:hint="eastAsia"/>
-        </w:rPr>
-        <w:t xml:space="preserve"> </w:t>
-      </w:r>
-      <w:r>
-        <w:rPr>
-          <w:rFonts w:hint="eastAsia"/>
-        </w:rPr>
-        <w:t>}}</w:t>
-      </w:r>
-    </w:p>
-    <w:p>
-      <w:r>
-        <w:rPr>
-          <w:rFonts w:hint="eastAsia"/>
-        </w:rPr>
-        <w:t xml:space="preserve">Dataset </w:t>
-      </w:r>
-      <w:r>
-        <w:t>persistent</w:t>
-      </w:r>
-      <w:r>
-        <w:rPr>
-          <w:rFonts w:hint="eastAsia"/>
-        </w:rPr>
-        <w:t xml:space="preserve"> identifier</w:t>
-      </w:r>
-      <w:r>
-        <w:rPr>
-          <w:rFonts w:hint="eastAsia"/>
-        </w:rPr>
-        <w:t>: {</w:t>
-      </w:r>
-      <w:r>
-        <w:rPr>
-          <w:rFonts w:hint="eastAsia"/>
-        </w:rPr>
-        <w:t>{</w:t>
-      </w:r>
-      <w:r>
-        <w:rPr>
-          <w:rFonts w:hint="eastAsia"/>
-        </w:rPr>
-        <w:t xml:space="preserve"> </w:t>
-      </w:r>
-      <w:r>
-        <w:rPr>
-          <w:rFonts w:hint="eastAsia"/>
-        </w:rPr>
-        <w:t>dataset.</w:t>
-      </w:r>
-      <w:r>
-        <w:t>DatasetPersistentId</w:t>
-      </w:r>
-      <w:r>
-        <w:rPr>
-          <w:rFonts w:hint="eastAsia"/>
-        </w:rPr>
-        <w:t xml:space="preserve">  }</w:t>
-      </w:r>
-      <w:r>
-        <w:rPr>
-          <w:rFonts w:hint="eastAsia"/>
-        </w:rPr>
-        <w:t>}</w:t>
-      </w:r>
-    </w:p>
-    <w:p>
-      <w:r>
-        <w:rPr>
-          <w:rFonts w:hint="eastAsia"/>
-        </w:rPr>
-        <w:t>Dataset ID (versioned): {{ dataset.ID  }}</w:t>
-      </w:r>
-    </w:p>
-    <w:p>
-      <w:r>
-        <w:rPr>
-          <w:rFonts w:hint="eastAsia"/>
-        </w:rPr>
-        <w:t>Dataset access URL: {</w:t>
-      </w:r>
-      <w:r>
-        <w:rPr>
-          <w:rFonts w:hint="eastAsia"/>
-        </w:rPr>
-        <w:t>{</w:t>
-      </w:r>
-      <w:r>
-        <w:rPr>
-          <w:rFonts w:hint="eastAsia"/>
-        </w:rPr>
-        <w:t xml:space="preserve"> dataset.</w:t>
-      </w:r>
-      <w:r>
-        <w:t>DatasetURL</w:t>
-      </w:r>
-      <w:r>
-        <w:rPr>
-          <w:rFonts w:hint="eastAsia"/>
-        </w:rPr>
-        <w:t xml:space="preserve"> }</w:t>
-      </w:r>
-      <w:r>
-        <w:rPr>
-          <w:rFonts w:hint="eastAsia"/>
-        </w:rPr>
-        <w:t>}</w:t>
-      </w:r>
-    </w:p>
-    <w:p>
-      <w:r>
-        <w:rPr>
-          <w:rFonts w:hint="eastAsia"/>
-        </w:rPr>
-        <w:t>Log</w:t>
-      </w:r>
-      <w:r>
-        <w:rPr>
-          <w:rFonts w:hint="eastAsia"/>
-        </w:rPr>
-        <w:t xml:space="preserve"> </w:t>
-      </w:r>
-      <w:r>
-        <w:t>initial</w:t>
-      </w:r>
-      <w:r>
-        <w:rPr>
-          <w:rFonts w:hint="eastAsia"/>
-        </w:rPr>
-        <w:t xml:space="preserve"> generated</w:t>
-      </w:r>
-      <w:r>
-        <w:rPr>
-          <w:rFonts w:hint="eastAsia"/>
-        </w:rPr>
-        <w:t xml:space="preserve"> </w:t>
-      </w:r>
-      <w:r>
-        <w:rPr>
-          <w:rFonts w:hint="eastAsia"/>
-        </w:rPr>
-        <w:t xml:space="preserve">date: </w:t>
-      </w:r>
-      <w:r>
-        <w:rPr>
-          <w:rFonts w:hint="eastAsia"/>
-        </w:rPr>
-        <w:t>{</w:t>
-      </w:r>
-      <w:r>
-        <w:rPr>
-          <w:rFonts w:hint="eastAsia"/>
-        </w:rPr>
-        <w:t>{</w:t>
-      </w:r>
-      <w:r>
-        <w:rPr>
-          <w:rFonts w:hint="eastAsia"/>
-        </w:rPr>
-        <w:t xml:space="preserve"> </w:t>
-      </w:r>
-      <w:r>
-        <w:rPr>
-          <w:rFonts w:hint="eastAsia"/>
-        </w:rPr>
-        <w:t>timestamp</w:t>
-      </w:r>
-      <w:r>
-        <w:rPr>
-          <w:rFonts w:hint="eastAsia"/>
-        </w:rPr>
-        <w:t xml:space="preserve"> }</w:t>
-      </w:r>
-      <w:r>
-        <w:rPr>
-          <w:rFonts w:hint="eastAsia"/>
-        </w:rPr>
-        <w:t>}</w:t>
-      </w:r>
-    </w:p>
-    <w:p>
-      <w:r>
-        <w:rPr>
-          <w:rFonts w:hint="eastAsia"/>
-        </w:rPr>
-        <w:t xml:space="preserve">Log last updated date: </w:t>
-      </w:r>
-      <w:r>
-        <w:rPr>
-          <w:rFonts w:hint="eastAsia"/>
-          <w:color w:val="FF0000"/>
-          <w:highlight w:val="yellow"/>
-        </w:rPr>
-        <w:t>FILL IN THIS FIELD</w:t>
-      </w:r>
-    </w:p>
+    <w:tbl>
+      <w:tblPr>
+        <w:tblStyle w:val="TableGrid"/>
+        <w:tblW w:w="0" w:type="auto"/>
+        <w:tblBorders>
+          <w:top w:val="none" w:sz="0" w:space="0" w:color="auto"/>
+          <w:left w:val="none" w:sz="0" w:space="0" w:color="auto"/>
+          <w:bottom w:val="none" w:sz="0" w:space="0" w:color="auto"/>
+          <w:right w:val="none" w:sz="0" w:space="0" w:color="auto"/>
+          <w:insideH w:val="none" w:sz="0" w:space="0" w:color="auto"/>
+          <w:insideV w:val="none" w:sz="0" w:space="0" w:color="auto"/>
+        </w:tblBorders>
+        <w:tblLook w:val="04A0" w:firstRow="1" w:lastRow="0" w:firstColumn="1" w:lastColumn="0" w:noHBand="0" w:noVBand="1"/>
+      </w:tblPr>
+      <w:tblGrid>
+        <w:gridCol w:w="11180"/>
+        <w:gridCol w:w="11181"/>
+      </w:tblGrid>
+      <w:tr>
+        <w:tc>
+          <w:tcPr>
+            <w:tcW w:w="11180" w:type="dxa"/>
+          </w:tcPr>
+          <w:p>
+            <w:pPr>
+              <w:spacing w:line="480" w:lineRule="auto"/>
+            </w:pPr>
+            <w:r>
+              <w:rPr>
+                <w:rFonts w:hint="eastAsia"/>
+              </w:rPr>
+              <w:t xml:space="preserve">Ticket number: {{ </w:t>
+            </w:r>
+            <w:r>
+              <w:t>project_info</w:t>
+            </w:r>
+            <w:r>
+              <w:rPr>
+                <w:rFonts w:hint="eastAsia"/>
+              </w:rPr>
+              <w:t>.</w:t>
+            </w:r>
+            <w:r>
+              <w:t>ticket_number</w:t>
+            </w:r>
+            <w:r>
+              <w:rPr>
+                <w:rFonts w:hint="eastAsia"/>
+              </w:rPr>
+              <w:t xml:space="preserve"> }}</w:t>
+            </w:r>
+          </w:p>
+          <w:p>
+            <w:pPr>
+              <w:spacing w:line="480" w:lineRule="auto"/>
+            </w:pPr>
+            <w:r>
+              <w:t xml:space="preserve">Curator </w:t>
+            </w:r>
+            <w:r>
+              <w:rPr>
+                <w:rFonts w:hint="eastAsia"/>
+              </w:rPr>
+              <w:t>name</w:t>
+            </w:r>
+            <w:r>
+              <w:t>:</w:t>
+            </w:r>
+            <w:r>
+              <w:rPr>
+                <w:rFonts w:hint="eastAsia"/>
+              </w:rPr>
+              <w:t xml:space="preserve"> {{ </w:t>
+            </w:r>
+            <w:r>
+              <w:t>project_info</w:t>
+            </w:r>
+            <w:r>
+              <w:rPr>
+                <w:rFonts w:hint="eastAsia"/>
+              </w:rPr>
+              <w:t>.curator_name }}</w:t>
+            </w:r>
+          </w:p>
+          <w:p>
+            <w:pPr>
+              <w:spacing w:line="480" w:lineRule="auto"/>
+            </w:pPr>
+            <w:r>
+              <w:rPr>
+                <w:rFonts w:hint="eastAsia"/>
+              </w:rPr>
+              <w:t xml:space="preserve">Curator email: {{ </w:t>
+            </w:r>
+            <w:r>
+              <w:t>project_info</w:t>
+            </w:r>
+            <w:r>
+              <w:rPr>
+                <w:rFonts w:hint="eastAsia"/>
+              </w:rPr>
+              <w:t>.</w:t>
+            </w:r>
+            <w:r>
+              <w:t>curator_email</w:t>
+            </w:r>
+            <w:r>
+              <w:rPr>
+                <w:rFonts w:hint="eastAsia"/>
+              </w:rPr>
+              <w:t xml:space="preserve"> }}</w:t>
+            </w:r>
+          </w:p>
+          <w:p>
+            <w:pPr>
+              <w:spacing w:line="480" w:lineRule="auto"/>
+            </w:pPr>
+            <w:r>
+              <w:rPr>
+                <w:rFonts w:hint="eastAsia"/>
+              </w:rPr>
+              <w:t>Dataset title: {{ dataset.</w:t>
+            </w:r>
+            <w:r>
+              <w:t>DatasetTitle</w:t>
+            </w:r>
+            <w:r>
+              <w:rPr>
+                <w:rFonts w:hint="eastAsia"/>
+              </w:rPr>
+              <w:t xml:space="preserve"> }}</w:t>
+            </w:r>
+          </w:p>
+          <w:p>
+            <w:pPr>
+              <w:spacing w:line="480" w:lineRule="auto"/>
+            </w:pPr>
+            <w:r>
+              <w:rPr>
+                <w:rFonts w:hint="eastAsia"/>
+              </w:rPr>
+              <w:t xml:space="preserve">Dataset </w:t>
+            </w:r>
+            <w:r>
+              <w:t>persistent</w:t>
+            </w:r>
+            <w:r>
+              <w:rPr>
+                <w:rFonts w:hint="eastAsia"/>
+              </w:rPr>
+              <w:t xml:space="preserve"> identifier: {{ dataset.</w:t>
+            </w:r>
+            <w:r>
+              <w:t>DatasetPersistentId</w:t>
+            </w:r>
+            <w:r>
+              <w:rPr>
+                <w:rFonts w:hint="eastAsia"/>
+              </w:rPr>
+              <w:t xml:space="preserve">  }}</w:t>
+            </w:r>
+          </w:p>
+          <w:p>
+            <w:pPr>
+              <w:spacing w:line="480" w:lineRule="auto"/>
+            </w:pPr>
+            <w:r>
+              <w:rPr>
+                <w:rFonts w:hint="eastAsia"/>
+              </w:rPr>
+              <w:t>Dataset ID (versioned): {{ dataset.ID  }}</w:t>
+            </w:r>
+          </w:p>
+          <w:p>
+            <w:pPr>
+              <w:spacing w:line="480" w:lineRule="auto"/>
+            </w:pPr>
+            <w:r>
+              <w:rPr>
+                <w:rFonts w:hint="eastAsia"/>
+              </w:rPr>
+              <w:t>Dataset access URL: {{ dataset.</w:t>
+            </w:r>
+            <w:r>
+              <w:t>DatasetURL</w:t>
+            </w:r>
+            <w:r>
+              <w:rPr>
+                <w:rFonts w:hint="eastAsia"/>
+              </w:rPr>
+              <w:t xml:space="preserve"> }}</w:t>
+            </w:r>
+          </w:p>
+          <w:p>
+            <w:pPr>
+              <w:spacing w:line="480" w:lineRule="auto"/>
+            </w:pPr>
+            <w:r>
+              <w:rPr>
+                <w:rFonts w:hint="eastAsia"/>
+              </w:rPr>
+              <w:t xml:space="preserve">Log </w:t>
+            </w:r>
+            <w:r>
+              <w:t>initial</w:t>
+            </w:r>
+            <w:r>
+              <w:rPr>
+                <w:rFonts w:hint="eastAsia"/>
+              </w:rPr>
+              <w:t xml:space="preserve"> generated date: {{ timestamp }}</w:t>
+            </w:r>
+          </w:p>
+          <w:p>
+            <w:pPr>
+              <w:spacing w:line="480" w:lineRule="auto"/>
+            </w:pPr>
+            <w:r>
+              <w:rPr>
+                <w:rFonts w:hint="eastAsia"/>
+              </w:rPr>
+              <w:t xml:space="preserve">Log last updated date: </w:t>
+            </w:r>
+            <w:r>
+              <w:rPr>
+                <w:rFonts w:hint="eastAsia"/>
+                <w:color w:val="FF0000"/>
+                <w:highlight w:val="yellow"/>
+              </w:rPr>
+              <w:t>FILL IN THIS FIELD</w:t>
+            </w:r>
+          </w:p>
+        </w:tc>
+        <w:tc>
+          <w:tcPr>
+            <w:tcW w:w="11181" w:type="dxa"/>
+          </w:tcPr>
+          <w:p>
+            <w:pPr>
+              <w:spacing w:line="480" w:lineRule="auto"/>
+              <w:rPr>
+                <w:b/>
+                <w:bCs/>
+                <w:u w:val="single"/>
+              </w:rPr>
+            </w:pPr>
+            <w:r>
+              <w:rPr>
+                <w:rFonts w:hint="eastAsia"/>
+                <w:b/>
+                <w:bCs/>
+                <w:u w:val="single"/>
+              </w:rPr>
+              <w:t xml:space="preserve">Explanation of </w:t>
+            </w:r>
+            <w:r>
+              <w:rPr>
+                <w:rFonts w:hint="eastAsia"/>
+                <w:b/>
+                <w:bCs/>
+                <w:u w:val="single"/>
+              </w:rPr>
+              <w:t>Status</w:t>
+            </w:r>
+          </w:p>
+          <w:p>
+            <w:pPr>
+              <w:spacing w:line="480" w:lineRule="auto"/>
+            </w:pPr>
+            <w:r>
+              <w:rPr>
+                <w:b/>
+                <w:bCs/>
+              </w:rPr>
+              <w:t>P</w:t>
+            </w:r>
+            <w:r>
+              <w:t>: Passed</w:t>
+            </w:r>
+          </w:p>
+          <w:p>
+            <w:pPr>
+              <w:spacing w:line="480" w:lineRule="auto"/>
+            </w:pPr>
+            <w:r>
+              <w:rPr>
+                <w:b/>
+                <w:bCs/>
+              </w:rPr>
+              <w:t>RQU</w:t>
+            </w:r>
+            <w:r>
+              <w:t>:  Required Follow-up</w:t>
+            </w:r>
+          </w:p>
+          <w:p>
+            <w:pPr>
+              <w:spacing w:line="480" w:lineRule="auto"/>
+            </w:pPr>
+            <w:r>
+              <w:rPr>
+                <w:b/>
+                <w:bCs/>
+              </w:rPr>
+              <w:t>RCM</w:t>
+            </w:r>
+            <w:r>
+              <w:t>: Recommend Follow-up</w:t>
+            </w:r>
+          </w:p>
+          <w:p>
+            <w:pPr>
+              <w:spacing w:line="480" w:lineRule="auto"/>
+            </w:pPr>
+            <w:r>
+              <w:rPr>
+                <w:b/>
+                <w:bCs/>
+              </w:rPr>
+              <w:t>NS</w:t>
+            </w:r>
+            <w:r>
+              <w:t>: RQUt Sure</w:t>
+            </w:r>
+          </w:p>
+          <w:p>
+            <w:pPr>
+              <w:spacing w:line="480" w:lineRule="auto"/>
+            </w:pPr>
+            <w:r>
+              <w:rPr>
+                <w:b/>
+                <w:bCs/>
+              </w:rPr>
+              <w:t>NA</w:t>
+            </w:r>
+            <w:r>
+              <w:t>: Not applicable.</w:t>
+            </w:r>
+          </w:p>
+        </w:tc>
+      </w:tr>
+    </w:tbl>
     <w:p/>
     <w:tbl>
       <w:tblPr>
@@ -389,17 +412,17 @@
         <w:tblLook w:val="04A0" w:firstRow="1" w:lastRow="0" w:firstColumn="1" w:lastColumn="0" w:noHBand="0" w:noVBand="1"/>
       </w:tblPr>
       <w:tblGrid>
-        <w:gridCol w:w="489"/>
-        <w:gridCol w:w="1272"/>
-        <w:gridCol w:w="1694"/>
-        <w:gridCol w:w="3573"/>
-        <w:gridCol w:w="3104"/>
-        <w:gridCol w:w="3573"/>
-        <w:gridCol w:w="400"/>
-        <w:gridCol w:w="2357"/>
-        <w:gridCol w:w="4101"/>
-        <w:gridCol w:w="1038"/>
-        <w:gridCol w:w="750"/>
+        <w:gridCol w:w="487"/>
+        <w:gridCol w:w="1262"/>
+        <w:gridCol w:w="1851"/>
+        <w:gridCol w:w="3544"/>
+        <w:gridCol w:w="3080"/>
+        <w:gridCol w:w="3544"/>
+        <w:gridCol w:w="398"/>
+        <w:gridCol w:w="2339"/>
+        <w:gridCol w:w="4070"/>
+        <w:gridCol w:w="1031"/>
+        <w:gridCol w:w="745"/>
       </w:tblGrid>
       <w:tr>
         <w:trPr>
@@ -785,7 +808,7 @@
                 <w:bCs/>
                 <w:lang w:val="en-US"/>
               </w:rPr>
-              <w:t>Yes</w:t>
+              <w:t>P</w:t>
             </w:r>
           </w:p>
         </w:tc>
@@ -819,7 +842,7 @@
                 <w:bCs/>
                 <w:lang w:val="en-US"/>
               </w:rPr>
-              <w:t>No</w:t>
+              <w:t>RQU</w:t>
             </w:r>
           </w:p>
         </w:tc>
@@ -853,7 +876,7 @@
                 <w:bCs/>
                 <w:lang w:val="en-US"/>
               </w:rPr>
-              <w:t>SI</w:t>
+              <w:t>RCM</w:t>
             </w:r>
           </w:p>
         </w:tc>
@@ -1101,6 +1124,24 @@
               <w:t>Python scripted.</w:t>
             </w:r>
           </w:p>
+          <w:p>
+            <w:pPr>
+              <w:pStyle w:val="ListParagraph"/>
+              <w:numPr>
+                <w:ilvl w:val="0"/>
+                <w:numId w:val="33"/>
+              </w:numPr>
+              <w:rPr>
+                <w:lang w:val="en-US"/>
+              </w:rPr>
+            </w:pPr>
+            <w:r>
+              <w:rPr>
+                <w:lang w:val="en-US"/>
+              </w:rPr>
+              <w:t>Confirm whether the listed dataverse collection refers to the same researcher/author</w:t>
+            </w:r>
+          </w:p>
         </w:tc>
         <w:tc>
           <w:tcPr>
@@ -1189,6 +1230,31 @@
                 <w:lang w:val="en-US"/>
               </w:rPr>
             </w:pPr>
+          </w:p>
+        </w:tc>
+        <w:tc>
+          <w:tcPr>
+            <w:tcW w:w="0" w:type="auto"/>
+            <w:tcBorders>
+              <w:top w:val="single" w:sz="8" w:space="0" w:color="000000"/>
+              <w:left w:val="single" w:sz="8" w:space="0" w:color="000000"/>
+              <w:bottom w:val="single" w:sz="8" w:space="0" w:color="000000"/>
+              <w:right w:val="single" w:sz="8" w:space="0" w:color="000000"/>
+            </w:tcBorders>
+            <w:tcMar>
+              <w:top w:w="100" w:type="dxa"/>
+              <w:left w:w="100" w:type="dxa"/>
+              <w:bottom w:w="100" w:type="dxa"/>
+              <w:right w:w="100" w:type="dxa"/>
+            </w:tcMar>
+            <w:hideMark/>
+          </w:tcPr>
+          <w:p>
+            <w:pPr>
+              <w:rPr>
+                <w:lang w:val="en-US"/>
+              </w:rPr>
+            </w:pPr>
             <w:r>
               <w:rPr>
                 <w:lang w:val="en-US"/>
@@ -1222,31 +1288,6 @@
               <w:t xml:space="preserve"> 0 %}X{% endif %}</w:t>
             </w:r>
           </w:p>
-          <w:p>
-            <w:pPr>
-              <w:rPr>
-                <w:lang w:val="en-US"/>
-              </w:rPr>
-            </w:pPr>
-          </w:p>
-        </w:tc>
-        <w:tc>
-          <w:tcPr>
-            <w:tcW w:w="0" w:type="auto"/>
-            <w:tcBorders>
-              <w:top w:val="single" w:sz="8" w:space="0" w:color="000000"/>
-              <w:left w:val="single" w:sz="8" w:space="0" w:color="000000"/>
-              <w:bottom w:val="single" w:sz="8" w:space="0" w:color="000000"/>
-              <w:right w:val="single" w:sz="8" w:space="0" w:color="000000"/>
-            </w:tcBorders>
-            <w:tcMar>
-              <w:top w:w="100" w:type="dxa"/>
-              <w:left w:w="100" w:type="dxa"/>
-              <w:bottom w:w="100" w:type="dxa"/>
-              <w:right w:w="100" w:type="dxa"/>
-            </w:tcMar>
-            <w:hideMark/>
-          </w:tcPr>
           <w:p>
             <w:pPr>
               <w:rPr>
@@ -1559,14 +1600,14 @@
               <w:rPr>
                 <w:lang w:val="en-US"/>
               </w:rPr>
-              <w:t xml:space="preserve">If the dataset is deposited in a sub-dataverse collection, include </w:t>
+              <w:t>If the dataset is deposited in a sub-dataverse collectio</w:t>
             </w:r>
             <w:r>
               <w:rPr>
                 <w:lang w:val="en-US"/>
               </w:rPr>
               <w:lastRenderedPageBreak/>
-              <w:t>the name of the collection. </w:t>
+              <w:t>n, include the name of the collection. </w:t>
             </w:r>
           </w:p>
           <w:p>
@@ -1663,6 +1704,30 @@
               <w:bottom w:w="100" w:type="dxa"/>
               <w:right w:w="100" w:type="dxa"/>
             </w:tcMar>
+          </w:tcPr>
+          <w:p>
+            <w:pPr>
+              <w:rPr>
+                <w:lang w:val="en-US"/>
+              </w:rPr>
+            </w:pPr>
+          </w:p>
+        </w:tc>
+        <w:tc>
+          <w:tcPr>
+            <w:tcW w:w="0" w:type="auto"/>
+            <w:tcBorders>
+              <w:top w:val="single" w:sz="8" w:space="0" w:color="000000"/>
+              <w:left w:val="single" w:sz="8" w:space="0" w:color="000000"/>
+              <w:bottom w:val="single" w:sz="8" w:space="0" w:color="000000"/>
+              <w:right w:val="single" w:sz="8" w:space="0" w:color="000000"/>
+            </w:tcBorders>
+            <w:tcMar>
+              <w:top w:w="100" w:type="dxa"/>
+              <w:left w:w="100" w:type="dxa"/>
+              <w:bottom w:w="100" w:type="dxa"/>
+              <w:right w:w="100" w:type="dxa"/>
+            </w:tcMar>
             <w:hideMark/>
           </w:tcPr>
           <w:p>
@@ -1759,38 +1824,6 @@
               </w:rPr>
             </w:pPr>
           </w:p>
-          <w:p>
-            <w:pPr>
-              <w:rPr>
-                <w:lang w:val="en-US"/>
-              </w:rPr>
-            </w:pPr>
-          </w:p>
-        </w:tc>
-        <w:tc>
-          <w:tcPr>
-            <w:tcW w:w="0" w:type="auto"/>
-            <w:tcBorders>
-              <w:top w:val="single" w:sz="8" w:space="0" w:color="000000"/>
-              <w:left w:val="single" w:sz="8" w:space="0" w:color="000000"/>
-              <w:bottom w:val="single" w:sz="8" w:space="0" w:color="000000"/>
-              <w:right w:val="single" w:sz="8" w:space="0" w:color="000000"/>
-            </w:tcBorders>
-            <w:tcMar>
-              <w:top w:w="100" w:type="dxa"/>
-              <w:left w:w="100" w:type="dxa"/>
-              <w:bottom w:w="100" w:type="dxa"/>
-              <w:right w:w="100" w:type="dxa"/>
-            </w:tcMar>
-            <w:hideMark/>
-          </w:tcPr>
-          <w:p>
-            <w:pPr>
-              <w:rPr>
-                <w:lang w:val="en-US"/>
-              </w:rPr>
-            </w:pPr>
-          </w:p>
         </w:tc>
         <w:tc>
           <w:tcPr>
@@ -2114,14 +2147,14 @@
               <w:rPr>
                 <w:lang w:val="en-US"/>
               </w:rPr>
-              <w:t>Confirm with the deposit</w:t>
+              <w:t xml:space="preserve">Confirm with the depositor that they actually </w:t>
             </w:r>
             <w:r>
               <w:rPr>
                 <w:lang w:val="en-US"/>
               </w:rPr>
               <w:lastRenderedPageBreak/>
-              <w:t>or that they actually require a dataverse (e.g., will there be future deposits?)</w:t>
+              <w:t>require a dataverse (e.g., will there be future deposits?)</w:t>
             </w:r>
           </w:p>
         </w:tc>
@@ -2463,7 +2496,7 @@
                 <w:bCs/>
                 <w:lang w:val="en-US"/>
               </w:rPr>
-              <w:t>Yes</w:t>
+              <w:t>P</w:t>
             </w:r>
           </w:p>
         </w:tc>
@@ -2497,7 +2530,7 @@
                 <w:bCs/>
                 <w:lang w:val="en-US"/>
               </w:rPr>
-              <w:t>No</w:t>
+              <w:t>RQU</w:t>
             </w:r>
           </w:p>
         </w:tc>
@@ -2531,7 +2564,7 @@
                 <w:bCs/>
                 <w:lang w:val="en-US"/>
               </w:rPr>
-              <w:t>SI</w:t>
+              <w:t>RCM</w:t>
             </w:r>
           </w:p>
         </w:tc>
@@ -2834,37 +2867,37 @@
                 <w:lang w:val="en-US"/>
               </w:rPr>
             </w:pPr>
-          </w:p>
-        </w:tc>
-        <w:tc>
-          <w:tcPr>
-            <w:tcW w:w="0" w:type="auto"/>
-            <w:tcBorders>
-              <w:top w:val="single" w:sz="8" w:space="0" w:color="000000"/>
-              <w:left w:val="single" w:sz="8" w:space="0" w:color="000000"/>
-              <w:bottom w:val="single" w:sz="8" w:space="0" w:color="000000"/>
-              <w:right w:val="single" w:sz="8" w:space="0" w:color="000000"/>
-            </w:tcBorders>
-            <w:tcMar>
-              <w:top w:w="100" w:type="dxa"/>
-              <w:left w:w="100" w:type="dxa"/>
-              <w:bottom w:w="100" w:type="dxa"/>
-              <w:right w:w="100" w:type="dxa"/>
-            </w:tcMar>
-            <w:hideMark/>
-          </w:tcPr>
-          <w:p>
-            <w:pPr>
-              <w:rPr>
-                <w:lang w:val="en-US"/>
-              </w:rPr>
-            </w:pPr>
             <w:r>
               <w:rPr>
                 <w:lang w:val="en-US"/>
               </w:rPr>
               <w:t>{% if template_dict.file_ext.comments|length &gt; 0 %}X{% endif %}</w:t>
             </w:r>
+          </w:p>
+        </w:tc>
+        <w:tc>
+          <w:tcPr>
+            <w:tcW w:w="0" w:type="auto"/>
+            <w:tcBorders>
+              <w:top w:val="single" w:sz="8" w:space="0" w:color="000000"/>
+              <w:left w:val="single" w:sz="8" w:space="0" w:color="000000"/>
+              <w:bottom w:val="single" w:sz="8" w:space="0" w:color="000000"/>
+              <w:right w:val="single" w:sz="8" w:space="0" w:color="000000"/>
+            </w:tcBorders>
+            <w:tcMar>
+              <w:top w:w="100" w:type="dxa"/>
+              <w:left w:w="100" w:type="dxa"/>
+              <w:bottom w:w="100" w:type="dxa"/>
+              <w:right w:w="100" w:type="dxa"/>
+            </w:tcMar>
+            <w:hideMark/>
+          </w:tcPr>
+          <w:p>
+            <w:pPr>
+              <w:rPr>
+                <w:lang w:val="en-US"/>
+              </w:rPr>
+            </w:pPr>
           </w:p>
         </w:tc>
         <w:tc>
@@ -2974,13 +3007,7 @@
               <w:rPr>
                 <w:lang w:val="en-US"/>
               </w:rPr>
-              <w:t>{{ item.file_name }}</w:t>
-            </w:r>
-            <w:r>
-              <w:rPr>
-                <w:lang w:val="en-US"/>
-              </w:rPr>
-              <w:t>{% endfor %}</w:t>
+              <w:t>{{ item.file_name }}{% endfor %}</w:t>
             </w:r>
           </w:p>
           <w:p>
@@ -3579,34 +3606,59 @@
               <w:t>Python scripted.</w:t>
             </w:r>
           </w:p>
-        </w:tc>
-        <w:tc>
-          <w:tcPr>
-            <w:tcW w:w="0" w:type="auto"/>
-            <w:tcBorders>
-              <w:top w:val="single" w:sz="8" w:space="0" w:color="000000"/>
-              <w:left w:val="single" w:sz="8" w:space="0" w:color="000000"/>
-              <w:bottom w:val="single" w:sz="8" w:space="0" w:color="000000"/>
-              <w:right w:val="single" w:sz="8" w:space="0" w:color="000000"/>
-            </w:tcBorders>
-            <w:tcMar>
-              <w:top w:w="100" w:type="dxa"/>
-              <w:left w:w="100" w:type="dxa"/>
-              <w:bottom w:w="100" w:type="dxa"/>
-              <w:right w:w="100" w:type="dxa"/>
-            </w:tcMar>
-            <w:hideMark/>
-          </w:tcPr>
-          <w:p>
-            <w:pPr>
-              <w:rPr>
-                <w:lang w:val="en-US"/>
-              </w:rPr>
-            </w:pPr>
-            <w:r>
-              <w:rPr>
-                <w:lang w:val="en-US"/>
-              </w:rPr>
+          <w:p>
+            <w:pPr>
+              <w:numPr>
+                <w:ilvl w:val="0"/>
+                <w:numId w:val="8"/>
+              </w:numPr>
+              <w:rPr>
+                <w:lang w:val="en-US"/>
+              </w:rPr>
+            </w:pPr>
+            <w:r>
+              <w:rPr>
+                <w:lang w:val="en-US"/>
+              </w:rPr>
+              <w:t xml:space="preserve">Not all the files require a file extension (e.g. a README file can either be ‘README’ or </w:t>
+            </w:r>
+            <w:r>
+              <w:rPr>
+                <w:lang w:val="en-US"/>
+              </w:rPr>
+              <w:lastRenderedPageBreak/>
+              <w:t>‘README.md’). Curator needs to check on a case-by-case basis.</w:t>
+            </w:r>
+          </w:p>
+        </w:tc>
+        <w:tc>
+          <w:tcPr>
+            <w:tcW w:w="0" w:type="auto"/>
+            <w:tcBorders>
+              <w:top w:val="single" w:sz="8" w:space="0" w:color="000000"/>
+              <w:left w:val="single" w:sz="8" w:space="0" w:color="000000"/>
+              <w:bottom w:val="single" w:sz="8" w:space="0" w:color="000000"/>
+              <w:right w:val="single" w:sz="8" w:space="0" w:color="000000"/>
+            </w:tcBorders>
+            <w:tcMar>
+              <w:top w:w="100" w:type="dxa"/>
+              <w:left w:w="100" w:type="dxa"/>
+              <w:bottom w:w="100" w:type="dxa"/>
+              <w:right w:w="100" w:type="dxa"/>
+            </w:tcMar>
+            <w:hideMark/>
+          </w:tcPr>
+          <w:p>
+            <w:pPr>
+              <w:rPr>
+                <w:lang w:val="en-US"/>
+              </w:rPr>
+            </w:pPr>
+            <w:r>
+              <w:rPr>
+                <w:lang w:val="en-US"/>
+              </w:rPr>
+              <w:lastRenderedPageBreak/>
               <w:t xml:space="preserve">{% if template_dict.readme_file.comments|length </w:t>
             </w:r>
             <w:r>
@@ -3647,37 +3699,37 @@
                 <w:lang w:val="en-US"/>
               </w:rPr>
             </w:pPr>
-          </w:p>
-        </w:tc>
-        <w:tc>
-          <w:tcPr>
-            <w:tcW w:w="0" w:type="auto"/>
-            <w:tcBorders>
-              <w:top w:val="single" w:sz="8" w:space="0" w:color="000000"/>
-              <w:left w:val="single" w:sz="8" w:space="0" w:color="000000"/>
-              <w:bottom w:val="single" w:sz="8" w:space="0" w:color="000000"/>
-              <w:right w:val="single" w:sz="8" w:space="0" w:color="000000"/>
-            </w:tcBorders>
-            <w:tcMar>
-              <w:top w:w="100" w:type="dxa"/>
-              <w:left w:w="100" w:type="dxa"/>
-              <w:bottom w:w="100" w:type="dxa"/>
-              <w:right w:w="100" w:type="dxa"/>
-            </w:tcMar>
-            <w:hideMark/>
-          </w:tcPr>
-          <w:p>
-            <w:pPr>
-              <w:rPr>
-                <w:lang w:val="en-US"/>
-              </w:rPr>
-            </w:pPr>
             <w:r>
               <w:rPr>
                 <w:lang w:val="en-US"/>
               </w:rPr>
               <w:t>{% if template_dict.file_ext.comments|length &gt; 0 %}X{% endif %}</w:t>
             </w:r>
+          </w:p>
+        </w:tc>
+        <w:tc>
+          <w:tcPr>
+            <w:tcW w:w="0" w:type="auto"/>
+            <w:tcBorders>
+              <w:top w:val="single" w:sz="8" w:space="0" w:color="000000"/>
+              <w:left w:val="single" w:sz="8" w:space="0" w:color="000000"/>
+              <w:bottom w:val="single" w:sz="8" w:space="0" w:color="000000"/>
+              <w:right w:val="single" w:sz="8" w:space="0" w:color="000000"/>
+            </w:tcBorders>
+            <w:tcMar>
+              <w:top w:w="100" w:type="dxa"/>
+              <w:left w:w="100" w:type="dxa"/>
+              <w:bottom w:w="100" w:type="dxa"/>
+              <w:right w:w="100" w:type="dxa"/>
+            </w:tcMar>
+            <w:hideMark/>
+          </w:tcPr>
+          <w:p>
+            <w:pPr>
+              <w:rPr>
+                <w:lang w:val="en-US"/>
+              </w:rPr>
+            </w:pPr>
           </w:p>
         </w:tc>
         <w:tc>
@@ -3884,7 +3936,6 @@
                 <w:bCs/>
                 <w:lang w:val="en-US"/>
               </w:rPr>
-              <w:lastRenderedPageBreak/>
               <w:t>2.4</w:t>
             </w:r>
           </w:p>
@@ -4518,7 +4569,7 @@
               <w:rPr>
                 <w:lang w:val="en-US"/>
               </w:rPr>
-              <w:t>List the uncommon file format that has documentation file:</w:t>
+              <w:t>List the uncommon file format that has additional documentation:</w:t>
             </w:r>
           </w:p>
           <w:p>
@@ -4546,10 +4597,7 @@
               </w:rPr>
             </w:pPr>
             <w:r>
-              <w:rPr>
-                <w:lang w:val="en-US"/>
-              </w:rPr>
-              <w:t>List the uncommon file format that does not have a documentation file:</w:t>
+              <w:t>List the uncommon file format that does NOT have additional documentation:</w:t>
             </w:r>
           </w:p>
           <w:p>
@@ -4749,7 +4797,7 @@
                 <w:bCs/>
                 <w:lang w:val="en-US"/>
               </w:rPr>
-              <w:t>Yes</w:t>
+              <w:t>P</w:t>
             </w:r>
           </w:p>
         </w:tc>
@@ -4783,7 +4831,7 @@
                 <w:bCs/>
                 <w:lang w:val="en-US"/>
               </w:rPr>
-              <w:t>No</w:t>
+              <w:t>RQU</w:t>
             </w:r>
           </w:p>
         </w:tc>
@@ -4817,7 +4865,7 @@
                 <w:bCs/>
                 <w:lang w:val="en-US"/>
               </w:rPr>
-              <w:t>SI</w:t>
+              <w:t>RCM</w:t>
             </w:r>
           </w:p>
         </w:tc>
@@ -5373,6 +5421,7 @@
                 <w:bCs/>
                 <w:lang w:val="en-US"/>
               </w:rPr>
+              <w:lastRenderedPageBreak/>
               <w:t>4.0</w:t>
             </w:r>
           </w:p>
@@ -5467,7 +5516,7 @@
                 <w:bCs/>
                 <w:lang w:val="en-US"/>
               </w:rPr>
-              <w:t>Yes</w:t>
+              <w:t>P</w:t>
             </w:r>
           </w:p>
         </w:tc>
@@ -5501,7 +5550,7 @@
                 <w:bCs/>
                 <w:lang w:val="en-US"/>
               </w:rPr>
-              <w:t>No</w:t>
+              <w:t>RQU</w:t>
             </w:r>
           </w:p>
         </w:tc>
@@ -5535,7 +5584,7 @@
                 <w:bCs/>
                 <w:lang w:val="en-US"/>
               </w:rPr>
-              <w:t>SI</w:t>
+              <w:t>RCM</w:t>
             </w:r>
           </w:p>
         </w:tc>
@@ -5719,7 +5768,6 @@
                 <w:bCs/>
                 <w:lang w:val="en-US"/>
               </w:rPr>
-              <w:lastRenderedPageBreak/>
               <w:t>4.1</w:t>
             </w:r>
           </w:p>
@@ -5889,7 +5937,13 @@
               <w:rPr>
                 <w:lang w:val="en-US"/>
               </w:rPr>
-              <w:t>Notes</w:t>
+              <w:t>RQU</w:t>
+            </w:r>
+            <w:r>
+              <w:rPr>
+                <w:lang w:val="en-US"/>
+              </w:rPr>
+              <w:t>tes</w:t>
             </w:r>
           </w:p>
         </w:tc>
@@ -7072,7 +7126,7 @@
                 <w:bCs/>
                 <w:lang w:val="en-US"/>
               </w:rPr>
-              <w:t>No</w:t>
+              <w:t>RQU</w:t>
             </w:r>
           </w:p>
         </w:tc>
@@ -7106,7 +7160,7 @@
                 <w:bCs/>
                 <w:lang w:val="en-US"/>
               </w:rPr>
-              <w:t>SI</w:t>
+              <w:t>RCM</w:t>
             </w:r>
           </w:p>
         </w:tc>
@@ -7532,7 +7586,21 @@
               <w:rPr>
                 <w:lang w:val="en-US"/>
               </w:rPr>
-              <w:t>List fields/files below with the format ‘field/</w:t>
+              <w:t>List fields/files below with the format ‘</w:t>
+            </w:r>
+            <w:r>
+              <w:rPr>
+                <w:i/>
+                <w:iCs/>
+                <w:lang w:val="en-US"/>
+              </w:rPr>
+              <w:t>field</w:t>
+            </w:r>
+            <w:r>
+              <w:rPr>
+                <w:lang w:val="en-US"/>
+              </w:rPr>
+              <w:t>/</w:t>
             </w:r>
             <w:r>
               <w:rPr>
@@ -7684,16 +7752,7 @@
                 <w:bCs/>
                 <w:lang w:val="en-US"/>
               </w:rPr>
-              <w:t xml:space="preserve">*If something is flagged in the sensitive data review, does the depositor have REB approval to share </w:t>
-            </w:r>
-            <w:r>
-              <w:rPr>
-                <w:b/>
-                <w:bCs/>
-                <w:lang w:val="en-US"/>
-              </w:rPr>
-              <w:lastRenderedPageBreak/>
-              <w:t>the dataset?</w:t>
+              <w:t>*If something is flagged in the sensitive data review, does the depositor have REB approval to share the dataset?</w:t>
             </w:r>
           </w:p>
         </w:tc>
@@ -7728,15 +7787,14 @@
               <w:rPr>
                 <w:lang w:val="en-US"/>
               </w:rPr>
+              <w:t xml:space="preserve">If something is flagged in the sensitive data review (see question above), check the intake form to confirm information about </w:t>
+            </w:r>
+            <w:r>
+              <w:rPr>
+                <w:lang w:val="en-US"/>
+              </w:rPr>
               <w:lastRenderedPageBreak/>
-              <w:t xml:space="preserve">If something is flagged in the sensitive data review (see question above), check </w:t>
-            </w:r>
-            <w:r>
-              <w:rPr>
-                <w:lang w:val="en-US"/>
-              </w:rPr>
-              <w:lastRenderedPageBreak/>
-              <w:t>the intake form to confirm information about their REB status.</w:t>
+              <w:t>their REB status.</w:t>
             </w:r>
           </w:p>
         </w:tc>
@@ -8316,7 +8374,7 @@
               <w:tblLook w:val="04A0" w:firstRow="1" w:lastRow="0" w:firstColumn="1" w:lastColumn="0" w:noHBand="0" w:noVBand="1"/>
             </w:tblPr>
             <w:tblGrid>
-              <w:gridCol w:w="3891"/>
+              <w:gridCol w:w="3860"/>
             </w:tblGrid>
             <w:tr>
               <w:tc>
@@ -8485,47 +8543,37 @@
                 <w:bCs/>
                 <w:lang w:val="en-US"/>
               </w:rPr>
-              <w:t xml:space="preserve">*If there are restricted files in the dataset, is the Terms of Access </w:t>
-            </w:r>
-            <w:r>
-              <w:rPr>
-                <w:b/>
-                <w:bCs/>
-                <w:lang w:val="en-US"/>
-              </w:rPr>
-              <w:lastRenderedPageBreak/>
-              <w:t>field complete?</w:t>
-            </w:r>
-          </w:p>
-        </w:tc>
-        <w:tc>
-          <w:tcPr>
-            <w:tcW w:w="0" w:type="auto"/>
-            <w:tcBorders>
-              <w:top w:val="single" w:sz="8" w:space="0" w:color="000000"/>
-              <w:left w:val="single" w:sz="8" w:space="0" w:color="000000"/>
-              <w:bottom w:val="single" w:sz="8" w:space="0" w:color="000000"/>
-              <w:right w:val="single" w:sz="8" w:space="0" w:color="000000"/>
-            </w:tcBorders>
-            <w:tcMar>
-              <w:top w:w="100" w:type="dxa"/>
-              <w:left w:w="100" w:type="dxa"/>
-              <w:bottom w:w="100" w:type="dxa"/>
-              <w:right w:w="100" w:type="dxa"/>
-            </w:tcMar>
-            <w:hideMark/>
-          </w:tcPr>
-          <w:p>
-            <w:pPr>
-              <w:rPr>
-                <w:lang w:val="en-US"/>
-              </w:rPr>
-            </w:pPr>
-            <w:r>
-              <w:rPr>
-                <w:lang w:val="en-US"/>
-              </w:rPr>
-              <w:lastRenderedPageBreak/>
+              <w:t>*If there are restricted files in the dataset, is the Terms of Access field complete?</w:t>
+            </w:r>
+          </w:p>
+        </w:tc>
+        <w:tc>
+          <w:tcPr>
+            <w:tcW w:w="0" w:type="auto"/>
+            <w:tcBorders>
+              <w:top w:val="single" w:sz="8" w:space="0" w:color="000000"/>
+              <w:left w:val="single" w:sz="8" w:space="0" w:color="000000"/>
+              <w:bottom w:val="single" w:sz="8" w:space="0" w:color="000000"/>
+              <w:right w:val="single" w:sz="8" w:space="0" w:color="000000"/>
+            </w:tcBorders>
+            <w:tcMar>
+              <w:top w:w="100" w:type="dxa"/>
+              <w:left w:w="100" w:type="dxa"/>
+              <w:bottom w:w="100" w:type="dxa"/>
+              <w:right w:w="100" w:type="dxa"/>
+            </w:tcMar>
+            <w:hideMark/>
+          </w:tcPr>
+          <w:p>
+            <w:pPr>
+              <w:rPr>
+                <w:lang w:val="en-US"/>
+              </w:rPr>
+            </w:pPr>
+            <w:r>
+              <w:rPr>
+                <w:lang w:val="en-US"/>
+              </w:rPr>
               <w:t>Python scripted.</w:t>
             </w:r>
           </w:p>
@@ -8543,14 +8591,7 @@
               <w:rPr>
                 <w:lang w:val="en-US"/>
               </w:rPr>
-              <w:t xml:space="preserve">If there are restricted files </w:t>
-            </w:r>
-            <w:r>
-              <w:rPr>
-                <w:lang w:val="en-US"/>
-              </w:rPr>
-              <w:lastRenderedPageBreak/>
-              <w:t>and no Terms of Access, recommend including terms of access.</w:t>
+              <w:t>If there are restricted files and no Terms of Access, recommend including terms of access.</w:t>
             </w:r>
           </w:p>
         </w:tc>
@@ -8582,7 +8623,6 @@
                 <w:rFonts w:hint="eastAsia"/>
                 <w:lang w:val="en-US"/>
               </w:rPr>
-              <w:lastRenderedPageBreak/>
               <w:t xml:space="preserve">{% if </w:t>
             </w:r>
             <w:r>
@@ -8671,6 +8711,32 @@
           <w:p>
             <w:pPr>
               <w:rPr>
+                <w:rFonts w:hint="eastAsia"/>
+                <w:lang w:val="en-US"/>
+              </w:rPr>
+            </w:pPr>
+          </w:p>
+        </w:tc>
+        <w:tc>
+          <w:tcPr>
+            <w:tcW w:w="0" w:type="auto"/>
+            <w:tcBorders>
+              <w:top w:val="single" w:sz="8" w:space="0" w:color="000000"/>
+              <w:left w:val="single" w:sz="8" w:space="0" w:color="000000"/>
+              <w:bottom w:val="single" w:sz="8" w:space="0" w:color="000000"/>
+              <w:right w:val="single" w:sz="8" w:space="0" w:color="000000"/>
+            </w:tcBorders>
+            <w:tcMar>
+              <w:top w:w="100" w:type="dxa"/>
+              <w:left w:w="100" w:type="dxa"/>
+              <w:bottom w:w="100" w:type="dxa"/>
+              <w:right w:w="100" w:type="dxa"/>
+            </w:tcMar>
+            <w:hideMark/>
+          </w:tcPr>
+          <w:p>
+            <w:pPr>
+              <w:rPr>
                 <w:lang w:val="en-US"/>
               </w:rPr>
             </w:pPr>
@@ -8745,31 +8811,6 @@
             <w:r>
               <w:t>X{% endif %}</w:t>
             </w:r>
-          </w:p>
-        </w:tc>
-        <w:tc>
-          <w:tcPr>
-            <w:tcW w:w="0" w:type="auto"/>
-            <w:tcBorders>
-              <w:top w:val="single" w:sz="8" w:space="0" w:color="000000"/>
-              <w:left w:val="single" w:sz="8" w:space="0" w:color="000000"/>
-              <w:bottom w:val="single" w:sz="8" w:space="0" w:color="000000"/>
-              <w:right w:val="single" w:sz="8" w:space="0" w:color="000000"/>
-            </w:tcBorders>
-            <w:tcMar>
-              <w:top w:w="100" w:type="dxa"/>
-              <w:left w:w="100" w:type="dxa"/>
-              <w:bottom w:w="100" w:type="dxa"/>
-              <w:right w:w="100" w:type="dxa"/>
-            </w:tcMar>
-            <w:hideMark/>
-          </w:tcPr>
-          <w:p>
-            <w:pPr>
-              <w:rPr>
-                <w:lang w:val="en-US"/>
-              </w:rPr>
-            </w:pPr>
           </w:p>
         </w:tc>
         <w:tc>
@@ -8919,7 +8960,7 @@
               <w:tblLook w:val="04A0" w:firstRow="1" w:lastRow="0" w:firstColumn="1" w:lastColumn="0" w:noHBand="0" w:noVBand="1"/>
             </w:tblPr>
             <w:tblGrid>
-              <w:gridCol w:w="3891"/>
+              <w:gridCol w:w="3860"/>
             </w:tblGrid>
             <w:tr>
               <w:tc>
@@ -9038,6 +9079,56 @@
 </w:document>
 </file>
 
+<file path=word/endnotes.xml><?xml version="1.0" encoding="utf-8"?>
+<w:endnotes xmlns:wpc="http://schemas.microsoft.com/office/word/2010/wordprocessingCanvas" xmlns:cx="http://schemas.microsoft.com/office/drawing/2014/chartex" xmlns:cx1="http://schemas.microsoft.com/office/drawing/2015/9/8/chartex" xmlns:cx2="http://schemas.microsoft.com/office/drawing/2015/10/21/chartex" xmlns:cx3="http://schemas.microsoft.com/office/drawing/2016/5/9/chartex" xmlns:cx4="http://schemas.microsoft.com/office/drawing/2016/5/10/chartex" xmlns:cx5="http://schemas.microsoft.com/office/drawing/2016/5/11/chartex" xmlns:cx6="http://schemas.microsoft.com/office/drawing/2016/5/12/chartex" xmlns:cx7="http://schemas.microsoft.com/office/drawing/2016/5/13/chartex" xmlns:cx8="http://schemas.microsoft.com/office/drawing/2016/5/14/chartex" xmlns:mc="http://schemas.openxmlformats.org/markup-compatibility/2006" xmlns:aink="http://schemas.microsoft.com/office/drawing/2016/ink" xmlns:am3d="http://schemas.microsoft.com/office/drawing/2017/model3d" xmlns:o="urn:schemas-microsoft-com:office:office" xmlns:oel="http://schemas.microsoft.com/office/2019/extlst" xmlns:r="http://schemas.openxmlformats.org/officeDocument/2006/relationships" xmlns:m="http://schemas.openxmlformats.org/officeDocument/2006/math" xmlns:v="urn:schemas-microsoft-com:vml" xmlns:wp14="http://schemas.microsoft.com/office/word/2010/wordprocessingDrawing" xmlns:wp="http://schemas.openxmlformats.org/drawingml/2006/wordprocessingDrawing" xmlns:w10="urn:schemas-microsoft-com:office:word" xmlns:w="http://schemas.openxmlformats.org/wordprocessingml/2006/main" xmlns:w14="http://schemas.microsoft.com/office/word/2010/wordml" xmlns:w15="http://schemas.microsoft.com/office/word/2012/wordml" xmlns:w16cex="http://schemas.microsoft.com/office/word/2018/wordml/cex" xmlns:w16cid="http://schemas.microsoft.com/office/word/2016/wordml/cid" xmlns:w16="http://schemas.microsoft.com/office/word/2018/wordml" xmlns:w16du="http://schemas.microsoft.com/office/word/2023/wordml/word16du" xmlns:w16sdtdh="http://schemas.microsoft.com/office/word/2020/wordml/sdtdatahash" xmlns:w16sdtfl="http://schemas.microsoft.com/office/word/2024/wordml/sdtformatlock" xmlns:w16se="http://schemas.microsoft.com/office/word/2015/wordml/symex" xmlns:wpg="http://schemas.microsoft.com/office/word/2010/wordprocessingGroup" xmlns:wpi="http://schemas.microsoft.com/office/word/2010/wordprocessingInk" xmlns:wne="http://schemas.microsoft.com/office/word/2006/wordml" xmlns:wps="http://schemas.microsoft.com/office/word/2010/wordprocessingShape" mc:Ignorable="w14 w15 w16se w16cid w16 w16cex w16sdtdh w16sdtfl w16du wp14">
+  <w:endnote w:type="separator" w:id="-1">
+    <w:p>
+      <w:pPr>
+        <w:spacing w:after="0" w:line="240" w:lineRule="auto"/>
+      </w:pPr>
+      <w:r>
+        <w:separator/>
+      </w:r>
+    </w:p>
+  </w:endnote>
+  <w:endnote w:type="continuationSeparator" w:id="0">
+    <w:p>
+      <w:pPr>
+        <w:spacing w:after="0" w:line="240" w:lineRule="auto"/>
+      </w:pPr>
+      <w:r>
+        <w:continuationSeparator/>
+      </w:r>
+    </w:p>
+  </w:endnote>
+</w:endnotes>
+</file>
+
+<file path=word/footnotes.xml><?xml version="1.0" encoding="utf-8"?>
+<w:footnotes xmlns:wpc="http://schemas.microsoft.com/office/word/2010/wordprocessingCanvas" xmlns:cx="http://schemas.microsoft.com/office/drawing/2014/chartex" xmlns:cx1="http://schemas.microsoft.com/office/drawing/2015/9/8/chartex" xmlns:cx2="http://schemas.microsoft.com/office/drawing/2015/10/21/chartex" xmlns:cx3="http://schemas.microsoft.com/office/drawing/2016/5/9/chartex" xmlns:cx4="http://schemas.microsoft.com/office/drawing/2016/5/10/chartex" xmlns:cx5="http://schemas.microsoft.com/office/drawing/2016/5/11/chartex" xmlns:cx6="http://schemas.microsoft.com/office/drawing/2016/5/12/chartex" xmlns:cx7="http://schemas.microsoft.com/office/drawing/2016/5/13/chartex" xmlns:cx8="http://schemas.microsoft.com/office/drawing/2016/5/14/chartex" xmlns:mc="http://schemas.openxmlformats.org/markup-compatibility/2006" xmlns:aink="http://schemas.microsoft.com/office/drawing/2016/ink" xmlns:am3d="http://schemas.microsoft.com/office/drawing/2017/model3d" xmlns:o="urn:schemas-microsoft-com:office:office" xmlns:oel="http://schemas.microsoft.com/office/2019/extlst" xmlns:r="http://schemas.openxmlformats.org/officeDocument/2006/relationships" xmlns:m="http://schemas.openxmlformats.org/officeDocument/2006/math" xmlns:v="urn:schemas-microsoft-com:vml" xmlns:wp14="http://schemas.microsoft.com/office/word/2010/wordprocessingDrawing" xmlns:wp="http://schemas.openxmlformats.org/drawingml/2006/wordprocessingDrawing" xmlns:w10="urn:schemas-microsoft-com:office:word" xmlns:w="http://schemas.openxmlformats.org/wordprocessingml/2006/main" xmlns:w14="http://schemas.microsoft.com/office/word/2010/wordml" xmlns:w15="http://schemas.microsoft.com/office/word/2012/wordml" xmlns:w16cex="http://schemas.microsoft.com/office/word/2018/wordml/cex" xmlns:w16cid="http://schemas.microsoft.com/office/word/2016/wordml/cid" xmlns:w16="http://schemas.microsoft.com/office/word/2018/wordml" xmlns:w16du="http://schemas.microsoft.com/office/word/2023/wordml/word16du" xmlns:w16sdtdh="http://schemas.microsoft.com/office/word/2020/wordml/sdtdatahash" xmlns:w16sdtfl="http://schemas.microsoft.com/office/word/2024/wordml/sdtformatlock" xmlns:w16se="http://schemas.microsoft.com/office/word/2015/wordml/symex" xmlns:wpg="http://schemas.microsoft.com/office/word/2010/wordprocessingGroup" xmlns:wpi="http://schemas.microsoft.com/office/word/2010/wordprocessingInk" xmlns:wne="http://schemas.microsoft.com/office/word/2006/wordml" xmlns:wps="http://schemas.microsoft.com/office/word/2010/wordprocessingShape" mc:Ignorable="w14 w15 w16se w16cid w16 w16cex w16sdtdh w16sdtfl w16du wp14">
+  <w:footnote w:type="separator" w:id="-1">
+    <w:p>
+      <w:pPr>
+        <w:spacing w:after="0" w:line="240" w:lineRule="auto"/>
+      </w:pPr>
+      <w:r>
+        <w:separator/>
+      </w:r>
+    </w:p>
+  </w:footnote>
+  <w:footnote w:type="continuationSeparator" w:id="0">
+    <w:p>
+      <w:pPr>
+        <w:spacing w:after="0" w:line="240" w:lineRule="auto"/>
+      </w:pPr>
+      <w:r>
+        <w:continuationSeparator/>
+      </w:r>
+    </w:p>
+  </w:footnote>
+</w:footnotes>
+</file>
+
 <file path=word/numbering.xml><?xml version="1.0" encoding="utf-8"?>
 <w:numbering xmlns:wpc="http://schemas.microsoft.com/office/word/2010/wordprocessingCanvas" xmlns:cx="http://schemas.microsoft.com/office/drawing/2014/chartex" xmlns:cx1="http://schemas.microsoft.com/office/drawing/2015/9/8/chartex" xmlns:cx2="http://schemas.microsoft.com/office/drawing/2015/10/21/chartex" xmlns:cx3="http://schemas.microsoft.com/office/drawing/2016/5/9/chartex" xmlns:cx4="http://schemas.microsoft.com/office/drawing/2016/5/10/chartex" xmlns:cx5="http://schemas.microsoft.com/office/drawing/2016/5/11/chartex" xmlns:cx6="http://schemas.microsoft.com/office/drawing/2016/5/12/chartex" xmlns:cx7="http://schemas.microsoft.com/office/drawing/2016/5/13/chartex" xmlns:cx8="http://schemas.microsoft.com/office/drawing/2016/5/14/chartex" xmlns:mc="http://schemas.openxmlformats.org/markup-compatibility/2006" xmlns:aink="http://schemas.microsoft.com/office/drawing/2016/ink" xmlns:am3d="http://schemas.microsoft.com/office/drawing/2017/model3d" xmlns:o="urn:schemas-microsoft-com:office:office" xmlns:oel="http://schemas.microsoft.com/office/2019/extlst" xmlns:r="http://schemas.openxmlformats.org/officeDocument/2006/relationships" xmlns:m="http://schemas.openxmlformats.org/officeDocument/2006/math" xmlns:v="urn:schemas-microsoft-com:vml" xmlns:wp14="http://schemas.microsoft.com/office/word/2010/wordprocessingDrawing" xmlns:wp="http://schemas.openxmlformats.org/drawingml/2006/wordprocessingDrawing" xmlns:w10="urn:schemas-microsoft-com:office:word" xmlns:w="http://schemas.openxmlformats.org/wordprocessingml/2006/main" xmlns:w14="http://schemas.microsoft.com/office/word/2010/wordml" xmlns:w15="http://schemas.microsoft.com/office/word/2012/wordml" xmlns:w16cex="http://schemas.microsoft.com/office/word/2018/wordml/cex" xmlns:w16cid="http://schemas.microsoft.com/office/word/2016/wordml/cid" xmlns:w16="http://schemas.microsoft.com/office/word/2018/wordml" xmlns:w16du="http://schemas.microsoft.com/office/word/2023/wordml/word16du" xmlns:w16sdtdh="http://schemas.microsoft.com/office/word/2020/wordml/sdtdatahash" xmlns:w16sdtfl="http://schemas.microsoft.com/office/word/2024/wordml/sdtformatlock" xmlns:w16se="http://schemas.microsoft.com/office/word/2015/wordml/symex" xmlns:wpg="http://schemas.microsoft.com/office/word/2010/wordprocessingGroup" xmlns:wpi="http://schemas.microsoft.com/office/word/2010/wordprocessingInk" xmlns:wne="http://schemas.microsoft.com/office/word/2006/wordml" xmlns:wps="http://schemas.microsoft.com/office/word/2010/wordprocessingShape" mc:Ignorable="w14 w15 w16se w16cid w16 w16cex w16sdtdh w16sdtfl w16du wp14">
   <w:abstractNum w:abstractNumId="0" w15:restartNumberingAfterBreak="0">
@@ -11366,6 +11457,119 @@
     </w:lvl>
   </w:abstractNum>
   <w:abstractNum w:abstractNumId="20" w15:restartNumberingAfterBreak="0">
+    <w:nsid w:val="518805ED"/>
+    <w:multiLevelType w:val="hybridMultilevel"/>
+    <w:tmpl w:val="F1E46B5C"/>
+    <w:lvl w:ilvl="0" w:tplc="04090001">
+      <w:start w:val="1"/>
+      <w:numFmt w:val="bullet"/>
+      <w:lvlText w:val=""/>
+      <w:lvlJc w:val="left"/>
+      <w:pPr>
+        <w:ind w:left="720" w:hanging="360"/>
+      </w:pPr>
+      <w:rPr>
+        <w:rFonts w:ascii="Symbol" w:hAnsi="Symbol" w:hint="default"/>
+      </w:rPr>
+    </w:lvl>
+    <w:lvl w:ilvl="1" w:tplc="04090003" w:tentative="1">
+      <w:start w:val="1"/>
+      <w:numFmt w:val="bullet"/>
+      <w:lvlText w:val="o"/>
+      <w:lvlJc w:val="left"/>
+      <w:pPr>
+        <w:ind w:left="1440" w:hanging="360"/>
+      </w:pPr>
+      <w:rPr>
+        <w:rFonts w:ascii="Courier New" w:hAnsi="Courier New" w:cs="Courier New" w:hint="default"/>
+      </w:rPr>
+    </w:lvl>
+    <w:lvl w:ilvl="2" w:tplc="04090005" w:tentative="1">
+      <w:start w:val="1"/>
+      <w:numFmt w:val="bullet"/>
+      <w:lvlText w:val=""/>
+      <w:lvlJc w:val="left"/>
+      <w:pPr>
+        <w:ind w:left="2160" w:hanging="360"/>
+      </w:pPr>
+      <w:rPr>
+        <w:rFonts w:ascii="Wingdings" w:hAnsi="Wingdings" w:hint="default"/>
+      </w:rPr>
+    </w:lvl>
+    <w:lvl w:ilvl="3" w:tplc="04090001" w:tentative="1">
+      <w:start w:val="1"/>
+      <w:numFmt w:val="bullet"/>
+      <w:lvlText w:val=""/>
+      <w:lvlJc w:val="left"/>
+      <w:pPr>
+        <w:ind w:left="2880" w:hanging="360"/>
+      </w:pPr>
+      <w:rPr>
+        <w:rFonts w:ascii="Symbol" w:hAnsi="Symbol" w:hint="default"/>
+      </w:rPr>
+    </w:lvl>
+    <w:lvl w:ilvl="4" w:tplc="04090003" w:tentative="1">
+      <w:start w:val="1"/>
+      <w:numFmt w:val="bullet"/>
+      <w:lvlText w:val="o"/>
+      <w:lvlJc w:val="left"/>
+      <w:pPr>
+        <w:ind w:left="3600" w:hanging="360"/>
+      </w:pPr>
+      <w:rPr>
+        <w:rFonts w:ascii="Courier New" w:hAnsi="Courier New" w:cs="Courier New" w:hint="default"/>
+      </w:rPr>
+    </w:lvl>
+    <w:lvl w:ilvl="5" w:tplc="04090005" w:tentative="1">
+      <w:start w:val="1"/>
+      <w:numFmt w:val="bullet"/>
+      <w:lvlText w:val=""/>
+      <w:lvlJc w:val="left"/>
+      <w:pPr>
+        <w:ind w:left="4320" w:hanging="360"/>
+      </w:pPr>
+      <w:rPr>
+        <w:rFonts w:ascii="Wingdings" w:hAnsi="Wingdings" w:hint="default"/>
+      </w:rPr>
+    </w:lvl>
+    <w:lvl w:ilvl="6" w:tplc="04090001" w:tentative="1">
+      <w:start w:val="1"/>
+      <w:numFmt w:val="bullet"/>
+      <w:lvlText w:val=""/>
+      <w:lvlJc w:val="left"/>
+      <w:pPr>
+        <w:ind w:left="5040" w:hanging="360"/>
+      </w:pPr>
+      <w:rPr>
+        <w:rFonts w:ascii="Symbol" w:hAnsi="Symbol" w:hint="default"/>
+      </w:rPr>
+    </w:lvl>
+    <w:lvl w:ilvl="7" w:tplc="04090003" w:tentative="1">
+      <w:start w:val="1"/>
+      <w:numFmt w:val="bullet"/>
+      <w:lvlText w:val="o"/>
+      <w:lvlJc w:val="left"/>
+      <w:pPr>
+        <w:ind w:left="5760" w:hanging="360"/>
+      </w:pPr>
+      <w:rPr>
+        <w:rFonts w:ascii="Courier New" w:hAnsi="Courier New" w:cs="Courier New" w:hint="default"/>
+      </w:rPr>
+    </w:lvl>
+    <w:lvl w:ilvl="8" w:tplc="04090005" w:tentative="1">
+      <w:start w:val="1"/>
+      <w:numFmt w:val="bullet"/>
+      <w:lvlText w:val=""/>
+      <w:lvlJc w:val="left"/>
+      <w:pPr>
+        <w:ind w:left="6480" w:hanging="360"/>
+      </w:pPr>
+      <w:rPr>
+        <w:rFonts w:ascii="Wingdings" w:hAnsi="Wingdings" w:hint="default"/>
+      </w:rPr>
+    </w:lvl>
+  </w:abstractNum>
+  <w:abstractNum w:abstractNumId="21" w15:restartNumberingAfterBreak="0">
     <w:nsid w:val="561074E4"/>
     <w:multiLevelType w:val="hybridMultilevel"/>
     <w:tmpl w:val="4C4C890E"/>
@@ -11454,7 +11658,7 @@
       </w:pPr>
     </w:lvl>
   </w:abstractNum>
-  <w:abstractNum w:abstractNumId="21" w15:restartNumberingAfterBreak="0">
+  <w:abstractNum w:abstractNumId="22" w15:restartNumberingAfterBreak="0">
     <w:nsid w:val="572A226F"/>
     <w:multiLevelType w:val="multilevel"/>
     <w:tmpl w:val="81FC1D9E"/>
@@ -11567,7 +11771,7 @@
       </w:pPr>
     </w:lvl>
   </w:abstractNum>
-  <w:abstractNum w:abstractNumId="22" w15:restartNumberingAfterBreak="0">
+  <w:abstractNum w:abstractNumId="23" w15:restartNumberingAfterBreak="0">
     <w:nsid w:val="5BF5117B"/>
     <w:multiLevelType w:val="multilevel"/>
     <w:tmpl w:val="8A1481F6"/>
@@ -11680,7 +11884,7 @@
       </w:pPr>
     </w:lvl>
   </w:abstractNum>
-  <w:abstractNum w:abstractNumId="23" w15:restartNumberingAfterBreak="0">
+  <w:abstractNum w:abstractNumId="24" w15:restartNumberingAfterBreak="0">
     <w:nsid w:val="5D3E6FA0"/>
     <w:multiLevelType w:val="multilevel"/>
     <w:tmpl w:val="1DD496E8"/>
@@ -11793,7 +11997,7 @@
       </w:pPr>
     </w:lvl>
   </w:abstractNum>
-  <w:abstractNum w:abstractNumId="24" w15:restartNumberingAfterBreak="0">
+  <w:abstractNum w:abstractNumId="25" w15:restartNumberingAfterBreak="0">
     <w:nsid w:val="5F935511"/>
     <w:multiLevelType w:val="multilevel"/>
     <w:tmpl w:val="44AE5600"/>
@@ -11906,7 +12110,7 @@
       </w:pPr>
     </w:lvl>
   </w:abstractNum>
-  <w:abstractNum w:abstractNumId="25" w15:restartNumberingAfterBreak="0">
+  <w:abstractNum w:abstractNumId="26" w15:restartNumberingAfterBreak="0">
     <w:nsid w:val="62330FFA"/>
     <w:multiLevelType w:val="multilevel"/>
     <w:tmpl w:val="1354050A"/>
@@ -12019,7 +12223,7 @@
       </w:pPr>
     </w:lvl>
   </w:abstractNum>
-  <w:abstractNum w:abstractNumId="26" w15:restartNumberingAfterBreak="0">
+  <w:abstractNum w:abstractNumId="27" w15:restartNumberingAfterBreak="0">
     <w:nsid w:val="653571BB"/>
     <w:multiLevelType w:val="multilevel"/>
     <w:tmpl w:val="E0F0DCF4"/>
@@ -12132,7 +12336,7 @@
       </w:pPr>
     </w:lvl>
   </w:abstractNum>
-  <w:abstractNum w:abstractNumId="27" w15:restartNumberingAfterBreak="0">
+  <w:abstractNum w:abstractNumId="28" w15:restartNumberingAfterBreak="0">
     <w:nsid w:val="69731E7F"/>
     <w:multiLevelType w:val="multilevel"/>
     <w:tmpl w:val="4FEA352E"/>
@@ -12281,7 +12485,7 @@
       </w:rPr>
     </w:lvl>
   </w:abstractNum>
-  <w:abstractNum w:abstractNumId="28" w15:restartNumberingAfterBreak="0">
+  <w:abstractNum w:abstractNumId="29" w15:restartNumberingAfterBreak="0">
     <w:nsid w:val="6DE2596E"/>
     <w:multiLevelType w:val="hybridMultilevel"/>
     <w:tmpl w:val="0D9C62AE"/>
@@ -12370,7 +12574,7 @@
       </w:pPr>
     </w:lvl>
   </w:abstractNum>
-  <w:abstractNum w:abstractNumId="29" w15:restartNumberingAfterBreak="0">
+  <w:abstractNum w:abstractNumId="30" w15:restartNumberingAfterBreak="0">
     <w:nsid w:val="75520C24"/>
     <w:multiLevelType w:val="hybridMultilevel"/>
     <w:tmpl w:val="FCCE1BF6"/>
@@ -12459,7 +12663,7 @@
       </w:pPr>
     </w:lvl>
   </w:abstractNum>
-  <w:abstractNum w:abstractNumId="30" w15:restartNumberingAfterBreak="0">
+  <w:abstractNum w:abstractNumId="31" w15:restartNumberingAfterBreak="0">
     <w:nsid w:val="76FC0259"/>
     <w:multiLevelType w:val="multilevel"/>
     <w:tmpl w:val="79680AA4"/>
@@ -12572,7 +12776,7 @@
       </w:pPr>
     </w:lvl>
   </w:abstractNum>
-  <w:abstractNum w:abstractNumId="31" w15:restartNumberingAfterBreak="0">
+  <w:abstractNum w:abstractNumId="32" w15:restartNumberingAfterBreak="0">
     <w:nsid w:val="77A70C23"/>
     <w:multiLevelType w:val="multilevel"/>
     <w:tmpl w:val="8E221C46"/>
@@ -12692,19 +12896,19 @@
     <w:abstractNumId w:val="8"/>
   </w:num>
   <w:num w:numId="3" w16cid:durableId="1561554637">
-    <w:abstractNumId w:val="21"/>
+    <w:abstractNumId w:val="22"/>
   </w:num>
   <w:num w:numId="4" w16cid:durableId="1987002333">
-    <w:abstractNumId w:val="31"/>
+    <w:abstractNumId w:val="32"/>
   </w:num>
   <w:num w:numId="5" w16cid:durableId="1029794338">
     <w:abstractNumId w:val="15"/>
   </w:num>
   <w:num w:numId="6" w16cid:durableId="1650086756">
-    <w:abstractNumId w:val="23"/>
+    <w:abstractNumId w:val="24"/>
   </w:num>
   <w:num w:numId="7" w16cid:durableId="1476222975">
-    <w:abstractNumId w:val="30"/>
+    <w:abstractNumId w:val="31"/>
   </w:num>
   <w:num w:numId="8" w16cid:durableId="1533764241">
     <w:abstractNumId w:val="3"/>
@@ -12716,16 +12920,16 @@
     <w:abstractNumId w:val="4"/>
   </w:num>
   <w:num w:numId="11" w16cid:durableId="793057457">
-    <w:abstractNumId w:val="22"/>
+    <w:abstractNumId w:val="23"/>
   </w:num>
   <w:num w:numId="12" w16cid:durableId="2146773725">
-    <w:abstractNumId w:val="26"/>
+    <w:abstractNumId w:val="27"/>
   </w:num>
   <w:num w:numId="13" w16cid:durableId="1026561013">
     <w:abstractNumId w:val="11"/>
   </w:num>
   <w:num w:numId="14" w16cid:durableId="1192110950">
-    <w:abstractNumId w:val="24"/>
+    <w:abstractNumId w:val="25"/>
   </w:num>
   <w:num w:numId="15" w16cid:durableId="1262841238">
     <w:abstractNumId w:val="10"/>
@@ -12737,19 +12941,19 @@
     <w:abstractNumId w:val="16"/>
   </w:num>
   <w:num w:numId="18" w16cid:durableId="1409767320">
-    <w:abstractNumId w:val="27"/>
+    <w:abstractNumId w:val="28"/>
   </w:num>
   <w:num w:numId="19" w16cid:durableId="2045591211">
     <w:abstractNumId w:val="12"/>
   </w:num>
   <w:num w:numId="20" w16cid:durableId="1764063768">
-    <w:abstractNumId w:val="25"/>
+    <w:abstractNumId w:val="26"/>
   </w:num>
   <w:num w:numId="21" w16cid:durableId="218832961">
     <w:abstractNumId w:val="14"/>
   </w:num>
   <w:num w:numId="22" w16cid:durableId="2045669289">
-    <w:abstractNumId w:val="29"/>
+    <w:abstractNumId w:val="30"/>
   </w:num>
   <w:num w:numId="23" w16cid:durableId="953443745">
     <w:abstractNumId w:val="7"/>
@@ -12761,13 +12965,13 @@
     <w:abstractNumId w:val="2"/>
   </w:num>
   <w:num w:numId="26" w16cid:durableId="1365129283">
-    <w:abstractNumId w:val="28"/>
+    <w:abstractNumId w:val="29"/>
   </w:num>
   <w:num w:numId="27" w16cid:durableId="1202403600">
     <w:abstractNumId w:val="13"/>
   </w:num>
   <w:num w:numId="28" w16cid:durableId="282420373">
-    <w:abstractNumId w:val="20"/>
+    <w:abstractNumId w:val="21"/>
   </w:num>
   <w:num w:numId="29" w16cid:durableId="101195959">
     <w:abstractNumId w:val="17"/>
@@ -12780,6 +12984,9 @@
   </w:num>
   <w:num w:numId="32" w16cid:durableId="197356490">
     <w:abstractNumId w:val="1"/>
+  </w:num>
+  <w:num w:numId="33" w16cid:durableId="1872569341">
+    <w:abstractNumId w:val="20"/>
   </w:num>
 </w:numbering>
 </file>
@@ -13391,7 +13598,6 @@
   <w:style w:type="character" w:default="1" w:styleId="DefaultParagraphFont">
     <w:name w:val="Default Paragraph Font"/>
     <w:uiPriority w:val="1"/>
-    <w:semiHidden/>
     <w:unhideWhenUsed/>
   </w:style>
   <w:style w:type="table" w:default="1" w:styleId="TableNormal">
@@ -13737,6 +13943,56 @@
       </w:tblBorders>
     </w:tblPr>
   </w:style>
+  <w:style w:type="paragraph" w:styleId="Header">
+    <w:name w:val="header"/>
+    <w:basedOn w:val="Normal"/>
+    <w:link w:val="HeaderChar"/>
+    <w:uiPriority w:val="99"/>
+    <w:unhideWhenUsed/>
+    <w:rsid w:val="00997DD5"/>
+    <w:pPr>
+      <w:tabs>
+        <w:tab w:val="center" w:pos="4680"/>
+        <w:tab w:val="right" w:pos="9360"/>
+      </w:tabs>
+      <w:spacing w:after="0" w:line="240" w:lineRule="auto"/>
+    </w:pPr>
+  </w:style>
+  <w:style w:type="character" w:customStyle="1" w:styleId="HeaderChar">
+    <w:name w:val="Header Char"/>
+    <w:basedOn w:val="DefaultParagraphFont"/>
+    <w:link w:val="Header"/>
+    <w:uiPriority w:val="99"/>
+    <w:rsid w:val="00997DD5"/>
+    <w:rPr>
+      <w:lang w:val="en-CA"/>
+    </w:rPr>
+  </w:style>
+  <w:style w:type="paragraph" w:styleId="Footer">
+    <w:name w:val="footer"/>
+    <w:basedOn w:val="Normal"/>
+    <w:link w:val="FooterChar"/>
+    <w:uiPriority w:val="99"/>
+    <w:unhideWhenUsed/>
+    <w:rsid w:val="00997DD5"/>
+    <w:pPr>
+      <w:tabs>
+        <w:tab w:val="center" w:pos="4680"/>
+        <w:tab w:val="right" w:pos="9360"/>
+      </w:tabs>
+      <w:spacing w:after="0" w:line="240" w:lineRule="auto"/>
+    </w:pPr>
+  </w:style>
+  <w:style w:type="character" w:customStyle="1" w:styleId="FooterChar">
+    <w:name w:val="Footer Char"/>
+    <w:basedOn w:val="DefaultParagraphFont"/>
+    <w:link w:val="Footer"/>
+    <w:uiPriority w:val="99"/>
+    <w:rsid w:val="00997DD5"/>
+    <w:rPr>
+      <w:lang w:val="en-CA"/>
+    </w:rPr>
+  </w:style>
 </w:styles>
 </file>
 

</xml_diff>

<commit_message>
Swapped item 1.1 with 1.2
</commit_message>
<xml_diff>
--- a/res/template_medium.docx
+++ b/res/template_medium.docx
@@ -87,11 +87,26 @@
               <w:rPr>
                 <w:rFonts w:hint="eastAsia"/>
               </w:rPr>
-              <w:t xml:space="preserve">Ticket number: {{ </w:t>
+              <w:t xml:space="preserve">Ticket number: </w:t>
+            </w:r>
+            <w:proofErr w:type="gramStart"/>
+            <w:r>
+              <w:rPr>
+                <w:rFonts w:hint="eastAsia"/>
+              </w:rPr>
+              <w:t xml:space="preserve">{{ </w:t>
             </w:r>
             <w:proofErr w:type="spellStart"/>
             <w:r>
-              <w:t>project_info</w:t>
+              <w:t>project</w:t>
+            </w:r>
+            <w:proofErr w:type="gramEnd"/>
+            <w:r>
+              <w:t>_</w:t>
+            </w:r>
+            <w:proofErr w:type="gramStart"/>
+            <w:r>
+              <w:t>info</w:t>
             </w:r>
             <w:r>
               <w:rPr>
@@ -100,209 +115,384 @@
               <w:t>.</w:t>
             </w:r>
             <w:r>
-              <w:t>ticket_number</w:t>
+              <w:t>ticket</w:t>
+            </w:r>
+            <w:proofErr w:type="gramEnd"/>
+            <w:r>
+              <w:t>_</w:t>
+            </w:r>
+            <w:proofErr w:type="gramStart"/>
+            <w:r>
+              <w:t>number</w:t>
             </w:r>
             <w:proofErr w:type="spellEnd"/>
             <w:r>
               <w:rPr>
                 <w:rFonts w:hint="eastAsia"/>
               </w:rPr>
+              <w:t xml:space="preserve"> }</w:t>
+            </w:r>
+            <w:proofErr w:type="gramEnd"/>
+            <w:r>
+              <w:rPr>
+                <w:rFonts w:hint="eastAsia"/>
+              </w:rPr>
+              <w:t>}</w:t>
+            </w:r>
+          </w:p>
+          <w:p>
+            <w:pPr>
+              <w:spacing w:line="480" w:lineRule="auto"/>
+            </w:pPr>
+            <w:r>
+              <w:t xml:space="preserve">Curator </w:t>
+            </w:r>
+            <w:r>
+              <w:rPr>
+                <w:rFonts w:hint="eastAsia"/>
+              </w:rPr>
+              <w:t>name</w:t>
+            </w:r>
+            <w:r>
+              <w:t>:</w:t>
+            </w:r>
+            <w:r>
+              <w:rPr>
+                <w:rFonts w:hint="eastAsia"/>
+              </w:rPr>
+              <w:t xml:space="preserve"> </w:t>
+            </w:r>
+            <w:proofErr w:type="gramStart"/>
+            <w:r>
+              <w:rPr>
+                <w:rFonts w:hint="eastAsia"/>
+              </w:rPr>
+              <w:t xml:space="preserve">{{ </w:t>
+            </w:r>
+            <w:proofErr w:type="spellStart"/>
+            <w:r>
+              <w:t>project</w:t>
+            </w:r>
+            <w:proofErr w:type="gramEnd"/>
+            <w:r>
+              <w:t>_</w:t>
+            </w:r>
+            <w:proofErr w:type="gramStart"/>
+            <w:r>
+              <w:t>info</w:t>
+            </w:r>
+            <w:r>
+              <w:rPr>
+                <w:rFonts w:hint="eastAsia"/>
+              </w:rPr>
+              <w:t>.curator</w:t>
+            </w:r>
+            <w:proofErr w:type="gramEnd"/>
+            <w:r>
+              <w:rPr>
+                <w:rFonts w:hint="eastAsia"/>
+              </w:rPr>
+              <w:t>_</w:t>
+            </w:r>
+            <w:proofErr w:type="gramStart"/>
+            <w:r>
+              <w:rPr>
+                <w:rFonts w:hint="eastAsia"/>
+              </w:rPr>
+              <w:t>name</w:t>
+            </w:r>
+            <w:proofErr w:type="spellEnd"/>
+            <w:r>
+              <w:rPr>
+                <w:rFonts w:hint="eastAsia"/>
+              </w:rPr>
+              <w:t xml:space="preserve"> }</w:t>
+            </w:r>
+            <w:proofErr w:type="gramEnd"/>
+            <w:r>
+              <w:rPr>
+                <w:rFonts w:hint="eastAsia"/>
+              </w:rPr>
+              <w:t>}</w:t>
+            </w:r>
+          </w:p>
+          <w:p>
+            <w:pPr>
+              <w:spacing w:line="480" w:lineRule="auto"/>
+            </w:pPr>
+            <w:r>
+              <w:rPr>
+                <w:rFonts w:hint="eastAsia"/>
+              </w:rPr>
+              <w:t xml:space="preserve">Curator email: </w:t>
+            </w:r>
+            <w:proofErr w:type="gramStart"/>
+            <w:r>
+              <w:rPr>
+                <w:rFonts w:hint="eastAsia"/>
+              </w:rPr>
+              <w:t xml:space="preserve">{{ </w:t>
+            </w:r>
+            <w:proofErr w:type="spellStart"/>
+            <w:r>
+              <w:t>project</w:t>
+            </w:r>
+            <w:proofErr w:type="gramEnd"/>
+            <w:r>
+              <w:t>_</w:t>
+            </w:r>
+            <w:proofErr w:type="gramStart"/>
+            <w:r>
+              <w:t>info</w:t>
+            </w:r>
+            <w:r>
+              <w:rPr>
+                <w:rFonts w:hint="eastAsia"/>
+              </w:rPr>
+              <w:t>.</w:t>
+            </w:r>
+            <w:r>
+              <w:t>curator</w:t>
+            </w:r>
+            <w:proofErr w:type="gramEnd"/>
+            <w:r>
+              <w:t>_</w:t>
+            </w:r>
+            <w:proofErr w:type="gramStart"/>
+            <w:r>
+              <w:t>email</w:t>
+            </w:r>
+            <w:proofErr w:type="spellEnd"/>
+            <w:r>
+              <w:rPr>
+                <w:rFonts w:hint="eastAsia"/>
+              </w:rPr>
+              <w:t xml:space="preserve"> }</w:t>
+            </w:r>
+            <w:proofErr w:type="gramEnd"/>
+            <w:r>
+              <w:rPr>
+                <w:rFonts w:hint="eastAsia"/>
+              </w:rPr>
+              <w:t>}</w:t>
+            </w:r>
+          </w:p>
+          <w:p>
+            <w:pPr>
+              <w:spacing w:line="480" w:lineRule="auto"/>
+            </w:pPr>
+            <w:r>
+              <w:rPr>
+                <w:rFonts w:hint="eastAsia"/>
+              </w:rPr>
+              <w:t xml:space="preserve">Dataset title: </w:t>
+            </w:r>
+            <w:proofErr w:type="gramStart"/>
+            <w:r>
+              <w:rPr>
+                <w:rFonts w:hint="eastAsia"/>
+              </w:rPr>
+              <w:t xml:space="preserve">{{ </w:t>
+            </w:r>
+            <w:proofErr w:type="spellStart"/>
+            <w:r>
+              <w:rPr>
+                <w:rFonts w:hint="eastAsia"/>
+              </w:rPr>
+              <w:t>dataset</w:t>
+            </w:r>
+            <w:proofErr w:type="gramEnd"/>
+            <w:r>
+              <w:rPr>
+                <w:rFonts w:hint="eastAsia"/>
+              </w:rPr>
+              <w:t>.</w:t>
+            </w:r>
+            <w:proofErr w:type="gramStart"/>
+            <w:r>
+              <w:t>DatasetTitle</w:t>
+            </w:r>
+            <w:proofErr w:type="spellEnd"/>
+            <w:r>
+              <w:rPr>
+                <w:rFonts w:hint="eastAsia"/>
+              </w:rPr>
+              <w:t xml:space="preserve"> }</w:t>
+            </w:r>
+            <w:proofErr w:type="gramEnd"/>
+            <w:r>
+              <w:rPr>
+                <w:rFonts w:hint="eastAsia"/>
+              </w:rPr>
+              <w:t>}</w:t>
+            </w:r>
+          </w:p>
+          <w:p>
+            <w:pPr>
+              <w:spacing w:line="480" w:lineRule="auto"/>
+            </w:pPr>
+            <w:r>
+              <w:rPr>
+                <w:rFonts w:hint="eastAsia"/>
+              </w:rPr>
+              <w:t xml:space="preserve">Dataset </w:t>
+            </w:r>
+            <w:r>
+              <w:t>persistent</w:t>
+            </w:r>
+            <w:r>
+              <w:rPr>
+                <w:rFonts w:hint="eastAsia"/>
+              </w:rPr>
+              <w:t xml:space="preserve"> identifier: </w:t>
+            </w:r>
+            <w:proofErr w:type="gramStart"/>
+            <w:r>
+              <w:rPr>
+                <w:rFonts w:hint="eastAsia"/>
+              </w:rPr>
+              <w:t xml:space="preserve">{{ </w:t>
+            </w:r>
+            <w:proofErr w:type="spellStart"/>
+            <w:r>
+              <w:rPr>
+                <w:rFonts w:hint="eastAsia"/>
+              </w:rPr>
+              <w:t>dataset</w:t>
+            </w:r>
+            <w:proofErr w:type="gramEnd"/>
+            <w:r>
+              <w:rPr>
+                <w:rFonts w:hint="eastAsia"/>
+              </w:rPr>
+              <w:t>.</w:t>
+            </w:r>
+            <w:proofErr w:type="gramStart"/>
+            <w:r>
+              <w:t>DatasetPersistentId</w:t>
+            </w:r>
+            <w:proofErr w:type="spellEnd"/>
+            <w:r>
+              <w:rPr>
+                <w:rFonts w:hint="eastAsia"/>
+              </w:rPr>
+              <w:t xml:space="preserve">  }</w:t>
+            </w:r>
+            <w:proofErr w:type="gramEnd"/>
+            <w:r>
+              <w:rPr>
+                <w:rFonts w:hint="eastAsia"/>
+              </w:rPr>
+              <w:t>}</w:t>
+            </w:r>
+          </w:p>
+          <w:p>
+            <w:pPr>
+              <w:spacing w:line="480" w:lineRule="auto"/>
+            </w:pPr>
+            <w:r>
+              <w:rPr>
+                <w:rFonts w:hint="eastAsia"/>
+              </w:rPr>
+              <w:t xml:space="preserve">Dataset ID (versioned): </w:t>
+            </w:r>
+            <w:proofErr w:type="gramStart"/>
+            <w:r>
+              <w:rPr>
+                <w:rFonts w:hint="eastAsia"/>
+              </w:rPr>
+              <w:t>{{ dataset.ID  }</w:t>
+            </w:r>
+            <w:proofErr w:type="gramEnd"/>
+            <w:r>
+              <w:rPr>
+                <w:rFonts w:hint="eastAsia"/>
+              </w:rPr>
+              <w:t>}</w:t>
+            </w:r>
+          </w:p>
+          <w:p>
+            <w:pPr>
+              <w:spacing w:line="480" w:lineRule="auto"/>
+            </w:pPr>
+            <w:r>
+              <w:rPr>
+                <w:rFonts w:hint="eastAsia"/>
+              </w:rPr>
+              <w:t xml:space="preserve">Dataset access URL: </w:t>
+            </w:r>
+            <w:proofErr w:type="gramStart"/>
+            <w:r>
+              <w:rPr>
+                <w:rFonts w:hint="eastAsia"/>
+              </w:rPr>
+              <w:t xml:space="preserve">{{ </w:t>
+            </w:r>
+            <w:proofErr w:type="spellStart"/>
+            <w:r>
+              <w:rPr>
+                <w:rFonts w:hint="eastAsia"/>
+              </w:rPr>
+              <w:t>dataset</w:t>
+            </w:r>
+            <w:proofErr w:type="gramEnd"/>
+            <w:r>
+              <w:rPr>
+                <w:rFonts w:hint="eastAsia"/>
+              </w:rPr>
+              <w:t>.</w:t>
+            </w:r>
+            <w:proofErr w:type="gramStart"/>
+            <w:r>
+              <w:t>DatasetURL</w:t>
+            </w:r>
+            <w:proofErr w:type="spellEnd"/>
+            <w:r>
+              <w:rPr>
+                <w:rFonts w:hint="eastAsia"/>
+              </w:rPr>
+              <w:t xml:space="preserve"> }</w:t>
+            </w:r>
+            <w:proofErr w:type="gramEnd"/>
+            <w:r>
+              <w:rPr>
+                <w:rFonts w:hint="eastAsia"/>
+              </w:rPr>
+              <w:t>}</w:t>
+            </w:r>
+          </w:p>
+          <w:p>
+            <w:pPr>
+              <w:spacing w:line="480" w:lineRule="auto"/>
+            </w:pPr>
+            <w:r>
+              <w:rPr>
+                <w:rFonts w:hint="eastAsia"/>
+              </w:rPr>
+              <w:t xml:space="preserve">Log </w:t>
+            </w:r>
+            <w:r>
+              <w:t>initial</w:t>
+            </w:r>
+            <w:r>
+              <w:rPr>
+                <w:rFonts w:hint="eastAsia"/>
+              </w:rPr>
+              <w:t xml:space="preserve"> generated date: </w:t>
+            </w:r>
+            <w:proofErr w:type="gramStart"/>
+            <w:r>
+              <w:rPr>
+                <w:rFonts w:hint="eastAsia"/>
+              </w:rPr>
+              <w:t>{{ timestamp</w:t>
+            </w:r>
+            <w:proofErr w:type="gramEnd"/>
+            <w:r>
+              <w:rPr>
+                <w:rFonts w:hint="eastAsia"/>
+              </w:rPr>
               <w:t xml:space="preserve"> }}</w:t>
-            </w:r>
-          </w:p>
-          <w:p>
-            <w:pPr>
-              <w:spacing w:line="480" w:lineRule="auto"/>
-            </w:pPr>
-            <w:r>
-              <w:t xml:space="preserve">Curator </w:t>
-            </w:r>
-            <w:r>
-              <w:rPr>
-                <w:rFonts w:hint="eastAsia"/>
-              </w:rPr>
-              <w:t>name</w:t>
-            </w:r>
-            <w:r>
-              <w:t>:</w:t>
-            </w:r>
-            <w:r>
-              <w:rPr>
-                <w:rFonts w:hint="eastAsia"/>
-              </w:rPr>
-              <w:t xml:space="preserve"> {{ </w:t>
-            </w:r>
-            <w:proofErr w:type="spellStart"/>
-            <w:r>
-              <w:t>project_info</w:t>
-            </w:r>
-            <w:r>
-              <w:rPr>
-                <w:rFonts w:hint="eastAsia"/>
-              </w:rPr>
-              <w:t>.curator_name</w:t>
-            </w:r>
-            <w:proofErr w:type="spellEnd"/>
-            <w:r>
-              <w:rPr>
-                <w:rFonts w:hint="eastAsia"/>
-              </w:rPr>
-              <w:t xml:space="preserve"> }}</w:t>
-            </w:r>
-          </w:p>
-          <w:p>
-            <w:pPr>
-              <w:spacing w:line="480" w:lineRule="auto"/>
-            </w:pPr>
-            <w:r>
-              <w:rPr>
-                <w:rFonts w:hint="eastAsia"/>
-              </w:rPr>
-              <w:t xml:space="preserve">Curator email: {{ </w:t>
-            </w:r>
-            <w:proofErr w:type="spellStart"/>
-            <w:r>
-              <w:t>project_info</w:t>
-            </w:r>
-            <w:r>
-              <w:rPr>
-                <w:rFonts w:hint="eastAsia"/>
-              </w:rPr>
-              <w:t>.</w:t>
-            </w:r>
-            <w:r>
-              <w:t>curator_email</w:t>
-            </w:r>
-            <w:proofErr w:type="spellEnd"/>
-            <w:r>
-              <w:rPr>
-                <w:rFonts w:hint="eastAsia"/>
-              </w:rPr>
-              <w:t xml:space="preserve"> }}</w:t>
-            </w:r>
-          </w:p>
-          <w:p>
-            <w:pPr>
-              <w:spacing w:line="480" w:lineRule="auto"/>
-            </w:pPr>
-            <w:r>
-              <w:rPr>
-                <w:rFonts w:hint="eastAsia"/>
-              </w:rPr>
-              <w:t xml:space="preserve">Dataset title: {{ </w:t>
-            </w:r>
-            <w:proofErr w:type="spellStart"/>
-            <w:r>
-              <w:rPr>
-                <w:rFonts w:hint="eastAsia"/>
-              </w:rPr>
-              <w:t>dataset.</w:t>
-            </w:r>
-            <w:r>
-              <w:t>DatasetTitle</w:t>
-            </w:r>
-            <w:proofErr w:type="spellEnd"/>
-            <w:r>
-              <w:rPr>
-                <w:rFonts w:hint="eastAsia"/>
-              </w:rPr>
-              <w:t xml:space="preserve"> }}</w:t>
-            </w:r>
-          </w:p>
-          <w:p>
-            <w:pPr>
-              <w:spacing w:line="480" w:lineRule="auto"/>
-            </w:pPr>
-            <w:r>
-              <w:rPr>
-                <w:rFonts w:hint="eastAsia"/>
-              </w:rPr>
-              <w:t xml:space="preserve">Dataset </w:t>
-            </w:r>
-            <w:r>
-              <w:t>persistent</w:t>
-            </w:r>
-            <w:r>
-              <w:rPr>
-                <w:rFonts w:hint="eastAsia"/>
-              </w:rPr>
-              <w:t xml:space="preserve"> identifier: {{ </w:t>
-            </w:r>
-            <w:proofErr w:type="spellStart"/>
-            <w:r>
-              <w:rPr>
-                <w:rFonts w:hint="eastAsia"/>
-              </w:rPr>
-              <w:t>dataset.</w:t>
-            </w:r>
-            <w:r>
-              <w:t>DatasetPersistentId</w:t>
-            </w:r>
-            <w:proofErr w:type="spellEnd"/>
-            <w:r>
-              <w:rPr>
-                <w:rFonts w:hint="eastAsia"/>
-              </w:rPr>
-              <w:t xml:space="preserve">  }}</w:t>
-            </w:r>
-          </w:p>
-          <w:p>
-            <w:pPr>
-              <w:spacing w:line="480" w:lineRule="auto"/>
-            </w:pPr>
-            <w:r>
-              <w:rPr>
-                <w:rFonts w:hint="eastAsia"/>
-              </w:rPr>
-              <w:t>Dataset ID (versioned): {{ dataset.ID  }}</w:t>
-            </w:r>
-          </w:p>
-          <w:p>
-            <w:pPr>
-              <w:spacing w:line="480" w:lineRule="auto"/>
-            </w:pPr>
-            <w:r>
-              <w:rPr>
-                <w:rFonts w:hint="eastAsia"/>
-              </w:rPr>
-              <w:t xml:space="preserve">Dataset access URL: {{ </w:t>
-            </w:r>
-            <w:proofErr w:type="spellStart"/>
-            <w:r>
-              <w:rPr>
-                <w:rFonts w:hint="eastAsia"/>
-              </w:rPr>
-              <w:t>dataset.</w:t>
-            </w:r>
-            <w:r>
-              <w:t>DatasetURL</w:t>
-            </w:r>
-            <w:proofErr w:type="spellEnd"/>
-            <w:r>
-              <w:rPr>
-                <w:rFonts w:hint="eastAsia"/>
-              </w:rPr>
-              <w:t xml:space="preserve"> }}</w:t>
-            </w:r>
-          </w:p>
-          <w:p>
-            <w:pPr>
-              <w:spacing w:line="480" w:lineRule="auto"/>
-            </w:pPr>
-            <w:r>
-              <w:rPr>
-                <w:rFonts w:hint="eastAsia"/>
-              </w:rPr>
-              <w:t xml:space="preserve">Log </w:t>
-            </w:r>
-            <w:r>
-              <w:t>initial</w:t>
-            </w:r>
-            <w:r>
-              <w:rPr>
-                <w:rFonts w:hint="eastAsia"/>
-              </w:rPr>
-              <w:t xml:space="preserve"> generated date: {{ timestamp }}</w:t>
             </w:r>
           </w:p>
           <w:p>
@@ -1104,46 +1294,15 @@
               <w:bottom w:w="100" w:type="dxa"/>
               <w:right w:w="100" w:type="dxa"/>
             </w:tcMar>
-            <w:hideMark/>
-          </w:tcPr>
-          <w:p>
-            <w:pPr>
-              <w:rPr>
-                <w:lang w:val="en-US"/>
-              </w:rPr>
-            </w:pPr>
-            <w:r>
-              <w:rPr>
+          </w:tcPr>
+          <w:p>
+            <w:pPr>
+              <w:rPr>
+                <w:rFonts w:hint="eastAsia"/>
                 <w:b/>
                 <w:bCs/>
                 <w:lang w:val="en-US"/>
               </w:rPr>
-              <w:t>1.1</w:t>
-            </w:r>
-          </w:p>
-        </w:tc>
-        <w:tc>
-          <w:tcPr>
-            <w:tcW w:w="0" w:type="auto"/>
-            <w:tcBorders>
-              <w:top w:val="single" w:sz="8" w:space="0" w:color="000000"/>
-              <w:left w:val="single" w:sz="8" w:space="0" w:color="000000"/>
-              <w:bottom w:val="single" w:sz="8" w:space="0" w:color="000000"/>
-              <w:right w:val="single" w:sz="8" w:space="0" w:color="000000"/>
-            </w:tcBorders>
-            <w:tcMar>
-              <w:top w:w="100" w:type="dxa"/>
-              <w:left w:w="100" w:type="dxa"/>
-              <w:bottom w:w="100" w:type="dxa"/>
-              <w:right w:w="100" w:type="dxa"/>
-            </w:tcMar>
-            <w:hideMark/>
-          </w:tcPr>
-          <w:p>
-            <w:pPr>
-              <w:rPr>
-                <w:lang w:val="en-US"/>
-              </w:rPr>
             </w:pPr>
             <w:r>
               <w:rPr>
@@ -1151,71 +1310,655 @@
                 <w:bCs/>
                 <w:lang w:val="en-US"/>
               </w:rPr>
-              <w:t xml:space="preserve">Has the depositor (or their research group) previously created or submitted to a </w:t>
-            </w:r>
-            <w:proofErr w:type="spellStart"/>
-            <w:r>
-              <w:rPr>
+              <w:t>1.</w:t>
+            </w:r>
+            <w:r>
+              <w:rPr>
+                <w:rFonts w:hint="eastAsia"/>
                 <w:b/>
                 <w:bCs/>
                 <w:lang w:val="en-US"/>
               </w:rPr>
-              <w:t>d</w:t>
-            </w:r>
-            <w:r>
+              <w:t>1</w:t>
+            </w:r>
+          </w:p>
+        </w:tc>
+        <w:tc>
+          <w:tcPr>
+            <w:tcW w:w="0" w:type="auto"/>
+            <w:tcBorders>
+              <w:top w:val="single" w:sz="8" w:space="0" w:color="000000"/>
+              <w:left w:val="single" w:sz="8" w:space="0" w:color="000000"/>
+              <w:bottom w:val="single" w:sz="8" w:space="0" w:color="000000"/>
+              <w:right w:val="single" w:sz="8" w:space="0" w:color="000000"/>
+            </w:tcBorders>
+            <w:tcMar>
+              <w:top w:w="100" w:type="dxa"/>
+              <w:left w:w="100" w:type="dxa"/>
+              <w:bottom w:w="100" w:type="dxa"/>
+              <w:right w:w="100" w:type="dxa"/>
+            </w:tcMar>
+          </w:tcPr>
+          <w:p>
+            <w:pPr>
               <w:rPr>
                 <w:b/>
                 <w:bCs/>
                 <w:lang w:val="en-US"/>
               </w:rPr>
-              <w:t>ataverse</w:t>
-            </w:r>
-            <w:proofErr w:type="spellEnd"/>
+            </w:pPr>
             <w:r>
               <w:rPr>
                 <w:b/>
                 <w:bCs/>
                 <w:lang w:val="en-US"/>
               </w:rPr>
-              <w:t xml:space="preserve"> collection </w:t>
-            </w:r>
+              <w:t>Is the dataset deposited directly into U of T Dataverse?</w:t>
+            </w:r>
+          </w:p>
+        </w:tc>
+        <w:tc>
+          <w:tcPr>
+            <w:tcW w:w="0" w:type="auto"/>
+            <w:tcBorders>
+              <w:top w:val="single" w:sz="8" w:space="0" w:color="000000"/>
+              <w:left w:val="single" w:sz="8" w:space="0" w:color="000000"/>
+              <w:bottom w:val="single" w:sz="8" w:space="0" w:color="000000"/>
+              <w:right w:val="single" w:sz="8" w:space="0" w:color="000000"/>
+            </w:tcBorders>
+            <w:tcMar>
+              <w:top w:w="100" w:type="dxa"/>
+              <w:left w:w="100" w:type="dxa"/>
+              <w:bottom w:w="100" w:type="dxa"/>
+              <w:right w:w="100" w:type="dxa"/>
+            </w:tcMar>
+          </w:tcPr>
+          <w:p>
+            <w:pPr>
+              <w:rPr>
+                <w:lang w:val="en-US"/>
+              </w:rPr>
+            </w:pPr>
+            <w:r>
+              <w:rPr>
+                <w:lang w:val="en-US"/>
+              </w:rPr>
+              <w:t>Python scripted.</w:t>
+            </w:r>
+          </w:p>
+          <w:p>
+            <w:pPr>
+              <w:numPr>
+                <w:ilvl w:val="0"/>
+                <w:numId w:val="1"/>
+              </w:numPr>
+              <w:rPr>
+                <w:lang w:val="en-US"/>
+              </w:rPr>
+            </w:pPr>
+            <w:r>
+              <w:rPr>
+                <w:lang w:val="en-US"/>
+              </w:rPr>
+              <w:t>If the dataset is deposited in a sub-</w:t>
+            </w:r>
+            <w:proofErr w:type="spellStart"/>
+            <w:r>
+              <w:rPr>
+                <w:lang w:val="en-US"/>
+              </w:rPr>
+              <w:t>dataverse</w:t>
+            </w:r>
+            <w:proofErr w:type="spellEnd"/>
+            <w:r>
+              <w:rPr>
+                <w:lang w:val="en-US"/>
+              </w:rPr>
+              <w:t xml:space="preserve"> collection, include the name of the collection. </w:t>
+            </w:r>
+          </w:p>
+          <w:p>
+            <w:pPr>
+              <w:rPr>
+                <w:lang w:val="en-US"/>
+              </w:rPr>
+            </w:pPr>
+          </w:p>
+        </w:tc>
+        <w:tc>
+          <w:tcPr>
+            <w:tcW w:w="0" w:type="auto"/>
+            <w:tcBorders>
+              <w:top w:val="single" w:sz="8" w:space="0" w:color="000000"/>
+              <w:left w:val="single" w:sz="8" w:space="0" w:color="000000"/>
+              <w:bottom w:val="single" w:sz="8" w:space="0" w:color="000000"/>
+              <w:right w:val="single" w:sz="8" w:space="0" w:color="000000"/>
+            </w:tcBorders>
+            <w:tcMar>
+              <w:top w:w="100" w:type="dxa"/>
+              <w:left w:w="100" w:type="dxa"/>
+              <w:bottom w:w="100" w:type="dxa"/>
+              <w:right w:w="100" w:type="dxa"/>
+            </w:tcMar>
+          </w:tcPr>
+          <w:p>
+            <w:pPr>
+              <w:rPr>
+                <w:lang w:val="en-US"/>
+              </w:rPr>
+            </w:pPr>
+          </w:p>
+        </w:tc>
+        <w:tc>
+          <w:tcPr>
+            <w:tcW w:w="0" w:type="auto"/>
+            <w:tcBorders>
+              <w:top w:val="single" w:sz="8" w:space="0" w:color="000000"/>
+              <w:left w:val="single" w:sz="8" w:space="0" w:color="000000"/>
+              <w:bottom w:val="single" w:sz="8" w:space="0" w:color="000000"/>
+              <w:right w:val="single" w:sz="8" w:space="0" w:color="000000"/>
+            </w:tcBorders>
+            <w:tcMar>
+              <w:top w:w="100" w:type="dxa"/>
+              <w:left w:w="100" w:type="dxa"/>
+              <w:bottom w:w="100" w:type="dxa"/>
+              <w:right w:w="100" w:type="dxa"/>
+            </w:tcMar>
+          </w:tcPr>
+          <w:p>
+            <w:pPr>
+              <w:rPr>
+                <w:lang w:val="en-US"/>
+              </w:rPr>
+            </w:pPr>
+          </w:p>
+        </w:tc>
+        <w:tc>
+          <w:tcPr>
+            <w:tcW w:w="0" w:type="auto"/>
+            <w:tcBorders>
+              <w:top w:val="single" w:sz="8" w:space="0" w:color="000000"/>
+              <w:left w:val="single" w:sz="8" w:space="0" w:color="000000"/>
+              <w:bottom w:val="single" w:sz="8" w:space="0" w:color="000000"/>
+              <w:right w:val="single" w:sz="8" w:space="0" w:color="000000"/>
+            </w:tcBorders>
+            <w:tcMar>
+              <w:top w:w="100" w:type="dxa"/>
+              <w:left w:w="100" w:type="dxa"/>
+              <w:bottom w:w="100" w:type="dxa"/>
+              <w:right w:w="100" w:type="dxa"/>
+            </w:tcMar>
+          </w:tcPr>
+          <w:p>
+            <w:pPr>
+              <w:rPr>
+                <w:lang w:val="en-US"/>
+              </w:rPr>
+            </w:pPr>
+          </w:p>
+        </w:tc>
+        <w:tc>
+          <w:tcPr>
+            <w:tcW w:w="0" w:type="auto"/>
+            <w:tcBorders>
+              <w:top w:val="single" w:sz="8" w:space="0" w:color="000000"/>
+              <w:left w:val="single" w:sz="8" w:space="0" w:color="000000"/>
+              <w:bottom w:val="single" w:sz="8" w:space="0" w:color="000000"/>
+              <w:right w:val="single" w:sz="8" w:space="0" w:color="000000"/>
+            </w:tcBorders>
+            <w:tcMar>
+              <w:top w:w="100" w:type="dxa"/>
+              <w:left w:w="100" w:type="dxa"/>
+              <w:bottom w:w="100" w:type="dxa"/>
+              <w:right w:w="100" w:type="dxa"/>
+            </w:tcMar>
+          </w:tcPr>
+          <w:p>
+            <w:pPr>
+              <w:rPr>
+                <w:lang w:val="en-US"/>
+              </w:rPr>
+            </w:pPr>
+          </w:p>
+        </w:tc>
+        <w:tc>
+          <w:tcPr>
+            <w:tcW w:w="0" w:type="auto"/>
+            <w:tcBorders>
+              <w:top w:val="single" w:sz="8" w:space="0" w:color="000000"/>
+              <w:left w:val="single" w:sz="8" w:space="0" w:color="000000"/>
+              <w:bottom w:val="single" w:sz="8" w:space="0" w:color="000000"/>
+              <w:right w:val="single" w:sz="8" w:space="0" w:color="000000"/>
+            </w:tcBorders>
+            <w:tcMar>
+              <w:top w:w="100" w:type="dxa"/>
+              <w:left w:w="100" w:type="dxa"/>
+              <w:bottom w:w="100" w:type="dxa"/>
+              <w:right w:w="100" w:type="dxa"/>
+            </w:tcMar>
+          </w:tcPr>
+          <w:p>
+            <w:pPr>
+              <w:rPr>
+                <w:lang w:val="en-US"/>
+              </w:rPr>
+            </w:pPr>
+            <w:r>
+              <w:rPr>
+                <w:lang w:val="en-US"/>
+              </w:rPr>
+              <w:t>X</w:t>
+            </w:r>
+          </w:p>
+        </w:tc>
+        <w:tc>
+          <w:tcPr>
+            <w:tcW w:w="0" w:type="auto"/>
+            <w:tcBorders>
+              <w:top w:val="single" w:sz="8" w:space="0" w:color="000000"/>
+              <w:left w:val="single" w:sz="8" w:space="0" w:color="000000"/>
+              <w:bottom w:val="single" w:sz="8" w:space="0" w:color="000000"/>
+              <w:right w:val="single" w:sz="8" w:space="0" w:color="000000"/>
+            </w:tcBorders>
+            <w:tcMar>
+              <w:top w:w="100" w:type="dxa"/>
+              <w:left w:w="100" w:type="dxa"/>
+              <w:bottom w:w="100" w:type="dxa"/>
+              <w:right w:w="100" w:type="dxa"/>
+            </w:tcMar>
+          </w:tcPr>
+          <w:p>
+            <w:pPr>
+              <w:rPr>
+                <w:u w:val="single"/>
+                <w:lang w:val="en-US"/>
+              </w:rPr>
+            </w:pPr>
+            <w:r>
+              <w:rPr>
+                <w:u w:val="single"/>
+              </w:rPr>
+              <w:t>List the dataset (full) path in the Dataverse repository:</w:t>
+            </w:r>
+            <w:r>
+              <w:br/>
+            </w:r>
+            <w:proofErr w:type="gramStart"/>
+            <w:r>
+              <w:rPr>
+                <w:lang w:val="en-US"/>
+              </w:rPr>
+              <w:t xml:space="preserve">{{ </w:t>
+            </w:r>
+            <w:proofErr w:type="spellStart"/>
+            <w:r>
+              <w:t>template_dict</w:t>
+            </w:r>
+            <w:proofErr w:type="spellEnd"/>
+            <w:r>
+              <w:t>.</w:t>
+            </w:r>
+            <w:proofErr w:type="spellStart"/>
+            <w:r>
+              <w:rPr>
+                <w:lang w:val="en-US"/>
+              </w:rPr>
+              <w:t>ds</w:t>
+            </w:r>
+            <w:proofErr w:type="gramEnd"/>
+            <w:r>
+              <w:rPr>
+                <w:lang w:val="en-US"/>
+              </w:rPr>
+              <w:t>_tree_</w:t>
+            </w:r>
+            <w:proofErr w:type="gramStart"/>
+            <w:r>
+              <w:rPr>
+                <w:lang w:val="en-US"/>
+              </w:rPr>
+              <w:t>info.path</w:t>
+            </w:r>
+            <w:proofErr w:type="spellEnd"/>
+            <w:proofErr w:type="gramEnd"/>
+            <w:r>
+              <w:t>}}</w:t>
+            </w:r>
+            <w:r>
+              <w:rPr>
+                <w:u w:val="single"/>
+                <w:lang w:val="en-US"/>
+              </w:rPr>
+              <w:br/>
+            </w:r>
+          </w:p>
+          <w:p>
+            <w:pPr>
+              <w:rPr>
+                <w:lang w:val="en-US"/>
+              </w:rPr>
+            </w:pPr>
+            <w:r>
+              <w:rPr>
+                <w:rFonts w:hint="eastAsia"/>
+                <w:u w:val="single"/>
+                <w:lang w:val="en-US"/>
+              </w:rPr>
+              <w:t xml:space="preserve">List the </w:t>
+            </w:r>
+            <w:r>
+              <w:rPr>
+                <w:u w:val="single"/>
+                <w:lang w:val="en-US"/>
+              </w:rPr>
+              <w:t xml:space="preserve">parent </w:t>
+            </w:r>
+            <w:proofErr w:type="spellStart"/>
+            <w:r>
+              <w:rPr>
+                <w:rFonts w:hint="eastAsia"/>
+                <w:u w:val="single"/>
+                <w:lang w:val="en-US"/>
+              </w:rPr>
+              <w:t>dataverse</w:t>
+            </w:r>
+            <w:proofErr w:type="spellEnd"/>
+            <w:r>
+              <w:rPr>
+                <w:rFonts w:hint="eastAsia"/>
+                <w:u w:val="single"/>
+                <w:lang w:val="en-US"/>
+              </w:rPr>
+              <w:t xml:space="preserve"> </w:t>
+            </w:r>
+            <w:r>
+              <w:rPr>
+                <w:u w:val="single"/>
+                <w:lang w:val="en-US"/>
+              </w:rPr>
+              <w:t>collection</w:t>
+            </w:r>
+            <w:r>
+              <w:rPr>
+                <w:rFonts w:hint="eastAsia"/>
+                <w:u w:val="single"/>
+                <w:lang w:val="en-US"/>
+              </w:rPr>
+              <w:t xml:space="preserve"> name:</w:t>
+            </w:r>
+            <w:r>
+              <w:rPr>
+                <w:lang w:val="en-US"/>
+              </w:rPr>
+              <w:br/>
+            </w:r>
+            <w:proofErr w:type="gramStart"/>
+            <w:r>
+              <w:rPr>
+                <w:rFonts w:hint="eastAsia"/>
+                <w:lang w:val="en-US"/>
+              </w:rPr>
+              <w:t xml:space="preserve">{{ </w:t>
+            </w:r>
+            <w:proofErr w:type="spellStart"/>
+            <w:r>
+              <w:t>template_dict</w:t>
+            </w:r>
+            <w:proofErr w:type="spellEnd"/>
+            <w:r>
+              <w:rPr>
+                <w:rFonts w:hint="eastAsia"/>
+              </w:rPr>
+              <w:t>.</w:t>
+            </w:r>
+            <w:proofErr w:type="spellStart"/>
+            <w:r>
+              <w:rPr>
+                <w:lang w:val="en-US"/>
+              </w:rPr>
+              <w:t>ds</w:t>
+            </w:r>
+            <w:proofErr w:type="gramEnd"/>
+            <w:r>
+              <w:rPr>
+                <w:lang w:val="en-US"/>
+              </w:rPr>
+              <w:t>_tree_</w:t>
+            </w:r>
+            <w:proofErr w:type="gramStart"/>
+            <w:r>
+              <w:rPr>
+                <w:lang w:val="en-US"/>
+              </w:rPr>
+              <w:t>info</w:t>
+            </w:r>
+            <w:r>
+              <w:rPr>
+                <w:lang w:val="en-US"/>
+              </w:rPr>
+              <w:t>.</w:t>
+            </w:r>
+            <w:r>
+              <w:rPr>
+                <w:lang w:val="en-US"/>
+              </w:rPr>
+              <w:t>parentDataverseName</w:t>
+            </w:r>
+            <w:proofErr w:type="spellEnd"/>
+            <w:proofErr w:type="gramEnd"/>
+            <w:r>
+              <w:rPr>
+                <w:rFonts w:hint="eastAsia"/>
+              </w:rPr>
+              <w:t xml:space="preserve"> }}</w:t>
+            </w:r>
+          </w:p>
+        </w:tc>
+        <w:tc>
+          <w:tcPr>
+            <w:tcW w:w="0" w:type="auto"/>
+            <w:tcBorders>
+              <w:top w:val="single" w:sz="8" w:space="0" w:color="000000"/>
+              <w:left w:val="single" w:sz="8" w:space="0" w:color="000000"/>
+              <w:bottom w:val="single" w:sz="8" w:space="0" w:color="000000"/>
+              <w:right w:val="single" w:sz="8" w:space="0" w:color="000000"/>
+            </w:tcBorders>
+            <w:tcMar>
+              <w:top w:w="100" w:type="dxa"/>
+              <w:left w:w="100" w:type="dxa"/>
+              <w:bottom w:w="100" w:type="dxa"/>
+              <w:right w:w="100" w:type="dxa"/>
+            </w:tcMar>
+          </w:tcPr>
+          <w:p>
+            <w:pPr>
+              <w:rPr>
+                <w:lang w:val="en-US"/>
+              </w:rPr>
+            </w:pPr>
+            <w:r>
+              <w:rPr>
+                <w:lang w:val="en-US"/>
+              </w:rPr>
+              <w:t>Info</w:t>
+            </w:r>
+          </w:p>
+        </w:tc>
+        <w:tc>
+          <w:tcPr>
+            <w:tcW w:w="0" w:type="auto"/>
+            <w:tcBorders>
+              <w:top w:val="single" w:sz="8" w:space="0" w:color="000000"/>
+              <w:left w:val="single" w:sz="8" w:space="0" w:color="000000"/>
+              <w:bottom w:val="single" w:sz="8" w:space="0" w:color="000000"/>
+              <w:right w:val="single" w:sz="8" w:space="0" w:color="000000"/>
+            </w:tcBorders>
+            <w:tcMar>
+              <w:top w:w="100" w:type="dxa"/>
+              <w:left w:w="100" w:type="dxa"/>
+              <w:bottom w:w="100" w:type="dxa"/>
+              <w:right w:w="100" w:type="dxa"/>
+            </w:tcMar>
+          </w:tcPr>
+          <w:p>
+            <w:pPr>
+              <w:rPr>
+                <w:lang w:val="en-US"/>
+              </w:rPr>
+            </w:pPr>
+          </w:p>
+        </w:tc>
+      </w:tr>
+      <w:tr>
+        <w:tc>
+          <w:tcPr>
+            <w:tcW w:w="0" w:type="auto"/>
+            <w:tcBorders>
+              <w:top w:val="single" w:sz="8" w:space="0" w:color="000000"/>
+              <w:left w:val="single" w:sz="8" w:space="0" w:color="000000"/>
+              <w:bottom w:val="single" w:sz="8" w:space="0" w:color="000000"/>
+              <w:right w:val="single" w:sz="8" w:space="0" w:color="000000"/>
+            </w:tcBorders>
+            <w:tcMar>
+              <w:top w:w="100" w:type="dxa"/>
+              <w:left w:w="100" w:type="dxa"/>
+              <w:bottom w:w="100" w:type="dxa"/>
+              <w:right w:w="100" w:type="dxa"/>
+            </w:tcMar>
+            <w:hideMark/>
+          </w:tcPr>
+          <w:p>
+            <w:pPr>
+              <w:rPr>
+                <w:rFonts w:hint="eastAsia"/>
+                <w:lang w:val="en-US"/>
+              </w:rPr>
+            </w:pPr>
             <w:r>
               <w:rPr>
                 <w:b/>
                 <w:bCs/>
                 <w:lang w:val="en-US"/>
               </w:rPr>
+              <w:t>1.</w:t>
+            </w:r>
+            <w:r>
+              <w:rPr>
+                <w:rFonts w:hint="eastAsia"/>
+                <w:b/>
+                <w:bCs/>
+                <w:lang w:val="en-US"/>
+              </w:rPr>
+              <w:t>2</w:t>
+            </w:r>
+          </w:p>
+        </w:tc>
+        <w:tc>
+          <w:tcPr>
+            <w:tcW w:w="0" w:type="auto"/>
+            <w:tcBorders>
+              <w:top w:val="single" w:sz="8" w:space="0" w:color="000000"/>
+              <w:left w:val="single" w:sz="8" w:space="0" w:color="000000"/>
+              <w:bottom w:val="single" w:sz="8" w:space="0" w:color="000000"/>
+              <w:right w:val="single" w:sz="8" w:space="0" w:color="000000"/>
+            </w:tcBorders>
+            <w:tcMar>
+              <w:top w:w="100" w:type="dxa"/>
+              <w:left w:w="100" w:type="dxa"/>
+              <w:bottom w:w="100" w:type="dxa"/>
+              <w:right w:w="100" w:type="dxa"/>
+            </w:tcMar>
+            <w:hideMark/>
+          </w:tcPr>
+          <w:p>
+            <w:pPr>
+              <w:rPr>
+                <w:lang w:val="en-US"/>
+              </w:rPr>
+            </w:pPr>
+            <w:r>
+              <w:rPr>
+                <w:b/>
+                <w:bCs/>
+                <w:lang w:val="en-US"/>
+              </w:rPr>
+              <w:t xml:space="preserve">Has the depositor (or their research group) previously </w:t>
+            </w:r>
+            <w:r>
+              <w:rPr>
+                <w:b/>
+                <w:bCs/>
+                <w:lang w:val="en-US"/>
+              </w:rPr>
+              <w:lastRenderedPageBreak/>
+              <w:t xml:space="preserve">created or submitted to a </w:t>
+            </w:r>
+            <w:proofErr w:type="spellStart"/>
+            <w:r>
+              <w:rPr>
+                <w:b/>
+                <w:bCs/>
+                <w:lang w:val="en-US"/>
+              </w:rPr>
+              <w:t>dataverse</w:t>
+            </w:r>
+            <w:proofErr w:type="spellEnd"/>
+            <w:r>
+              <w:rPr>
+                <w:b/>
+                <w:bCs/>
+                <w:lang w:val="en-US"/>
+              </w:rPr>
+              <w:t xml:space="preserve"> </w:t>
+            </w:r>
+            <w:proofErr w:type="gramStart"/>
+            <w:r>
+              <w:rPr>
+                <w:b/>
+                <w:bCs/>
+                <w:lang w:val="en-US"/>
+              </w:rPr>
+              <w:t xml:space="preserve">collection </w:t>
+            </w:r>
+            <w:r>
+              <w:rPr>
+                <w:b/>
+                <w:bCs/>
+                <w:lang w:val="en-US"/>
+              </w:rPr>
               <w:t>?</w:t>
             </w:r>
-          </w:p>
-        </w:tc>
-        <w:tc>
-          <w:tcPr>
-            <w:tcW w:w="0" w:type="auto"/>
-            <w:tcBorders>
-              <w:top w:val="single" w:sz="8" w:space="0" w:color="000000"/>
-              <w:left w:val="single" w:sz="8" w:space="0" w:color="000000"/>
-              <w:bottom w:val="single" w:sz="8" w:space="0" w:color="000000"/>
-              <w:right w:val="single" w:sz="8" w:space="0" w:color="000000"/>
-            </w:tcBorders>
-            <w:tcMar>
-              <w:top w:w="100" w:type="dxa"/>
-              <w:left w:w="100" w:type="dxa"/>
-              <w:bottom w:w="100" w:type="dxa"/>
-              <w:right w:w="100" w:type="dxa"/>
-            </w:tcMar>
-            <w:hideMark/>
-          </w:tcPr>
-          <w:p>
-            <w:pPr>
-              <w:rPr>
-                <w:lang w:val="en-US"/>
-              </w:rPr>
-            </w:pPr>
-            <w:r>
-              <w:rPr>
-                <w:lang w:val="en-US"/>
-              </w:rPr>
+            <w:proofErr w:type="gramEnd"/>
+          </w:p>
+        </w:tc>
+        <w:tc>
+          <w:tcPr>
+            <w:tcW w:w="0" w:type="auto"/>
+            <w:tcBorders>
+              <w:top w:val="single" w:sz="8" w:space="0" w:color="000000"/>
+              <w:left w:val="single" w:sz="8" w:space="0" w:color="000000"/>
+              <w:bottom w:val="single" w:sz="8" w:space="0" w:color="000000"/>
+              <w:right w:val="single" w:sz="8" w:space="0" w:color="000000"/>
+            </w:tcBorders>
+            <w:tcMar>
+              <w:top w:w="100" w:type="dxa"/>
+              <w:left w:w="100" w:type="dxa"/>
+              <w:bottom w:w="100" w:type="dxa"/>
+              <w:right w:w="100" w:type="dxa"/>
+            </w:tcMar>
+            <w:hideMark/>
+          </w:tcPr>
+          <w:p>
+            <w:pPr>
+              <w:rPr>
+                <w:lang w:val="en-US"/>
+              </w:rPr>
+            </w:pPr>
+            <w:r>
+              <w:rPr>
+                <w:lang w:val="en-US"/>
+              </w:rPr>
+              <w:lastRenderedPageBreak/>
               <w:t>Python scripted.</w:t>
             </w:r>
           </w:p>
@@ -1248,7 +1991,14 @@
               <w:rPr>
                 <w:lang w:val="en-US"/>
               </w:rPr>
-              <w:t xml:space="preserve"> collection refers to the same researcher/author</w:t>
+              <w:t xml:space="preserve"> collectio</w:t>
+            </w:r>
+            <w:r>
+              <w:rPr>
+                <w:lang w:val="en-US"/>
+              </w:rPr>
+              <w:lastRenderedPageBreak/>
+              <w:t>n refers to the same researcher/author</w:t>
             </w:r>
           </w:p>
         </w:tc>
@@ -1437,15 +2187,29 @@
             </w:r>
             <w:proofErr w:type="spellStart"/>
             <w:r>
-              <w:t>template_dict.dv_record.comments</w:t>
+              <w:t>template_</w:t>
+            </w:r>
+            <w:proofErr w:type="gramStart"/>
+            <w:r>
+              <w:t>dict.dv</w:t>
+            </w:r>
+            <w:proofErr w:type="gramEnd"/>
+            <w:r>
+              <w:t>_</w:t>
+            </w:r>
+            <w:proofErr w:type="gramStart"/>
+            <w:r>
+              <w:t>record.comments</w:t>
             </w:r>
             <w:proofErr w:type="spellEnd"/>
+            <w:proofErr w:type="gramEnd"/>
             <w:r>
               <w:t xml:space="preserve"> %} </w:t>
             </w:r>
           </w:p>
           <w:p>
             <w:r>
+              <w:lastRenderedPageBreak/>
               <w:t xml:space="preserve">{% for author, </w:t>
             </w:r>
             <w:proofErr w:type="spellStart"/>
@@ -1457,12 +2221,22 @@
               <w:t xml:space="preserve"> in </w:t>
             </w:r>
             <w:proofErr w:type="spellStart"/>
+            <w:proofErr w:type="gramStart"/>
             <w:r>
               <w:t>item.items</w:t>
             </w:r>
             <w:proofErr w:type="spellEnd"/>
-            <w:r>
-              <w:t>() %} {{ author }}</w:t>
+            <w:proofErr w:type="gramEnd"/>
+            <w:r>
+              <w:t xml:space="preserve">() %} </w:t>
+            </w:r>
+            <w:proofErr w:type="gramStart"/>
+            <w:r>
+              <w:t>{{ author</w:t>
+            </w:r>
+            <w:proofErr w:type="gramEnd"/>
+            <w:r>
+              <w:t xml:space="preserve"> }}</w:t>
             </w:r>
             <w:r>
               <w:rPr>
@@ -1483,16 +2257,29 @@
             <w:r>
               <w:t xml:space="preserve"> %} </w:t>
             </w:r>
+            <w:proofErr w:type="gramStart"/>
             <w:r>
               <w:t xml:space="preserve">{{ </w:t>
             </w:r>
             <w:proofErr w:type="spellStart"/>
             <w:r>
-              <w:t>loop.index</w:t>
+              <w:t>loop</w:t>
+            </w:r>
+            <w:proofErr w:type="gramEnd"/>
+            <w:r>
+              <w:t>.</w:t>
+            </w:r>
+            <w:proofErr w:type="gramStart"/>
+            <w:r>
+              <w:t>index</w:t>
             </w:r>
             <w:proofErr w:type="spellEnd"/>
             <w:r>
-              <w:t xml:space="preserve"> }}.</w:t>
+              <w:t xml:space="preserve"> }</w:t>
+            </w:r>
+            <w:proofErr w:type="gramEnd"/>
+            <w:r>
+              <w:t>}.</w:t>
             </w:r>
             <w:r>
               <w:rPr>
@@ -1500,8 +2287,13 @@
               </w:rPr>
               <w:t xml:space="preserve"> </w:t>
             </w:r>
-            <w:r>
-              <w:t>{{ dataverse }}</w:t>
+            <w:proofErr w:type="gramStart"/>
+            <w:r>
+              <w:t>{{ dataverse</w:t>
+            </w:r>
+            <w:proofErr w:type="gramEnd"/>
+            <w:r>
+              <w:t xml:space="preserve"> }}</w:t>
             </w:r>
             <w:r>
               <w:br/>
@@ -1568,492 +2360,7 @@
               <w:rPr>
                 <w:lang w:val="en-US"/>
               </w:rPr>
-              <w:t>Info</w:t>
-            </w:r>
-          </w:p>
-        </w:tc>
-        <w:tc>
-          <w:tcPr>
-            <w:tcW w:w="0" w:type="auto"/>
-            <w:tcBorders>
-              <w:top w:val="single" w:sz="8" w:space="0" w:color="000000"/>
-              <w:left w:val="single" w:sz="8" w:space="0" w:color="000000"/>
-              <w:bottom w:val="single" w:sz="8" w:space="0" w:color="000000"/>
-              <w:right w:val="single" w:sz="8" w:space="0" w:color="000000"/>
-            </w:tcBorders>
-            <w:tcMar>
-              <w:top w:w="100" w:type="dxa"/>
-              <w:left w:w="100" w:type="dxa"/>
-              <w:bottom w:w="100" w:type="dxa"/>
-              <w:right w:w="100" w:type="dxa"/>
-            </w:tcMar>
-            <w:hideMark/>
-          </w:tcPr>
-          <w:p>
-            <w:pPr>
-              <w:rPr>
-                <w:lang w:val="en-US"/>
-              </w:rPr>
-            </w:pPr>
-          </w:p>
-        </w:tc>
-      </w:tr>
-      <w:tr>
-        <w:tc>
-          <w:tcPr>
-            <w:tcW w:w="0" w:type="auto"/>
-            <w:tcBorders>
-              <w:top w:val="single" w:sz="8" w:space="0" w:color="000000"/>
-              <w:left w:val="single" w:sz="8" w:space="0" w:color="000000"/>
-              <w:bottom w:val="single" w:sz="8" w:space="0" w:color="000000"/>
-              <w:right w:val="single" w:sz="8" w:space="0" w:color="000000"/>
-            </w:tcBorders>
-            <w:tcMar>
-              <w:top w:w="100" w:type="dxa"/>
-              <w:left w:w="100" w:type="dxa"/>
-              <w:bottom w:w="100" w:type="dxa"/>
-              <w:right w:w="100" w:type="dxa"/>
-            </w:tcMar>
-            <w:hideMark/>
-          </w:tcPr>
-          <w:p>
-            <w:pPr>
-              <w:rPr>
-                <w:lang w:val="en-US"/>
-              </w:rPr>
-            </w:pPr>
-            <w:r>
-              <w:rPr>
-                <w:b/>
-                <w:bCs/>
-                <w:lang w:val="en-US"/>
-              </w:rPr>
-              <w:t>1.2</w:t>
-            </w:r>
-          </w:p>
-        </w:tc>
-        <w:tc>
-          <w:tcPr>
-            <w:tcW w:w="0" w:type="auto"/>
-            <w:tcBorders>
-              <w:top w:val="single" w:sz="8" w:space="0" w:color="000000"/>
-              <w:left w:val="single" w:sz="8" w:space="0" w:color="000000"/>
-              <w:bottom w:val="single" w:sz="8" w:space="0" w:color="000000"/>
-              <w:right w:val="single" w:sz="8" w:space="0" w:color="000000"/>
-            </w:tcBorders>
-            <w:tcMar>
-              <w:top w:w="100" w:type="dxa"/>
-              <w:left w:w="100" w:type="dxa"/>
-              <w:bottom w:w="100" w:type="dxa"/>
-              <w:right w:w="100" w:type="dxa"/>
-            </w:tcMar>
-            <w:hideMark/>
-          </w:tcPr>
-          <w:p>
-            <w:pPr>
-              <w:rPr>
-                <w:lang w:val="en-US"/>
-              </w:rPr>
-            </w:pPr>
-            <w:r>
-              <w:rPr>
-                <w:b/>
-                <w:bCs/>
-                <w:lang w:val="en-US"/>
-              </w:rPr>
-              <w:t>Is the dataset deposited directly into U of T Dataverse?</w:t>
-            </w:r>
-          </w:p>
-        </w:tc>
-        <w:tc>
-          <w:tcPr>
-            <w:tcW w:w="0" w:type="auto"/>
-            <w:tcBorders>
-              <w:top w:val="single" w:sz="8" w:space="0" w:color="000000"/>
-              <w:left w:val="single" w:sz="8" w:space="0" w:color="000000"/>
-              <w:bottom w:val="single" w:sz="8" w:space="0" w:color="000000"/>
-              <w:right w:val="single" w:sz="8" w:space="0" w:color="000000"/>
-            </w:tcBorders>
-            <w:tcMar>
-              <w:top w:w="100" w:type="dxa"/>
-              <w:left w:w="100" w:type="dxa"/>
-              <w:bottom w:w="100" w:type="dxa"/>
-              <w:right w:w="100" w:type="dxa"/>
-            </w:tcMar>
-            <w:hideMark/>
-          </w:tcPr>
-          <w:p>
-            <w:pPr>
-              <w:rPr>
-                <w:lang w:val="en-US"/>
-              </w:rPr>
-            </w:pPr>
-            <w:r>
-              <w:rPr>
-                <w:lang w:val="en-US"/>
-              </w:rPr>
-              <w:t>Python scripted.</w:t>
-            </w:r>
-          </w:p>
-          <w:p>
-            <w:pPr>
-              <w:numPr>
-                <w:ilvl w:val="0"/>
-                <w:numId w:val="1"/>
-              </w:numPr>
-              <w:rPr>
-                <w:lang w:val="en-US"/>
-              </w:rPr>
-            </w:pPr>
-            <w:r>
-              <w:rPr>
-                <w:lang w:val="en-US"/>
-              </w:rPr>
-              <w:t>If the dataset is deposited in a sub-</w:t>
-            </w:r>
-            <w:proofErr w:type="spellStart"/>
-            <w:r>
-              <w:rPr>
-                <w:lang w:val="en-US"/>
-              </w:rPr>
-              <w:t>dataverse</w:t>
-            </w:r>
-            <w:proofErr w:type="spellEnd"/>
-            <w:r>
-              <w:rPr>
-                <w:lang w:val="en-US"/>
-              </w:rPr>
-              <w:t xml:space="preserve"> collection, include </w:t>
-            </w:r>
-            <w:r>
-              <w:rPr>
-                <w:lang w:val="en-US"/>
-              </w:rPr>
               <w:lastRenderedPageBreak/>
-              <w:t>the name of the collection. </w:t>
-            </w:r>
-          </w:p>
-          <w:p>
-            <w:pPr>
-              <w:rPr>
-                <w:lang w:val="en-US"/>
-              </w:rPr>
-            </w:pPr>
-          </w:p>
-        </w:tc>
-        <w:tc>
-          <w:tcPr>
-            <w:tcW w:w="0" w:type="auto"/>
-            <w:tcBorders>
-              <w:top w:val="single" w:sz="8" w:space="0" w:color="000000"/>
-              <w:left w:val="single" w:sz="8" w:space="0" w:color="000000"/>
-              <w:bottom w:val="single" w:sz="8" w:space="0" w:color="000000"/>
-              <w:right w:val="single" w:sz="8" w:space="0" w:color="000000"/>
-            </w:tcBorders>
-            <w:tcMar>
-              <w:top w:w="100" w:type="dxa"/>
-              <w:left w:w="100" w:type="dxa"/>
-              <w:bottom w:w="100" w:type="dxa"/>
-              <w:right w:w="100" w:type="dxa"/>
-            </w:tcMar>
-            <w:hideMark/>
-          </w:tcPr>
-          <w:p/>
-        </w:tc>
-        <w:tc>
-          <w:tcPr>
-            <w:tcW w:w="0" w:type="auto"/>
-            <w:tcBorders>
-              <w:top w:val="single" w:sz="8" w:space="0" w:color="000000"/>
-              <w:left w:val="single" w:sz="8" w:space="0" w:color="000000"/>
-              <w:bottom w:val="single" w:sz="8" w:space="0" w:color="000000"/>
-              <w:right w:val="single" w:sz="8" w:space="0" w:color="000000"/>
-            </w:tcBorders>
-            <w:tcMar>
-              <w:top w:w="100" w:type="dxa"/>
-              <w:left w:w="100" w:type="dxa"/>
-              <w:bottom w:w="100" w:type="dxa"/>
-              <w:right w:w="100" w:type="dxa"/>
-            </w:tcMar>
-          </w:tcPr>
-          <w:p>
-            <w:pPr>
-              <w:rPr>
-                <w:lang w:val="en-US"/>
-              </w:rPr>
-            </w:pPr>
-          </w:p>
-        </w:tc>
-        <w:tc>
-          <w:tcPr>
-            <w:tcW w:w="0" w:type="auto"/>
-            <w:tcBorders>
-              <w:top w:val="single" w:sz="8" w:space="0" w:color="000000"/>
-              <w:left w:val="single" w:sz="8" w:space="0" w:color="000000"/>
-              <w:bottom w:val="single" w:sz="8" w:space="0" w:color="000000"/>
-              <w:right w:val="single" w:sz="8" w:space="0" w:color="000000"/>
-            </w:tcBorders>
-            <w:tcMar>
-              <w:top w:w="100" w:type="dxa"/>
-              <w:left w:w="100" w:type="dxa"/>
-              <w:bottom w:w="100" w:type="dxa"/>
-              <w:right w:w="100" w:type="dxa"/>
-            </w:tcMar>
-          </w:tcPr>
-          <w:p>
-            <w:pPr>
-              <w:rPr>
-                <w:lang w:val="en-US"/>
-              </w:rPr>
-            </w:pPr>
-          </w:p>
-        </w:tc>
-        <w:tc>
-          <w:tcPr>
-            <w:tcW w:w="0" w:type="auto"/>
-            <w:tcBorders>
-              <w:top w:val="single" w:sz="8" w:space="0" w:color="000000"/>
-              <w:left w:val="single" w:sz="8" w:space="0" w:color="000000"/>
-              <w:bottom w:val="single" w:sz="8" w:space="0" w:color="000000"/>
-              <w:right w:val="single" w:sz="8" w:space="0" w:color="000000"/>
-            </w:tcBorders>
-            <w:tcMar>
-              <w:top w:w="100" w:type="dxa"/>
-              <w:left w:w="100" w:type="dxa"/>
-              <w:bottom w:w="100" w:type="dxa"/>
-              <w:right w:w="100" w:type="dxa"/>
-            </w:tcMar>
-          </w:tcPr>
-          <w:p>
-            <w:pPr>
-              <w:rPr>
-                <w:lang w:val="en-US"/>
-              </w:rPr>
-            </w:pPr>
-          </w:p>
-        </w:tc>
-        <w:tc>
-          <w:tcPr>
-            <w:tcW w:w="0" w:type="auto"/>
-            <w:tcBorders>
-              <w:top w:val="single" w:sz="8" w:space="0" w:color="000000"/>
-              <w:left w:val="single" w:sz="8" w:space="0" w:color="000000"/>
-              <w:bottom w:val="single" w:sz="8" w:space="0" w:color="000000"/>
-              <w:right w:val="single" w:sz="8" w:space="0" w:color="000000"/>
-            </w:tcBorders>
-            <w:tcMar>
-              <w:top w:w="100" w:type="dxa"/>
-              <w:left w:w="100" w:type="dxa"/>
-              <w:bottom w:w="100" w:type="dxa"/>
-              <w:right w:w="100" w:type="dxa"/>
-            </w:tcMar>
-          </w:tcPr>
-          <w:p>
-            <w:pPr>
-              <w:rPr>
-                <w:lang w:val="en-US"/>
-              </w:rPr>
-            </w:pPr>
-            <w:r>
-              <w:rPr>
-                <w:lang w:val="en-US"/>
-              </w:rPr>
-              <w:t>X</w:t>
-            </w:r>
-          </w:p>
-        </w:tc>
-        <w:tc>
-          <w:tcPr>
-            <w:tcW w:w="0" w:type="auto"/>
-            <w:tcBorders>
-              <w:top w:val="single" w:sz="8" w:space="0" w:color="000000"/>
-              <w:left w:val="single" w:sz="8" w:space="0" w:color="000000"/>
-              <w:bottom w:val="single" w:sz="8" w:space="0" w:color="000000"/>
-              <w:right w:val="single" w:sz="8" w:space="0" w:color="000000"/>
-            </w:tcBorders>
-            <w:tcMar>
-              <w:top w:w="100" w:type="dxa"/>
-              <w:left w:w="100" w:type="dxa"/>
-              <w:bottom w:w="100" w:type="dxa"/>
-              <w:right w:w="100" w:type="dxa"/>
-            </w:tcMar>
-            <w:hideMark/>
-          </w:tcPr>
-          <w:p>
-            <w:pPr>
-              <w:rPr>
-                <w:lang w:val="en-US"/>
-              </w:rPr>
-            </w:pPr>
-            <w:r>
-              <w:rPr>
-                <w:rFonts w:hint="eastAsia"/>
-                <w:u w:val="single"/>
-                <w:lang w:val="en-US"/>
-              </w:rPr>
-              <w:t xml:space="preserve">List the </w:t>
-            </w:r>
-            <w:r>
-              <w:rPr>
-                <w:u w:val="single"/>
-                <w:lang w:val="en-US"/>
-              </w:rPr>
-              <w:t xml:space="preserve">parent </w:t>
-            </w:r>
-            <w:proofErr w:type="spellStart"/>
-            <w:r>
-              <w:rPr>
-                <w:rFonts w:hint="eastAsia"/>
-                <w:u w:val="single"/>
-                <w:lang w:val="en-US"/>
-              </w:rPr>
-              <w:t>dataverse</w:t>
-            </w:r>
-            <w:proofErr w:type="spellEnd"/>
-            <w:r>
-              <w:rPr>
-                <w:rFonts w:hint="eastAsia"/>
-                <w:u w:val="single"/>
-                <w:lang w:val="en-US"/>
-              </w:rPr>
-              <w:t xml:space="preserve"> </w:t>
-            </w:r>
-            <w:r>
-              <w:rPr>
-                <w:u w:val="single"/>
-                <w:lang w:val="en-US"/>
-              </w:rPr>
-              <w:t>collection</w:t>
-            </w:r>
-            <w:r>
-              <w:rPr>
-                <w:rFonts w:hint="eastAsia"/>
-                <w:u w:val="single"/>
-                <w:lang w:val="en-US"/>
-              </w:rPr>
-              <w:t xml:space="preserve"> name:</w:t>
-            </w:r>
-            <w:r>
-              <w:rPr>
-                <w:lang w:val="en-US"/>
-              </w:rPr>
-              <w:br/>
-            </w:r>
-            <w:r>
-              <w:rPr>
-                <w:rFonts w:hint="eastAsia"/>
-                <w:lang w:val="en-US"/>
-              </w:rPr>
-              <w:t xml:space="preserve">{{ </w:t>
-            </w:r>
-            <w:proofErr w:type="spellStart"/>
-            <w:r>
-              <w:t>template_dict</w:t>
-            </w:r>
-            <w:proofErr w:type="spellEnd"/>
-            <w:r>
-              <w:rPr>
-                <w:rFonts w:hint="eastAsia"/>
-              </w:rPr>
-              <w:t>.</w:t>
-            </w:r>
-            <w:proofErr w:type="spellStart"/>
-            <w:r>
-              <w:rPr>
-                <w:lang w:val="en-US"/>
-              </w:rPr>
-              <w:t>ds_tree_info</w:t>
-            </w:r>
-            <w:r>
-              <w:rPr>
-                <w:lang w:val="en-US"/>
-              </w:rPr>
-              <w:t>.</w:t>
-            </w:r>
-            <w:r>
-              <w:rPr>
-                <w:lang w:val="en-US"/>
-              </w:rPr>
-              <w:t>parentDataverseName</w:t>
-            </w:r>
-            <w:proofErr w:type="spellEnd"/>
-            <w:r>
-              <w:rPr>
-                <w:rFonts w:hint="eastAsia"/>
-              </w:rPr>
-              <w:t xml:space="preserve"> }}</w:t>
-            </w:r>
-          </w:p>
-          <w:p>
-            <w:r>
-              <w:rPr>
-                <w:u w:val="single"/>
-              </w:rPr>
-              <w:t>List the dataset (full) path in the Dataverse repository</w:t>
-            </w:r>
-            <w:r>
-              <w:rPr>
-                <w:u w:val="single"/>
-              </w:rPr>
-              <w:t>:</w:t>
-            </w:r>
-            <w:r>
-              <w:br/>
-            </w:r>
-            <w:r>
-              <w:rPr>
-                <w:lang w:val="en-US"/>
-              </w:rPr>
-              <w:t xml:space="preserve">{{ </w:t>
-            </w:r>
-            <w:proofErr w:type="spellStart"/>
-            <w:r>
-              <w:t>template_dict</w:t>
-            </w:r>
-            <w:proofErr w:type="spellEnd"/>
-            <w:r>
-              <w:t>.</w:t>
-            </w:r>
-            <w:proofErr w:type="spellStart"/>
-            <w:r>
-              <w:rPr>
-                <w:lang w:val="en-US"/>
-              </w:rPr>
-              <w:t>ds_tree_info.path</w:t>
-            </w:r>
-            <w:proofErr w:type="spellEnd"/>
-            <w:r>
-              <w:t>}}</w:t>
-            </w:r>
-          </w:p>
-        </w:tc>
-        <w:tc>
-          <w:tcPr>
-            <w:tcW w:w="0" w:type="auto"/>
-            <w:tcBorders>
-              <w:top w:val="single" w:sz="8" w:space="0" w:color="000000"/>
-              <w:left w:val="single" w:sz="8" w:space="0" w:color="000000"/>
-              <w:bottom w:val="single" w:sz="8" w:space="0" w:color="000000"/>
-              <w:right w:val="single" w:sz="8" w:space="0" w:color="000000"/>
-            </w:tcBorders>
-            <w:tcMar>
-              <w:top w:w="100" w:type="dxa"/>
-              <w:left w:w="100" w:type="dxa"/>
-              <w:bottom w:w="100" w:type="dxa"/>
-              <w:right w:w="100" w:type="dxa"/>
-            </w:tcMar>
-            <w:hideMark/>
-          </w:tcPr>
-          <w:p>
-            <w:pPr>
-              <w:rPr>
-                <w:lang w:val="en-US"/>
-              </w:rPr>
-            </w:pPr>
-            <w:r>
-              <w:rPr>
-                <w:lang w:val="en-US"/>
-              </w:rPr>
               <w:t>Info</w:t>
             </w:r>
           </w:p>
@@ -2324,13 +2631,28 @@
               <w:rPr>
                 <w:lang w:val="en-US"/>
               </w:rPr>
-              <w:t xml:space="preserve">Confirm with the depositor that they actually require a </w:t>
+              <w:t xml:space="preserve">Confirm with the depositor that they </w:t>
+            </w:r>
+            <w:proofErr w:type="gramStart"/>
+            <w:r>
+              <w:rPr>
+                <w:lang w:val="en-US"/>
+              </w:rPr>
+              <w:t>actually require</w:t>
+            </w:r>
+            <w:proofErr w:type="gramEnd"/>
+            <w:r>
+              <w:rPr>
+                <w:lang w:val="en-US"/>
+              </w:rPr>
+              <w:t xml:space="preserve"> a </w:t>
             </w:r>
             <w:proofErr w:type="spellStart"/>
             <w:r>
               <w:rPr>
                 <w:lang w:val="en-US"/>
               </w:rPr>
+              <w:lastRenderedPageBreak/>
               <w:t>dataverse</w:t>
             </w:r>
             <w:proofErr w:type="spellEnd"/>
@@ -2338,14 +2660,7 @@
               <w:rPr>
                 <w:lang w:val="en-US"/>
               </w:rPr>
-              <w:t xml:space="preserve"> (e.g., will there be </w:t>
-            </w:r>
-            <w:r>
-              <w:rPr>
-                <w:lang w:val="en-US"/>
-              </w:rPr>
-              <w:lastRenderedPageBreak/>
-              <w:t>future deposits?)</w:t>
+              <w:t xml:space="preserve"> (e.g., will there be future deposits?)</w:t>
             </w:r>
           </w:p>
         </w:tc>
@@ -3040,14 +3355,56 @@
               <w:rPr>
                 <w:lang w:val="en-US"/>
               </w:rPr>
-              <w:t>template_dict.file_ext.comments|length</w:t>
+              <w:t>template_</w:t>
+            </w:r>
+            <w:proofErr w:type="gramStart"/>
+            <w:r>
+              <w:rPr>
+                <w:lang w:val="en-US"/>
+              </w:rPr>
+              <w:t>dict.file</w:t>
+            </w:r>
+            <w:proofErr w:type="gramEnd"/>
+            <w:r>
+              <w:rPr>
+                <w:lang w:val="en-US"/>
+              </w:rPr>
+              <w:t>_</w:t>
+            </w:r>
+            <w:proofErr w:type="gramStart"/>
+            <w:r>
+              <w:rPr>
+                <w:lang w:val="en-US"/>
+              </w:rPr>
+              <w:t>ext.comments</w:t>
+            </w:r>
+            <w:proofErr w:type="gramEnd"/>
+            <w:r>
+              <w:rPr>
+                <w:lang w:val="en-US"/>
+              </w:rPr>
+              <w:t>|length</w:t>
             </w:r>
             <w:proofErr w:type="spellEnd"/>
             <w:r>
               <w:rPr>
                 <w:lang w:val="en-US"/>
               </w:rPr>
-              <w:t xml:space="preserve"> == 0 %}X{% endif %}</w:t>
+              <w:t xml:space="preserve"> == 0 %}</w:t>
+            </w:r>
+            <w:proofErr w:type="gramStart"/>
+            <w:r>
+              <w:rPr>
+                <w:lang w:val="en-US"/>
+              </w:rPr>
+              <w:t>X{</w:t>
+            </w:r>
+            <w:proofErr w:type="gramEnd"/>
+            <w:r>
+              <w:rPr>
+                <w:lang w:val="en-US"/>
+              </w:rPr>
+              <w:t>% endif %}</w:t>
             </w:r>
           </w:p>
         </w:tc>
@@ -3085,14 +3442,56 @@
               <w:rPr>
                 <w:lang w:val="en-US"/>
               </w:rPr>
-              <w:t>template_dict.file_ext.comments|length</w:t>
+              <w:t>template_</w:t>
+            </w:r>
+            <w:proofErr w:type="gramStart"/>
+            <w:r>
+              <w:rPr>
+                <w:lang w:val="en-US"/>
+              </w:rPr>
+              <w:t>dict.file</w:t>
+            </w:r>
+            <w:proofErr w:type="gramEnd"/>
+            <w:r>
+              <w:rPr>
+                <w:lang w:val="en-US"/>
+              </w:rPr>
+              <w:t>_</w:t>
+            </w:r>
+            <w:proofErr w:type="gramStart"/>
+            <w:r>
+              <w:rPr>
+                <w:lang w:val="en-US"/>
+              </w:rPr>
+              <w:t>ext.comments</w:t>
+            </w:r>
+            <w:proofErr w:type="gramEnd"/>
+            <w:r>
+              <w:rPr>
+                <w:lang w:val="en-US"/>
+              </w:rPr>
+              <w:t>|length</w:t>
             </w:r>
             <w:proofErr w:type="spellEnd"/>
             <w:r>
               <w:rPr>
                 <w:lang w:val="en-US"/>
               </w:rPr>
-              <w:t xml:space="preserve"> &gt; 0 %}X{% endif %}</w:t>
+              <w:t xml:space="preserve"> &gt; 0 %}</w:t>
+            </w:r>
+            <w:proofErr w:type="gramStart"/>
+            <w:r>
+              <w:rPr>
+                <w:lang w:val="en-US"/>
+              </w:rPr>
+              <w:t>X{</w:t>
+            </w:r>
+            <w:proofErr w:type="gramEnd"/>
+            <w:r>
+              <w:rPr>
+                <w:lang w:val="en-US"/>
+              </w:rPr>
+              <w:t>% endif %}</w:t>
             </w:r>
           </w:p>
         </w:tc>
@@ -3215,29 +3614,84 @@
               <w:rPr>
                 <w:lang w:val="en-US"/>
               </w:rPr>
-              <w:t>template_dict.file_open.comments</w:t>
+              <w:t>template_</w:t>
+            </w:r>
+            <w:proofErr w:type="gramStart"/>
+            <w:r>
+              <w:rPr>
+                <w:lang w:val="en-US"/>
+              </w:rPr>
+              <w:t>dict.file</w:t>
+            </w:r>
+            <w:proofErr w:type="gramEnd"/>
+            <w:r>
+              <w:rPr>
+                <w:lang w:val="en-US"/>
+              </w:rPr>
+              <w:t>_</w:t>
+            </w:r>
+            <w:proofErr w:type="gramStart"/>
+            <w:r>
+              <w:rPr>
+                <w:lang w:val="en-US"/>
+              </w:rPr>
+              <w:t>open.comments</w:t>
             </w:r>
             <w:proofErr w:type="spellEnd"/>
+            <w:proofErr w:type="gramEnd"/>
             <w:r>
               <w:t xml:space="preserve"> |length &gt; 0</w:t>
             </w:r>
             <w:r>
-              <w:t xml:space="preserve"> %}</w:t>
-            </w:r>
-            <w:r>
-              <w:rPr>
-                <w:lang w:val="en-US"/>
-              </w:rPr>
-              <w:t xml:space="preserve">{% for item in </w:t>
+              <w:t xml:space="preserve"> </w:t>
+            </w:r>
+            <w:proofErr w:type="gramStart"/>
+            <w:r>
+              <w:t>%}</w:t>
+            </w:r>
+            <w:r>
+              <w:rPr>
+                <w:lang w:val="en-US"/>
+              </w:rPr>
+              <w:t>{</w:t>
+            </w:r>
+            <w:proofErr w:type="gramEnd"/>
+            <w:r>
+              <w:rPr>
+                <w:lang w:val="en-US"/>
+              </w:rPr>
+              <w:t xml:space="preserve">% for item in </w:t>
             </w:r>
             <w:proofErr w:type="spellStart"/>
             <w:r>
               <w:rPr>
                 <w:lang w:val="en-US"/>
               </w:rPr>
-              <w:t>template_dict.file_open.comments</w:t>
+              <w:t>template_</w:t>
+            </w:r>
+            <w:proofErr w:type="gramStart"/>
+            <w:r>
+              <w:rPr>
+                <w:lang w:val="en-US"/>
+              </w:rPr>
+              <w:t>dict.file</w:t>
+            </w:r>
+            <w:proofErr w:type="gramEnd"/>
+            <w:r>
+              <w:rPr>
+                <w:lang w:val="en-US"/>
+              </w:rPr>
+              <w:t>_</w:t>
+            </w:r>
+            <w:proofErr w:type="gramStart"/>
+            <w:r>
+              <w:rPr>
+                <w:lang w:val="en-US"/>
+              </w:rPr>
+              <w:t>open.comments</w:t>
             </w:r>
             <w:proofErr w:type="spellEnd"/>
+            <w:proofErr w:type="gramEnd"/>
             <w:r>
               <w:rPr>
                 <w:lang w:val="en-US"/>
@@ -3256,6 +3710,7 @@
                 <w:lang w:val="en-US"/>
               </w:rPr>
             </w:pPr>
+            <w:proofErr w:type="gramStart"/>
             <w:r>
               <w:rPr>
                 <w:lang w:val="en-US"/>
@@ -3267,16 +3722,38 @@
               <w:rPr>
                 <w:lang w:val="en-US"/>
               </w:rPr>
-              <w:t>item.file_name</w:t>
+              <w:t>item</w:t>
+            </w:r>
+            <w:proofErr w:type="gramEnd"/>
+            <w:r>
+              <w:rPr>
+                <w:lang w:val="en-US"/>
+              </w:rPr>
+              <w:t>.file_</w:t>
+            </w:r>
+            <w:proofErr w:type="gramStart"/>
+            <w:r>
+              <w:rPr>
+                <w:lang w:val="en-US"/>
+              </w:rPr>
+              <w:t>name</w:t>
             </w:r>
             <w:proofErr w:type="spellEnd"/>
             <w:r>
               <w:rPr>
                 <w:lang w:val="en-US"/>
               </w:rPr>
-              <w:t xml:space="preserve"> }}{% </w:t>
+              <w:t xml:space="preserve"> }}{</w:t>
+            </w:r>
+            <w:proofErr w:type="gramEnd"/>
+            <w:r>
+              <w:rPr>
+                <w:lang w:val="en-US"/>
+              </w:rPr>
+              <w:t xml:space="preserve">% </w:t>
             </w:r>
             <w:proofErr w:type="spellStart"/>
+            <w:proofErr w:type="gramStart"/>
             <w:r>
               <w:rPr>
                 <w:lang w:val="en-US"/>
@@ -3290,15 +3767,32 @@
               </w:rPr>
               <w:t xml:space="preserve"> %}</w:t>
             </w:r>
-          </w:p>
-          <w:p>
-            <w:pPr>
-              <w:rPr>
-                <w:lang w:val="en-US"/>
-              </w:rPr>
-            </w:pPr>
-            <w:r>
-              <w:t>{% else %}(NONE){% endif %}</w:t>
+            <w:proofErr w:type="gramEnd"/>
+          </w:p>
+          <w:p>
+            <w:pPr>
+              <w:rPr>
+                <w:lang w:val="en-US"/>
+              </w:rPr>
+            </w:pPr>
+            <w:r>
+              <w:t xml:space="preserve">{% else </w:t>
+            </w:r>
+            <w:proofErr w:type="gramStart"/>
+            <w:r>
+              <w:t>%}(</w:t>
+            </w:r>
+            <w:proofErr w:type="gramEnd"/>
+            <w:r>
+              <w:t>NONE</w:t>
+            </w:r>
+            <w:proofErr w:type="gramStart"/>
+            <w:r>
+              <w:t>){</w:t>
+            </w:r>
+            <w:proofErr w:type="gramEnd"/>
+            <w:r>
+              <w:t>% endif %}</w:t>
             </w:r>
           </w:p>
           <w:p>
@@ -3335,28 +3829,47 @@
               <w:t xml:space="preserve"> |length &gt; 0</w:t>
             </w:r>
             <w:r>
+              <w:t xml:space="preserve"> </w:t>
+            </w:r>
+            <w:proofErr w:type="gramStart"/>
+            <w:r>
+              <w:t>%}</w:t>
+            </w:r>
+            <w:r>
+              <w:rPr>
+                <w:lang w:val="en-US"/>
+              </w:rPr>
+              <w:t>{</w:t>
+            </w:r>
+            <w:proofErr w:type="gramEnd"/>
+            <w:r>
+              <w:rPr>
+                <w:lang w:val="en-US"/>
+              </w:rPr>
+              <w:t xml:space="preserve">% for item in </w:t>
+            </w:r>
+            <w:proofErr w:type="spellStart"/>
+            <w:r>
+              <w:rPr>
+                <w:lang w:val="en-US"/>
+              </w:rPr>
+              <w:t>template_dict.file_open.not_</w:t>
+            </w:r>
+            <w:proofErr w:type="gramStart"/>
+            <w:r>
+              <w:rPr>
+                <w:lang w:val="en-US"/>
+              </w:rPr>
+              <w:t>checked</w:t>
+            </w:r>
+            <w:proofErr w:type="spellEnd"/>
+            <w:r>
+              <w:rPr>
+                <w:lang w:val="en-US"/>
+              </w:rPr>
               <w:t xml:space="preserve"> %}</w:t>
             </w:r>
-            <w:r>
-              <w:rPr>
-                <w:lang w:val="en-US"/>
-              </w:rPr>
-              <w:t xml:space="preserve">{% for item in </w:t>
-            </w:r>
-            <w:proofErr w:type="spellStart"/>
-            <w:r>
-              <w:rPr>
-                <w:lang w:val="en-US"/>
-              </w:rPr>
-              <w:t>template_dict.file_open.not_checked</w:t>
-            </w:r>
-            <w:proofErr w:type="spellEnd"/>
-            <w:r>
-              <w:rPr>
-                <w:lang w:val="en-US"/>
-              </w:rPr>
-              <w:t xml:space="preserve"> %}</w:t>
-            </w:r>
+            <w:proofErr w:type="gramEnd"/>
           </w:p>
           <w:p>
             <w:pPr>
@@ -3369,6 +3882,7 @@
                 <w:lang w:val="en-US"/>
               </w:rPr>
             </w:pPr>
+            <w:proofErr w:type="gramStart"/>
             <w:r>
               <w:rPr>
                 <w:lang w:val="en-US"/>
@@ -3380,16 +3894,38 @@
               <w:rPr>
                 <w:lang w:val="en-US"/>
               </w:rPr>
-              <w:t>item.file_name</w:t>
+              <w:t>item</w:t>
+            </w:r>
+            <w:proofErr w:type="gramEnd"/>
+            <w:r>
+              <w:rPr>
+                <w:lang w:val="en-US"/>
+              </w:rPr>
+              <w:t>.file_</w:t>
+            </w:r>
+            <w:proofErr w:type="gramStart"/>
+            <w:r>
+              <w:rPr>
+                <w:lang w:val="en-US"/>
+              </w:rPr>
+              <w:t>name</w:t>
             </w:r>
             <w:proofErr w:type="spellEnd"/>
             <w:r>
               <w:rPr>
                 <w:lang w:val="en-US"/>
               </w:rPr>
-              <w:t xml:space="preserve"> }}{% </w:t>
+              <w:t xml:space="preserve"> }}{</w:t>
+            </w:r>
+            <w:proofErr w:type="gramEnd"/>
+            <w:r>
+              <w:rPr>
+                <w:lang w:val="en-US"/>
+              </w:rPr>
+              <w:t xml:space="preserve">% </w:t>
             </w:r>
             <w:proofErr w:type="spellStart"/>
+            <w:proofErr w:type="gramStart"/>
             <w:r>
               <w:rPr>
                 <w:lang w:val="en-US"/>
@@ -3403,15 +3939,32 @@
               </w:rPr>
               <w:t xml:space="preserve"> %}</w:t>
             </w:r>
-          </w:p>
-          <w:p>
-            <w:pPr>
-              <w:rPr>
-                <w:lang w:val="en-US"/>
-              </w:rPr>
-            </w:pPr>
-            <w:r>
-              <w:t>{% else %}(NONE){% endif %}</w:t>
+            <w:proofErr w:type="gramEnd"/>
+          </w:p>
+          <w:p>
+            <w:pPr>
+              <w:rPr>
+                <w:lang w:val="en-US"/>
+              </w:rPr>
+            </w:pPr>
+            <w:r>
+              <w:t xml:space="preserve">{% else </w:t>
+            </w:r>
+            <w:proofErr w:type="gramStart"/>
+            <w:r>
+              <w:t>%}(</w:t>
+            </w:r>
+            <w:proofErr w:type="gramEnd"/>
+            <w:r>
+              <w:t>NONE</w:t>
+            </w:r>
+            <w:proofErr w:type="gramStart"/>
+            <w:r>
+              <w:t>){</w:t>
+            </w:r>
+            <w:proofErr w:type="gramEnd"/>
+            <w:r>
+              <w:t>% endif %}</w:t>
             </w:r>
           </w:p>
         </w:tc>
@@ -3545,14 +4098,24 @@
                 <w:bCs/>
                 <w:lang w:val="en-US"/>
               </w:rPr>
-              <w:t>&lt;&gt;:"/\|?*</w:t>
-            </w:r>
+              <w:t>&lt;&gt;:"/\</w:t>
+            </w:r>
+            <w:proofErr w:type="gramStart"/>
             <w:r>
               <w:rPr>
                 <w:b/>
                 <w:bCs/>
                 <w:lang w:val="en-US"/>
               </w:rPr>
+              <w:t>|?*</w:t>
+            </w:r>
+            <w:proofErr w:type="gramEnd"/>
+            <w:r>
+              <w:rPr>
+                <w:b/>
+                <w:bCs/>
+                <w:lang w:val="en-US"/>
+              </w:rPr>
               <w:t>,@$~)?</w:t>
             </w:r>
           </w:p>
@@ -3622,14 +4185,56 @@
               <w:rPr>
                 <w:lang w:val="en-US"/>
               </w:rPr>
-              <w:t>template_dict.special_characters.comments|length</w:t>
+              <w:t>template_</w:t>
+            </w:r>
+            <w:proofErr w:type="gramStart"/>
+            <w:r>
+              <w:rPr>
+                <w:lang w:val="en-US"/>
+              </w:rPr>
+              <w:t>dict.special</w:t>
+            </w:r>
+            <w:proofErr w:type="gramEnd"/>
+            <w:r>
+              <w:rPr>
+                <w:lang w:val="en-US"/>
+              </w:rPr>
+              <w:t>_</w:t>
+            </w:r>
+            <w:proofErr w:type="gramStart"/>
+            <w:r>
+              <w:rPr>
+                <w:lang w:val="en-US"/>
+              </w:rPr>
+              <w:t>characters.comments</w:t>
+            </w:r>
+            <w:proofErr w:type="gramEnd"/>
+            <w:r>
+              <w:rPr>
+                <w:lang w:val="en-US"/>
+              </w:rPr>
+              <w:t>|length</w:t>
             </w:r>
             <w:proofErr w:type="spellEnd"/>
             <w:r>
               <w:rPr>
                 <w:lang w:val="en-US"/>
               </w:rPr>
-              <w:t xml:space="preserve"> == 0 %}X{% endif %}</w:t>
+              <w:t xml:space="preserve"> == 0 %}</w:t>
+            </w:r>
+            <w:proofErr w:type="gramStart"/>
+            <w:r>
+              <w:rPr>
+                <w:lang w:val="en-US"/>
+              </w:rPr>
+              <w:t>X{</w:t>
+            </w:r>
+            <w:proofErr w:type="gramEnd"/>
+            <w:r>
+              <w:rPr>
+                <w:lang w:val="en-US"/>
+              </w:rPr>
+              <w:t>% endif %}</w:t>
             </w:r>
           </w:p>
         </w:tc>
@@ -3692,14 +4297,56 @@
               <w:rPr>
                 <w:lang w:val="en-US"/>
               </w:rPr>
-              <w:t>template_dict.special_characters.comments|length</w:t>
+              <w:t>template_</w:t>
+            </w:r>
+            <w:proofErr w:type="gramStart"/>
+            <w:r>
+              <w:rPr>
+                <w:lang w:val="en-US"/>
+              </w:rPr>
+              <w:t>dict.special</w:t>
+            </w:r>
+            <w:proofErr w:type="gramEnd"/>
+            <w:r>
+              <w:rPr>
+                <w:lang w:val="en-US"/>
+              </w:rPr>
+              <w:t>_</w:t>
+            </w:r>
+            <w:proofErr w:type="gramStart"/>
+            <w:r>
+              <w:rPr>
+                <w:lang w:val="en-US"/>
+              </w:rPr>
+              <w:t>characters.comments</w:t>
+            </w:r>
+            <w:proofErr w:type="gramEnd"/>
+            <w:r>
+              <w:rPr>
+                <w:lang w:val="en-US"/>
+              </w:rPr>
+              <w:t>|length</w:t>
             </w:r>
             <w:proofErr w:type="spellEnd"/>
             <w:r>
               <w:rPr>
                 <w:lang w:val="en-US"/>
               </w:rPr>
-              <w:t xml:space="preserve"> &gt; 0 %}X{% endif %}</w:t>
+              <w:t xml:space="preserve"> &gt; 0 %}</w:t>
+            </w:r>
+            <w:proofErr w:type="gramStart"/>
+            <w:r>
+              <w:rPr>
+                <w:lang w:val="en-US"/>
+              </w:rPr>
+              <w:t>X{</w:t>
+            </w:r>
+            <w:proofErr w:type="gramEnd"/>
+            <w:r>
+              <w:rPr>
+                <w:lang w:val="en-US"/>
+              </w:rPr>
+              <w:t>% endif %}</w:t>
             </w:r>
           </w:p>
         </w:tc>
@@ -3794,7 +4441,19 @@
             </w:r>
             <w:proofErr w:type="spellStart"/>
             <w:r>
-              <w:t>template_dict.restricted_files.comment</w:t>
+              <w:t>template_</w:t>
+            </w:r>
+            <w:proofErr w:type="gramStart"/>
+            <w:r>
+              <w:t>dict.restricted</w:t>
+            </w:r>
+            <w:proofErr w:type="gramEnd"/>
+            <w:r>
+              <w:t>_</w:t>
+            </w:r>
+            <w:proofErr w:type="gramStart"/>
+            <w:r>
+              <w:t>files.comment</w:t>
             </w:r>
             <w:r>
               <w:rPr>
@@ -3802,6 +4461,7 @@
               </w:rPr>
               <w:t>s</w:t>
             </w:r>
+            <w:proofErr w:type="gramEnd"/>
             <w:r>
               <w:t>|length</w:t>
             </w:r>
@@ -3810,22 +4470,55 @@
               <w:t xml:space="preserve"> &gt; 0</w:t>
             </w:r>
             <w:r>
-              <w:t xml:space="preserve"> %}</w:t>
-            </w:r>
-            <w:r>
-              <w:rPr>
-                <w:lang w:val="en-US"/>
-              </w:rPr>
-              <w:t xml:space="preserve">{% for item in </w:t>
+              <w:t xml:space="preserve"> </w:t>
+            </w:r>
+            <w:proofErr w:type="gramStart"/>
+            <w:r>
+              <w:t>%}</w:t>
+            </w:r>
+            <w:r>
+              <w:rPr>
+                <w:lang w:val="en-US"/>
+              </w:rPr>
+              <w:t>{</w:t>
+            </w:r>
+            <w:proofErr w:type="gramEnd"/>
+            <w:r>
+              <w:rPr>
+                <w:lang w:val="en-US"/>
+              </w:rPr>
+              <w:t xml:space="preserve">% for item in </w:t>
             </w:r>
             <w:proofErr w:type="spellStart"/>
             <w:r>
               <w:rPr>
                 <w:lang w:val="en-US"/>
               </w:rPr>
-              <w:t>template_dict.special_characters.comments</w:t>
+              <w:t>template_</w:t>
+            </w:r>
+            <w:proofErr w:type="gramStart"/>
+            <w:r>
+              <w:rPr>
+                <w:lang w:val="en-US"/>
+              </w:rPr>
+              <w:t>dict.special</w:t>
+            </w:r>
+            <w:proofErr w:type="gramEnd"/>
+            <w:r>
+              <w:rPr>
+                <w:lang w:val="en-US"/>
+              </w:rPr>
+              <w:t>_</w:t>
+            </w:r>
+            <w:proofErr w:type="gramStart"/>
+            <w:r>
+              <w:rPr>
+                <w:lang w:val="en-US"/>
+              </w:rPr>
+              <w:t>characters.comments</w:t>
             </w:r>
             <w:proofErr w:type="spellEnd"/>
+            <w:proofErr w:type="gramEnd"/>
             <w:r>
               <w:rPr>
                 <w:lang w:val="en-US"/>
@@ -3841,6 +4534,7 @@
                 <w:numId w:val="25"/>
               </w:numPr>
             </w:pPr>
+            <w:proofErr w:type="gramStart"/>
             <w:r>
               <w:rPr>
                 <w:lang w:val="en-US"/>
@@ -3852,16 +4546,38 @@
               <w:rPr>
                 <w:lang w:val="en-US"/>
               </w:rPr>
-              <w:t>item.file_name</w:t>
+              <w:t>item</w:t>
+            </w:r>
+            <w:proofErr w:type="gramEnd"/>
+            <w:r>
+              <w:rPr>
+                <w:lang w:val="en-US"/>
+              </w:rPr>
+              <w:t>.file_</w:t>
+            </w:r>
+            <w:proofErr w:type="gramStart"/>
+            <w:r>
+              <w:rPr>
+                <w:lang w:val="en-US"/>
+              </w:rPr>
+              <w:t>name</w:t>
             </w:r>
             <w:proofErr w:type="spellEnd"/>
             <w:r>
               <w:rPr>
                 <w:lang w:val="en-US"/>
               </w:rPr>
-              <w:t xml:space="preserve"> }}{% </w:t>
+              <w:t xml:space="preserve"> }}{</w:t>
+            </w:r>
+            <w:proofErr w:type="gramEnd"/>
+            <w:r>
+              <w:rPr>
+                <w:lang w:val="en-US"/>
+              </w:rPr>
+              <w:t xml:space="preserve">% </w:t>
             </w:r>
             <w:proofErr w:type="spellStart"/>
+            <w:proofErr w:type="gramStart"/>
             <w:r>
               <w:rPr>
                 <w:lang w:val="en-US"/>
@@ -3875,6 +4591,7 @@
               </w:rPr>
               <w:t xml:space="preserve"> %}</w:t>
             </w:r>
+            <w:proofErr w:type="gramEnd"/>
           </w:p>
           <w:p>
             <w:pPr>
@@ -3888,7 +4605,23 @@
               </w:rPr>
             </w:pPr>
             <w:r>
-              <w:t>{% else %}(NONE){% endif %}</w:t>
+              <w:t xml:space="preserve">{% else </w:t>
+            </w:r>
+            <w:proofErr w:type="gramStart"/>
+            <w:r>
+              <w:t>%}(</w:t>
+            </w:r>
+            <w:proofErr w:type="gramEnd"/>
+            <w:r>
+              <w:t>NONE</w:t>
+            </w:r>
+            <w:proofErr w:type="gramStart"/>
+            <w:r>
+              <w:t>){</w:t>
+            </w:r>
+            <w:proofErr w:type="gramEnd"/>
+            <w:r>
+              <w:t>% endif %}</w:t>
             </w:r>
           </w:p>
         </w:tc>
@@ -4060,14 +4793,14 @@
               <w:rPr>
                 <w:lang w:val="en-US"/>
               </w:rPr>
-              <w:t xml:space="preserve">Not all the files require a file extension (e.g. a README file can either be </w:t>
+              <w:t xml:space="preserve">Not all the files require a file extension (e.g. a </w:t>
             </w:r>
             <w:r>
               <w:rPr>
                 <w:lang w:val="en-US"/>
               </w:rPr>
               <w:lastRenderedPageBreak/>
-              <w:t>‘README’ or ‘README.md’). Curator needs to check on a case-by-case basis.</w:t>
+              <w:t>README file can either be ‘README’ or ‘README.md’). Curator needs to check on a case-by-case basis.</w:t>
             </w:r>
           </w:p>
         </w:tc>
@@ -4106,20 +4839,50 @@
               <w:rPr>
                 <w:lang w:val="en-US"/>
               </w:rPr>
-              <w:t>template_dict.</w:t>
+              <w:t>template_</w:t>
+            </w:r>
+            <w:proofErr w:type="gramStart"/>
+            <w:r>
+              <w:rPr>
+                <w:lang w:val="en-US"/>
+              </w:rPr>
+              <w:t>dict.</w:t>
             </w:r>
             <w:r>
               <w:rPr>
                 <w:rFonts w:hint="eastAsia"/>
                 <w:lang w:val="en-US"/>
               </w:rPr>
-              <w:t>file_ext</w:t>
-            </w:r>
-            <w:r>
-              <w:rPr>
-                <w:lang w:val="en-US"/>
-              </w:rPr>
-              <w:t>.comments|length</w:t>
+              <w:t>file</w:t>
+            </w:r>
+            <w:proofErr w:type="gramEnd"/>
+            <w:r>
+              <w:rPr>
+                <w:rFonts w:hint="eastAsia"/>
+                <w:lang w:val="en-US"/>
+              </w:rPr>
+              <w:t>_</w:t>
+            </w:r>
+            <w:proofErr w:type="gramStart"/>
+            <w:r>
+              <w:rPr>
+                <w:rFonts w:hint="eastAsia"/>
+                <w:lang w:val="en-US"/>
+              </w:rPr>
+              <w:t>ext</w:t>
+            </w:r>
+            <w:r>
+              <w:rPr>
+                <w:lang w:val="en-US"/>
+              </w:rPr>
+              <w:t>.comments</w:t>
+            </w:r>
+            <w:proofErr w:type="gramEnd"/>
+            <w:r>
+              <w:rPr>
+                <w:lang w:val="en-US"/>
+              </w:rPr>
+              <w:t>|length</w:t>
             </w:r>
             <w:proofErr w:type="spellEnd"/>
             <w:r>
@@ -4139,7 +4902,21 @@
               <w:rPr>
                 <w:lang w:val="en-US"/>
               </w:rPr>
-              <w:t xml:space="preserve"> 0 %}X{% endif %}</w:t>
+              <w:t xml:space="preserve"> 0 %}</w:t>
+            </w:r>
+            <w:proofErr w:type="gramStart"/>
+            <w:r>
+              <w:rPr>
+                <w:lang w:val="en-US"/>
+              </w:rPr>
+              <w:t>X{</w:t>
+            </w:r>
+            <w:proofErr w:type="gramEnd"/>
+            <w:r>
+              <w:rPr>
+                <w:lang w:val="en-US"/>
+              </w:rPr>
+              <w:t>% endif %}</w:t>
             </w:r>
           </w:p>
         </w:tc>
@@ -4177,14 +4954,56 @@
               <w:rPr>
                 <w:lang w:val="en-US"/>
               </w:rPr>
-              <w:t>template_dict.file_ext.comments|length</w:t>
+              <w:t>template_</w:t>
+            </w:r>
+            <w:proofErr w:type="gramStart"/>
+            <w:r>
+              <w:rPr>
+                <w:lang w:val="en-US"/>
+              </w:rPr>
+              <w:t>dict.file</w:t>
+            </w:r>
+            <w:proofErr w:type="gramEnd"/>
+            <w:r>
+              <w:rPr>
+                <w:lang w:val="en-US"/>
+              </w:rPr>
+              <w:t>_</w:t>
+            </w:r>
+            <w:proofErr w:type="gramStart"/>
+            <w:r>
+              <w:rPr>
+                <w:lang w:val="en-US"/>
+              </w:rPr>
+              <w:t>ext.comments</w:t>
+            </w:r>
+            <w:proofErr w:type="gramEnd"/>
+            <w:r>
+              <w:rPr>
+                <w:lang w:val="en-US"/>
+              </w:rPr>
+              <w:t>|length</w:t>
             </w:r>
             <w:proofErr w:type="spellEnd"/>
             <w:r>
               <w:rPr>
                 <w:lang w:val="en-US"/>
               </w:rPr>
-              <w:t xml:space="preserve"> &gt; 0 %}X{% endif %}</w:t>
+              <w:t xml:space="preserve"> &gt; 0 %}</w:t>
+            </w:r>
+            <w:proofErr w:type="gramStart"/>
+            <w:r>
+              <w:rPr>
+                <w:lang w:val="en-US"/>
+              </w:rPr>
+              <w:t>X{</w:t>
+            </w:r>
+            <w:proofErr w:type="gramEnd"/>
+            <w:r>
+              <w:rPr>
+                <w:lang w:val="en-US"/>
+              </w:rPr>
+              <w:t>% endif %}</w:t>
             </w:r>
           </w:p>
         </w:tc>
@@ -4307,29 +5126,84 @@
               <w:rPr>
                 <w:lang w:val="en-US"/>
               </w:rPr>
-              <w:t>template_dict.file_ext.comments</w:t>
+              <w:t>template_</w:t>
+            </w:r>
+            <w:proofErr w:type="gramStart"/>
+            <w:r>
+              <w:rPr>
+                <w:lang w:val="en-US"/>
+              </w:rPr>
+              <w:t>dict.file</w:t>
+            </w:r>
+            <w:proofErr w:type="gramEnd"/>
+            <w:r>
+              <w:rPr>
+                <w:lang w:val="en-US"/>
+              </w:rPr>
+              <w:t>_</w:t>
+            </w:r>
+            <w:proofErr w:type="gramStart"/>
+            <w:r>
+              <w:rPr>
+                <w:lang w:val="en-US"/>
+              </w:rPr>
+              <w:t>ext.comments</w:t>
             </w:r>
             <w:proofErr w:type="spellEnd"/>
+            <w:proofErr w:type="gramEnd"/>
             <w:r>
               <w:t xml:space="preserve"> |length &gt; 0</w:t>
             </w:r>
             <w:r>
-              <w:t xml:space="preserve"> %}</w:t>
-            </w:r>
-            <w:r>
-              <w:rPr>
-                <w:lang w:val="en-US"/>
-              </w:rPr>
-              <w:t xml:space="preserve">{% for item in </w:t>
+              <w:t xml:space="preserve"> </w:t>
+            </w:r>
+            <w:proofErr w:type="gramStart"/>
+            <w:r>
+              <w:t>%}</w:t>
+            </w:r>
+            <w:r>
+              <w:rPr>
+                <w:lang w:val="en-US"/>
+              </w:rPr>
+              <w:t>{</w:t>
+            </w:r>
+            <w:proofErr w:type="gramEnd"/>
+            <w:r>
+              <w:rPr>
+                <w:lang w:val="en-US"/>
+              </w:rPr>
+              <w:t xml:space="preserve">% for item in </w:t>
             </w:r>
             <w:proofErr w:type="spellStart"/>
             <w:r>
               <w:rPr>
                 <w:lang w:val="en-US"/>
               </w:rPr>
-              <w:t>template_dict.file_ext.comments</w:t>
+              <w:t>template_</w:t>
+            </w:r>
+            <w:proofErr w:type="gramStart"/>
+            <w:r>
+              <w:rPr>
+                <w:lang w:val="en-US"/>
+              </w:rPr>
+              <w:t>dict.file</w:t>
+            </w:r>
+            <w:proofErr w:type="gramEnd"/>
+            <w:r>
+              <w:rPr>
+                <w:lang w:val="en-US"/>
+              </w:rPr>
+              <w:t>_</w:t>
+            </w:r>
+            <w:proofErr w:type="gramStart"/>
+            <w:r>
+              <w:rPr>
+                <w:lang w:val="en-US"/>
+              </w:rPr>
+              <w:t>ext.comments</w:t>
             </w:r>
             <w:proofErr w:type="spellEnd"/>
+            <w:proofErr w:type="gramEnd"/>
             <w:r>
               <w:rPr>
                 <w:lang w:val="en-US"/>
@@ -4346,6 +5220,7 @@
               </w:numPr>
               <w:spacing w:line="256" w:lineRule="auto"/>
             </w:pPr>
+            <w:proofErr w:type="gramStart"/>
             <w:r>
               <w:rPr>
                 <w:lang w:val="en-US"/>
@@ -4357,16 +5232,38 @@
               <w:rPr>
                 <w:lang w:val="en-US"/>
               </w:rPr>
-              <w:t>item.file_name</w:t>
+              <w:t>item</w:t>
+            </w:r>
+            <w:proofErr w:type="gramEnd"/>
+            <w:r>
+              <w:rPr>
+                <w:lang w:val="en-US"/>
+              </w:rPr>
+              <w:t>.file_</w:t>
+            </w:r>
+            <w:proofErr w:type="gramStart"/>
+            <w:r>
+              <w:rPr>
+                <w:lang w:val="en-US"/>
+              </w:rPr>
+              <w:t>name</w:t>
             </w:r>
             <w:proofErr w:type="spellEnd"/>
             <w:r>
               <w:rPr>
                 <w:lang w:val="en-US"/>
               </w:rPr>
-              <w:t xml:space="preserve"> }}{% </w:t>
+              <w:t xml:space="preserve"> }}{</w:t>
+            </w:r>
+            <w:proofErr w:type="gramEnd"/>
+            <w:r>
+              <w:rPr>
+                <w:lang w:val="en-US"/>
+              </w:rPr>
+              <w:t xml:space="preserve">% </w:t>
             </w:r>
             <w:proofErr w:type="spellStart"/>
+            <w:proofErr w:type="gramStart"/>
             <w:r>
               <w:rPr>
                 <w:lang w:val="en-US"/>
@@ -4380,43 +5277,62 @@
               </w:rPr>
               <w:t xml:space="preserve"> %}</w:t>
             </w:r>
+            <w:proofErr w:type="gramEnd"/>
           </w:p>
           <w:p>
             <w:pPr>
               <w:spacing w:line="256" w:lineRule="auto"/>
             </w:pPr>
             <w:r>
-              <w:t>{% else %}(NONE){% endif %}</w:t>
-            </w:r>
-          </w:p>
-        </w:tc>
-        <w:tc>
-          <w:tcPr>
-            <w:tcW w:w="0" w:type="auto"/>
-            <w:tcBorders>
-              <w:top w:val="single" w:sz="8" w:space="0" w:color="000000"/>
-              <w:left w:val="single" w:sz="8" w:space="0" w:color="000000"/>
-              <w:bottom w:val="single" w:sz="8" w:space="0" w:color="000000"/>
-              <w:right w:val="single" w:sz="8" w:space="0" w:color="000000"/>
-            </w:tcBorders>
-            <w:tcMar>
-              <w:top w:w="100" w:type="dxa"/>
-              <w:left w:w="100" w:type="dxa"/>
-              <w:bottom w:w="100" w:type="dxa"/>
-              <w:right w:w="100" w:type="dxa"/>
-            </w:tcMar>
-            <w:hideMark/>
-          </w:tcPr>
-          <w:p>
-            <w:pPr>
-              <w:rPr>
-                <w:lang w:val="en-US"/>
-              </w:rPr>
-            </w:pPr>
-            <w:r>
-              <w:rPr>
-                <w:lang w:val="en-US"/>
-              </w:rPr>
+              <w:lastRenderedPageBreak/>
+              <w:t xml:space="preserve">{% else </w:t>
+            </w:r>
+            <w:proofErr w:type="gramStart"/>
+            <w:r>
+              <w:t>%}(</w:t>
+            </w:r>
+            <w:proofErr w:type="gramEnd"/>
+            <w:r>
+              <w:t>NONE</w:t>
+            </w:r>
+            <w:proofErr w:type="gramStart"/>
+            <w:r>
+              <w:t>){</w:t>
+            </w:r>
+            <w:proofErr w:type="gramEnd"/>
+            <w:r>
+              <w:t>% endif %}</w:t>
+            </w:r>
+          </w:p>
+        </w:tc>
+        <w:tc>
+          <w:tcPr>
+            <w:tcW w:w="0" w:type="auto"/>
+            <w:tcBorders>
+              <w:top w:val="single" w:sz="8" w:space="0" w:color="000000"/>
+              <w:left w:val="single" w:sz="8" w:space="0" w:color="000000"/>
+              <w:bottom w:val="single" w:sz="8" w:space="0" w:color="000000"/>
+              <w:right w:val="single" w:sz="8" w:space="0" w:color="000000"/>
+            </w:tcBorders>
+            <w:tcMar>
+              <w:top w:w="100" w:type="dxa"/>
+              <w:left w:w="100" w:type="dxa"/>
+              <w:bottom w:w="100" w:type="dxa"/>
+              <w:right w:w="100" w:type="dxa"/>
+            </w:tcMar>
+            <w:hideMark/>
+          </w:tcPr>
+          <w:p>
+            <w:pPr>
+              <w:rPr>
+                <w:lang w:val="en-US"/>
+              </w:rPr>
+            </w:pPr>
+            <w:r>
+              <w:rPr>
+                <w:lang w:val="en-US"/>
+              </w:rPr>
+              <w:lastRenderedPageBreak/>
               <w:t>Require</w:t>
             </w:r>
           </w:p>
@@ -4716,13 +5632,34 @@
               <w:rPr>
                 <w:lang w:val="en-US"/>
               </w:rPr>
-              <w:t>template_dict.</w:t>
-            </w:r>
-            <w:r>
-              <w:rPr>
-                <w:lang w:val="en-US"/>
-              </w:rPr>
-              <w:t>common_file_format</w:t>
+              <w:t>template_</w:t>
+            </w:r>
+            <w:proofErr w:type="gramStart"/>
+            <w:r>
+              <w:rPr>
+                <w:lang w:val="en-US"/>
+              </w:rPr>
+              <w:t>dict.</w:t>
+            </w:r>
+            <w:r>
+              <w:rPr>
+                <w:lang w:val="en-US"/>
+              </w:rPr>
+              <w:t>common</w:t>
+            </w:r>
+            <w:proofErr w:type="gramEnd"/>
+            <w:r>
+              <w:rPr>
+                <w:lang w:val="en-US"/>
+              </w:rPr>
+              <w:t>_file_</w:t>
+            </w:r>
+            <w:proofErr w:type="gramStart"/>
+            <w:r>
+              <w:rPr>
+                <w:lang w:val="en-US"/>
+              </w:rPr>
+              <w:t>format</w:t>
             </w:r>
             <w:r>
               <w:rPr>
@@ -4731,30 +5668,63 @@
               <w:t>.comments</w:t>
             </w:r>
             <w:proofErr w:type="spellEnd"/>
+            <w:proofErr w:type="gramEnd"/>
             <w:r>
               <w:t>|length &gt; 0</w:t>
             </w:r>
             <w:r>
-              <w:t xml:space="preserve"> %}</w:t>
-            </w:r>
-            <w:r>
-              <w:rPr>
-                <w:lang w:val="en-US"/>
-              </w:rPr>
-              <w:t xml:space="preserve">{% for item in </w:t>
+              <w:t xml:space="preserve"> </w:t>
+            </w:r>
+            <w:proofErr w:type="gramStart"/>
+            <w:r>
+              <w:t>%}</w:t>
+            </w:r>
+            <w:r>
+              <w:rPr>
+                <w:lang w:val="en-US"/>
+              </w:rPr>
+              <w:t>{</w:t>
+            </w:r>
+            <w:proofErr w:type="gramEnd"/>
+            <w:r>
+              <w:rPr>
+                <w:lang w:val="en-US"/>
+              </w:rPr>
+              <w:t xml:space="preserve">% for item in </w:t>
             </w:r>
             <w:proofErr w:type="spellStart"/>
             <w:r>
               <w:rPr>
                 <w:lang w:val="en-US"/>
               </w:rPr>
-              <w:t>template_dict.</w:t>
-            </w:r>
-            <w:r>
-              <w:rPr>
-                <w:lang w:val="en-US"/>
-              </w:rPr>
-              <w:t>common_file_format</w:t>
+              <w:t>template_</w:t>
+            </w:r>
+            <w:proofErr w:type="gramStart"/>
+            <w:r>
+              <w:rPr>
+                <w:lang w:val="en-US"/>
+              </w:rPr>
+              <w:t>dict.</w:t>
+            </w:r>
+            <w:r>
+              <w:rPr>
+                <w:lang w:val="en-US"/>
+              </w:rPr>
+              <w:t>common</w:t>
+            </w:r>
+            <w:proofErr w:type="gramEnd"/>
+            <w:r>
+              <w:rPr>
+                <w:lang w:val="en-US"/>
+              </w:rPr>
+              <w:t>_file_</w:t>
+            </w:r>
+            <w:proofErr w:type="gramStart"/>
+            <w:r>
+              <w:rPr>
+                <w:lang w:val="en-US"/>
+              </w:rPr>
+              <w:t>format</w:t>
             </w:r>
             <w:r>
               <w:rPr>
@@ -4763,6 +5733,7 @@
               <w:t>.comments</w:t>
             </w:r>
             <w:proofErr w:type="spellEnd"/>
+            <w:proofErr w:type="gramEnd"/>
             <w:r>
               <w:rPr>
                 <w:lang w:val="en-US"/>
@@ -4777,6 +5748,7 @@
                 <w:numId w:val="32"/>
               </w:numPr>
             </w:pPr>
+            <w:proofErr w:type="gramStart"/>
             <w:r>
               <w:rPr>
                 <w:lang w:val="en-US"/>
@@ -4788,7 +5760,21 @@
               <w:rPr>
                 <w:lang w:val="en-US"/>
               </w:rPr>
-              <w:t>item.file_name</w:t>
+              <w:t>item</w:t>
+            </w:r>
+            <w:proofErr w:type="gramEnd"/>
+            <w:r>
+              <w:rPr>
+                <w:lang w:val="en-US"/>
+              </w:rPr>
+              <w:t>.file_</w:t>
+            </w:r>
+            <w:proofErr w:type="gramStart"/>
+            <w:r>
+              <w:rPr>
+                <w:lang w:val="en-US"/>
+              </w:rPr>
+              <w:t>name</w:t>
             </w:r>
             <w:proofErr w:type="spellEnd"/>
             <w:r>
@@ -4802,9 +5788,18 @@
                 <w:rFonts w:hint="eastAsia"/>
                 <w:lang w:val="en-US"/>
               </w:rPr>
-              <w:t xml:space="preserve">{% </w:t>
+              <w:t>{</w:t>
+            </w:r>
+            <w:proofErr w:type="gramEnd"/>
+            <w:r>
+              <w:rPr>
+                <w:rFonts w:hint="eastAsia"/>
+                <w:lang w:val="en-US"/>
+              </w:rPr>
+              <w:t xml:space="preserve">% </w:t>
             </w:r>
             <w:proofErr w:type="spellStart"/>
+            <w:proofErr w:type="gramStart"/>
             <w:r>
               <w:rPr>
                 <w:lang w:val="en-US"/>
@@ -4818,15 +5813,32 @@
               </w:rPr>
               <w:t xml:space="preserve"> %}</w:t>
             </w:r>
-          </w:p>
-          <w:p>
-            <w:pPr>
-              <w:rPr>
-                <w:lang w:val="en-US"/>
-              </w:rPr>
-            </w:pPr>
-            <w:r>
-              <w:t>{% else %}(NONE){% endif %}</w:t>
+            <w:proofErr w:type="gramEnd"/>
+          </w:p>
+          <w:p>
+            <w:pPr>
+              <w:rPr>
+                <w:lang w:val="en-US"/>
+              </w:rPr>
+            </w:pPr>
+            <w:r>
+              <w:t xml:space="preserve">{% else </w:t>
+            </w:r>
+            <w:proofErr w:type="gramStart"/>
+            <w:r>
+              <w:t>%}(</w:t>
+            </w:r>
+            <w:proofErr w:type="gramEnd"/>
+            <w:r>
+              <w:t>NONE</w:t>
+            </w:r>
+            <w:proofErr w:type="gramStart"/>
+            <w:r>
+              <w:t>){</w:t>
+            </w:r>
+            <w:proofErr w:type="gramEnd"/>
+            <w:r>
+              <w:t>% endif %}</w:t>
             </w:r>
           </w:p>
         </w:tc>
@@ -5280,6 +6292,7 @@
                 <w:bCs/>
                 <w:lang w:val="en-US"/>
               </w:rPr>
+              <w:lastRenderedPageBreak/>
               <w:t>3.0</w:t>
             </w:r>
           </w:p>
@@ -5626,7 +6639,6 @@
                 <w:bCs/>
                 <w:lang w:val="en-US"/>
               </w:rPr>
-              <w:lastRenderedPageBreak/>
               <w:t>3.1</w:t>
             </w:r>
           </w:p>
@@ -5729,14 +6741,56 @@
               <w:rPr>
                 <w:lang w:val="en-US"/>
               </w:rPr>
-              <w:t>template_dict.readme_file.comments|length</w:t>
+              <w:t>template_</w:t>
+            </w:r>
+            <w:proofErr w:type="gramStart"/>
+            <w:r>
+              <w:rPr>
+                <w:lang w:val="en-US"/>
+              </w:rPr>
+              <w:t>dict.readme</w:t>
+            </w:r>
+            <w:proofErr w:type="gramEnd"/>
+            <w:r>
+              <w:rPr>
+                <w:lang w:val="en-US"/>
+              </w:rPr>
+              <w:t>_</w:t>
+            </w:r>
+            <w:proofErr w:type="gramStart"/>
+            <w:r>
+              <w:rPr>
+                <w:lang w:val="en-US"/>
+              </w:rPr>
+              <w:t>file.comments</w:t>
+            </w:r>
+            <w:proofErr w:type="gramEnd"/>
+            <w:r>
+              <w:rPr>
+                <w:lang w:val="en-US"/>
+              </w:rPr>
+              <w:t>|length</w:t>
             </w:r>
             <w:proofErr w:type="spellEnd"/>
             <w:r>
               <w:rPr>
                 <w:lang w:val="en-US"/>
               </w:rPr>
-              <w:t xml:space="preserve"> &gt; 0 %}X{% endif %}</w:t>
+              <w:t xml:space="preserve"> &gt; 0 %}</w:t>
+            </w:r>
+            <w:proofErr w:type="gramStart"/>
+            <w:r>
+              <w:rPr>
+                <w:lang w:val="en-US"/>
+              </w:rPr>
+              <w:t>X{</w:t>
+            </w:r>
+            <w:proofErr w:type="gramEnd"/>
+            <w:r>
+              <w:rPr>
+                <w:lang w:val="en-US"/>
+              </w:rPr>
+              <w:t>% endif %}</w:t>
             </w:r>
           </w:p>
         </w:tc>
@@ -5774,14 +6828,56 @@
               <w:rPr>
                 <w:lang w:val="en-US"/>
               </w:rPr>
-              <w:t>template_dict.readme_file.comments|length</w:t>
+              <w:t>template_</w:t>
+            </w:r>
+            <w:proofErr w:type="gramStart"/>
+            <w:r>
+              <w:rPr>
+                <w:lang w:val="en-US"/>
+              </w:rPr>
+              <w:t>dict.readme</w:t>
+            </w:r>
+            <w:proofErr w:type="gramEnd"/>
+            <w:r>
+              <w:rPr>
+                <w:lang w:val="en-US"/>
+              </w:rPr>
+              <w:t>_</w:t>
+            </w:r>
+            <w:proofErr w:type="gramStart"/>
+            <w:r>
+              <w:rPr>
+                <w:lang w:val="en-US"/>
+              </w:rPr>
+              <w:t>file.comments</w:t>
+            </w:r>
+            <w:proofErr w:type="gramEnd"/>
+            <w:r>
+              <w:rPr>
+                <w:lang w:val="en-US"/>
+              </w:rPr>
+              <w:t>|length</w:t>
             </w:r>
             <w:proofErr w:type="spellEnd"/>
             <w:r>
               <w:rPr>
                 <w:lang w:val="en-US"/>
               </w:rPr>
-              <w:t xml:space="preserve"> == 0 %}X{% endif %}</w:t>
+              <w:t xml:space="preserve"> == 0 %}</w:t>
+            </w:r>
+            <w:proofErr w:type="gramStart"/>
+            <w:r>
+              <w:rPr>
+                <w:lang w:val="en-US"/>
+              </w:rPr>
+              <w:t>X{</w:t>
+            </w:r>
+            <w:proofErr w:type="gramEnd"/>
+            <w:r>
+              <w:rPr>
+                <w:lang w:val="en-US"/>
+              </w:rPr>
+              <w:t>% endif %}</w:t>
             </w:r>
           </w:p>
         </w:tc>
@@ -5904,86 +7000,215 @@
               <w:rPr>
                 <w:lang w:val="en-US"/>
               </w:rPr>
-              <w:t>template_dict.readme_file.comments</w:t>
+              <w:t>template_</w:t>
+            </w:r>
+            <w:proofErr w:type="gramStart"/>
+            <w:r>
+              <w:rPr>
+                <w:lang w:val="en-US"/>
+              </w:rPr>
+              <w:t>dict.readme</w:t>
+            </w:r>
+            <w:proofErr w:type="gramEnd"/>
+            <w:r>
+              <w:rPr>
+                <w:lang w:val="en-US"/>
+              </w:rPr>
+              <w:t>_</w:t>
+            </w:r>
+            <w:proofErr w:type="gramStart"/>
+            <w:r>
+              <w:rPr>
+                <w:lang w:val="en-US"/>
+              </w:rPr>
+              <w:t>file.comments</w:t>
             </w:r>
             <w:proofErr w:type="spellEnd"/>
+            <w:proofErr w:type="gramEnd"/>
             <w:r>
               <w:t xml:space="preserve"> |length &gt; 0</w:t>
             </w:r>
             <w:r>
+              <w:t xml:space="preserve"> </w:t>
+            </w:r>
+            <w:proofErr w:type="gramStart"/>
+            <w:r>
+              <w:t>%}</w:t>
+            </w:r>
+            <w:r>
+              <w:rPr>
+                <w:lang w:val="en-US"/>
+              </w:rPr>
+              <w:t>{</w:t>
+            </w:r>
+            <w:proofErr w:type="gramEnd"/>
+            <w:r>
+              <w:rPr>
+                <w:lang w:val="en-US"/>
+              </w:rPr>
+              <w:t xml:space="preserve">% for item in </w:t>
+            </w:r>
+            <w:proofErr w:type="spellStart"/>
+            <w:r>
+              <w:rPr>
+                <w:lang w:val="en-US"/>
+              </w:rPr>
+              <w:t>template_</w:t>
+            </w:r>
+            <w:proofErr w:type="gramStart"/>
+            <w:r>
+              <w:rPr>
+                <w:lang w:val="en-US"/>
+              </w:rPr>
+              <w:t>dict.readme</w:t>
+            </w:r>
+            <w:proofErr w:type="gramEnd"/>
+            <w:r>
+              <w:rPr>
+                <w:lang w:val="en-US"/>
+              </w:rPr>
+              <w:t>_</w:t>
+            </w:r>
+            <w:proofErr w:type="gramStart"/>
+            <w:r>
+              <w:rPr>
+                <w:lang w:val="en-US"/>
+              </w:rPr>
+              <w:t>file.comments</w:t>
+            </w:r>
+            <w:proofErr w:type="spellEnd"/>
+            <w:proofErr w:type="gramEnd"/>
+            <w:r>
+              <w:rPr>
+                <w:lang w:val="en-US"/>
+              </w:rPr>
+              <w:t xml:space="preserve"> </w:t>
+            </w:r>
+            <w:proofErr w:type="gramStart"/>
+            <w:r>
+              <w:rPr>
+                <w:lang w:val="en-US"/>
+              </w:rPr>
+              <w:t xml:space="preserve">%}{{ </w:t>
+            </w:r>
+            <w:proofErr w:type="spellStart"/>
+            <w:r>
+              <w:rPr>
+                <w:lang w:val="en-US"/>
+              </w:rPr>
+              <w:t>loop</w:t>
+            </w:r>
+            <w:proofErr w:type="gramEnd"/>
+            <w:r>
+              <w:rPr>
+                <w:lang w:val="en-US"/>
+              </w:rPr>
+              <w:t>.</w:t>
+            </w:r>
+            <w:proofErr w:type="gramStart"/>
+            <w:r>
+              <w:rPr>
+                <w:lang w:val="en-US"/>
+              </w:rPr>
+              <w:t>index</w:t>
+            </w:r>
+            <w:proofErr w:type="spellEnd"/>
+            <w:r>
+              <w:rPr>
+                <w:lang w:val="en-US"/>
+              </w:rPr>
+              <w:t xml:space="preserve"> }</w:t>
+            </w:r>
+            <w:proofErr w:type="gramEnd"/>
+            <w:r>
+              <w:rPr>
+                <w:lang w:val="en-US"/>
+              </w:rPr>
+              <w:t xml:space="preserve">}. </w:t>
+            </w:r>
+            <w:proofErr w:type="gramStart"/>
+            <w:r>
+              <w:rPr>
+                <w:lang w:val="en-US"/>
+              </w:rPr>
+              <w:t xml:space="preserve">{{ </w:t>
+            </w:r>
+            <w:proofErr w:type="spellStart"/>
+            <w:r>
+              <w:rPr>
+                <w:lang w:val="en-US"/>
+              </w:rPr>
+              <w:t>item</w:t>
+            </w:r>
+            <w:proofErr w:type="gramEnd"/>
+            <w:r>
+              <w:rPr>
+                <w:lang w:val="en-US"/>
+              </w:rPr>
+              <w:t>.file_</w:t>
+            </w:r>
+            <w:proofErr w:type="gramStart"/>
+            <w:r>
+              <w:rPr>
+                <w:lang w:val="en-US"/>
+              </w:rPr>
+              <w:t>name</w:t>
+            </w:r>
+            <w:proofErr w:type="spellEnd"/>
+            <w:r>
+              <w:rPr>
+                <w:lang w:val="en-US"/>
+              </w:rPr>
+              <w:t xml:space="preserve"> }}{</w:t>
+            </w:r>
+            <w:proofErr w:type="gramEnd"/>
+            <w:r>
+              <w:rPr>
+                <w:lang w:val="en-US"/>
+              </w:rPr>
+              <w:t xml:space="preserve">% </w:t>
+            </w:r>
+            <w:proofErr w:type="spellStart"/>
+            <w:proofErr w:type="gramStart"/>
+            <w:r>
+              <w:rPr>
+                <w:lang w:val="en-US"/>
+              </w:rPr>
+              <w:t>endfor</w:t>
+            </w:r>
+            <w:proofErr w:type="spellEnd"/>
+            <w:r>
+              <w:rPr>
+                <w:lang w:val="en-US"/>
+              </w:rPr>
               <w:t xml:space="preserve"> %}</w:t>
             </w:r>
-            <w:r>
-              <w:rPr>
-                <w:lang w:val="en-US"/>
-              </w:rPr>
-              <w:t xml:space="preserve">{% for item in </w:t>
-            </w:r>
-            <w:proofErr w:type="spellStart"/>
-            <w:r>
-              <w:rPr>
-                <w:lang w:val="en-US"/>
-              </w:rPr>
-              <w:t>template_dict.readme_file.comments</w:t>
-            </w:r>
-            <w:proofErr w:type="spellEnd"/>
-            <w:r>
-              <w:rPr>
-                <w:lang w:val="en-US"/>
-              </w:rPr>
-              <w:t xml:space="preserve"> %}{{ </w:t>
-            </w:r>
-            <w:proofErr w:type="spellStart"/>
-            <w:r>
-              <w:rPr>
-                <w:lang w:val="en-US"/>
-              </w:rPr>
-              <w:t>loop.index</w:t>
-            </w:r>
-            <w:proofErr w:type="spellEnd"/>
-            <w:r>
-              <w:rPr>
-                <w:lang w:val="en-US"/>
-              </w:rPr>
-              <w:t xml:space="preserve"> }}. {{ </w:t>
-            </w:r>
-            <w:proofErr w:type="spellStart"/>
-            <w:r>
-              <w:rPr>
-                <w:lang w:val="en-US"/>
-              </w:rPr>
-              <w:t>item.file_name</w:t>
-            </w:r>
-            <w:proofErr w:type="spellEnd"/>
-            <w:r>
-              <w:rPr>
-                <w:lang w:val="en-US"/>
-              </w:rPr>
-              <w:t xml:space="preserve"> }}{% </w:t>
-            </w:r>
-            <w:proofErr w:type="spellStart"/>
-            <w:r>
-              <w:rPr>
-                <w:lang w:val="en-US"/>
-              </w:rPr>
-              <w:t>endfor</w:t>
-            </w:r>
-            <w:proofErr w:type="spellEnd"/>
-            <w:r>
-              <w:rPr>
-                <w:lang w:val="en-US"/>
-              </w:rPr>
-              <w:t xml:space="preserve"> %}</w:t>
-            </w:r>
-          </w:p>
-          <w:p>
-            <w:pPr>
-              <w:rPr>
-                <w:lang w:val="en-US"/>
-              </w:rPr>
-            </w:pPr>
-            <w:r>
-              <w:t>{% else %}(NONE){% endif %}</w:t>
+            <w:proofErr w:type="gramEnd"/>
+          </w:p>
+          <w:p>
+            <w:pPr>
+              <w:rPr>
+                <w:lang w:val="en-US"/>
+              </w:rPr>
+            </w:pPr>
+            <w:r>
+              <w:t xml:space="preserve">{% else </w:t>
+            </w:r>
+            <w:proofErr w:type="gramStart"/>
+            <w:r>
+              <w:t>%}(</w:t>
+            </w:r>
+            <w:proofErr w:type="gramEnd"/>
+            <w:r>
+              <w:t>NONE</w:t>
+            </w:r>
+            <w:proofErr w:type="gramStart"/>
+            <w:r>
+              <w:t>){</w:t>
+            </w:r>
+            <w:proofErr w:type="gramEnd"/>
+            <w:r>
+              <w:t>% endif %}</w:t>
             </w:r>
           </w:p>
         </w:tc>
@@ -6612,13 +7837,7 @@
               <w:rPr>
                 <w:lang w:val="en-US"/>
               </w:rPr>
-              <w:t xml:space="preserve">Note that the automated process might </w:t>
-            </w:r>
-            <w:r>
-              <w:rPr>
-                <w:lang w:val="en-US"/>
-              </w:rPr>
-              <w:t>flag wrongly (such as acronyms/specialized terms. Delete the items from the list accordingly.</w:t>
+              <w:t>Note that the automated process might flag wrongly (such as acronyms/specialized terms. Delete the items from the list accordingly.</w:t>
             </w:r>
           </w:p>
         </w:tc>
@@ -6805,35 +8024,93 @@
               <w:rPr>
                 <w:lang w:val="en-US"/>
               </w:rPr>
-              <w:t>template_dict.typo.comments</w:t>
+              <w:t>template_</w:t>
+            </w:r>
+            <w:proofErr w:type="gramStart"/>
+            <w:r>
+              <w:rPr>
+                <w:lang w:val="en-US"/>
+              </w:rPr>
+              <w:t>dict.typo</w:t>
+            </w:r>
+            <w:proofErr w:type="gramEnd"/>
+            <w:r>
+              <w:rPr>
+                <w:lang w:val="en-US"/>
+              </w:rPr>
+              <w:t>.</w:t>
+            </w:r>
+            <w:proofErr w:type="gramStart"/>
+            <w:r>
+              <w:rPr>
+                <w:lang w:val="en-US"/>
+              </w:rPr>
+              <w:t>comments</w:t>
             </w:r>
             <w:proofErr w:type="spellEnd"/>
             <w:r>
-              <w:t xml:space="preserve"> |length &gt; 0</w:t>
-            </w:r>
-            <w:r>
+              <w:t xml:space="preserve"> |length</w:t>
+            </w:r>
+            <w:proofErr w:type="gramEnd"/>
+            <w:r>
+              <w:t xml:space="preserve"> &gt; 0</w:t>
+            </w:r>
+            <w:r>
+              <w:t xml:space="preserve"> </w:t>
+            </w:r>
+            <w:proofErr w:type="gramStart"/>
+            <w:r>
+              <w:t>%}</w:t>
+            </w:r>
+            <w:r>
+              <w:rPr>
+                <w:lang w:val="en-US"/>
+              </w:rPr>
+              <w:t>{</w:t>
+            </w:r>
+            <w:proofErr w:type="gramEnd"/>
+            <w:r>
+              <w:rPr>
+                <w:lang w:val="en-US"/>
+              </w:rPr>
+              <w:t xml:space="preserve">% for item in </w:t>
+            </w:r>
+            <w:proofErr w:type="spellStart"/>
+            <w:r>
+              <w:rPr>
+                <w:lang w:val="en-US"/>
+              </w:rPr>
+              <w:t>template_</w:t>
+            </w:r>
+            <w:proofErr w:type="gramStart"/>
+            <w:r>
+              <w:rPr>
+                <w:lang w:val="en-US"/>
+              </w:rPr>
+              <w:t>dict.typo</w:t>
+            </w:r>
+            <w:proofErr w:type="gramEnd"/>
+            <w:r>
+              <w:rPr>
+                <w:lang w:val="en-US"/>
+              </w:rPr>
+              <w:t>.</w:t>
+            </w:r>
+            <w:proofErr w:type="gramStart"/>
+            <w:r>
+              <w:rPr>
+                <w:lang w:val="en-US"/>
+              </w:rPr>
+              <w:t>comments</w:t>
+            </w:r>
+            <w:proofErr w:type="spellEnd"/>
+            <w:r>
+              <w:rPr>
+                <w:lang w:val="en-US"/>
+              </w:rPr>
               <w:t xml:space="preserve"> %}</w:t>
             </w:r>
-            <w:r>
-              <w:rPr>
-                <w:lang w:val="en-US"/>
-              </w:rPr>
-              <w:t xml:space="preserve">{% for item in </w:t>
-            </w:r>
-            <w:proofErr w:type="spellStart"/>
-            <w:r>
-              <w:rPr>
-                <w:lang w:val="en-US"/>
-              </w:rPr>
-              <w:t>template_dict.typo.comments</w:t>
-            </w:r>
-            <w:proofErr w:type="spellEnd"/>
-            <w:r>
-              <w:rPr>
-                <w:lang w:val="en-US"/>
-              </w:rPr>
-              <w:t xml:space="preserve"> %}</w:t>
-            </w:r>
+            <w:proofErr w:type="gramEnd"/>
           </w:p>
           <w:p>
             <w:pPr>
@@ -6843,13 +8120,36 @@
                 <w:numId w:val="27"/>
               </w:numPr>
             </w:pPr>
-            <w:r>
-              <w:rPr>
-                <w:lang w:val="en-US"/>
-              </w:rPr>
-              <w:t xml:space="preserve">{{ item }}{% </w:t>
+            <w:proofErr w:type="gramStart"/>
+            <w:r>
+              <w:rPr>
+                <w:lang w:val="en-US"/>
+              </w:rPr>
+              <w:t>{{ item</w:t>
+            </w:r>
+            <w:proofErr w:type="gramEnd"/>
+            <w:r>
+              <w:rPr>
+                <w:lang w:val="en-US"/>
+              </w:rPr>
+              <w:t xml:space="preserve"> </w:t>
+            </w:r>
+            <w:proofErr w:type="gramStart"/>
+            <w:r>
+              <w:rPr>
+                <w:lang w:val="en-US"/>
+              </w:rPr>
+              <w:t>}}{</w:t>
+            </w:r>
+            <w:proofErr w:type="gramEnd"/>
+            <w:r>
+              <w:rPr>
+                <w:lang w:val="en-US"/>
+              </w:rPr>
+              <w:t xml:space="preserve">% </w:t>
             </w:r>
             <w:proofErr w:type="spellStart"/>
+            <w:proofErr w:type="gramStart"/>
             <w:r>
               <w:rPr>
                 <w:lang w:val="en-US"/>
@@ -6863,6 +8163,7 @@
               </w:rPr>
               <w:t xml:space="preserve"> %}</w:t>
             </w:r>
+            <w:proofErr w:type="gramEnd"/>
           </w:p>
           <w:p>
             <w:pPr>
@@ -6875,8 +8176,17 @@
               </w:rPr>
             </w:pPr>
             <w:r>
-              <w:t>{% else %}(NONE</w:t>
-            </w:r>
+              <w:t xml:space="preserve">{% else </w:t>
+            </w:r>
+            <w:proofErr w:type="gramStart"/>
+            <w:r>
+              <w:t>%}(</w:t>
+            </w:r>
+            <w:proofErr w:type="gramEnd"/>
+            <w:r>
+              <w:t>NONE</w:t>
+            </w:r>
+            <w:proofErr w:type="gramStart"/>
             <w:r>
               <w:rPr>
                 <w:rFonts w:hint="eastAsia"/>
@@ -6884,7 +8194,11 @@
               <w:t>)</w:t>
             </w:r>
             <w:r>
-              <w:t>{% endif %}</w:t>
+              <w:t>{</w:t>
+            </w:r>
+            <w:proofErr w:type="gramEnd"/>
+            <w:r>
+              <w:t>% endif %}</w:t>
             </w:r>
           </w:p>
         </w:tc>
@@ -7011,7 +8325,7 @@
                 <w:bCs/>
                 <w:lang w:val="en-US"/>
               </w:rPr>
-              <w:t xml:space="preserve">Do the metadata fields contain a valid entry (e.g. the content of </w:t>
+              <w:t xml:space="preserve">Do the metadata fields </w:t>
             </w:r>
             <w:r>
               <w:rPr>
@@ -7020,7 +8334,7 @@
                 <w:lang w:val="en-US"/>
               </w:rPr>
               <w:lastRenderedPageBreak/>
-              <w:t>the metadata field is relevant and meaningful)?</w:t>
+              <w:t>contain a valid entry (e.g. the content of the metadata field is relevant and meaningful)?</w:t>
             </w:r>
           </w:p>
         </w:tc>
@@ -7052,7 +8366,14 @@
                 <w:lang w:val="en-US"/>
               </w:rPr>
               <w:lastRenderedPageBreak/>
-              <w:t>Review the following fields to ensure there is a valid entry and flag any issues:</w:t>
+              <w:t xml:space="preserve">Review the following fields to ensure there is a </w:t>
+            </w:r>
+            <w:r>
+              <w:rPr>
+                <w:lang w:val="en-US"/>
+              </w:rPr>
+              <w:lastRenderedPageBreak/>
+              <w:t>valid entry and flag any issues:</w:t>
             </w:r>
           </w:p>
           <w:p>
@@ -7069,7 +8390,6 @@
               <w:rPr>
                 <w:lang w:val="en-US"/>
               </w:rPr>
-              <w:lastRenderedPageBreak/>
               <w:t>Title</w:t>
             </w:r>
           </w:p>
@@ -7337,6 +8657,7 @@
               <w:rPr>
                 <w:lang w:val="en-US"/>
               </w:rPr>
+              <w:lastRenderedPageBreak/>
               <w:t>Require</w:t>
             </w:r>
           </w:p>
@@ -7502,11 +8823,27 @@
             </w:r>
             <w:proofErr w:type="spellStart"/>
             <w:r>
-              <w:t>template_dict.none_author_affiliation</w:t>
+              <w:t>template_</w:t>
+            </w:r>
+            <w:proofErr w:type="gramStart"/>
+            <w:r>
+              <w:t>dict.none</w:t>
+            </w:r>
+            <w:proofErr w:type="gramEnd"/>
+            <w:r>
+              <w:t>_author_affiliation</w:t>
             </w:r>
             <w:proofErr w:type="spellEnd"/>
             <w:r>
-              <w:t xml:space="preserve"> %}X{% endif %}</w:t>
+              <w:t xml:space="preserve"> %}</w:t>
+            </w:r>
+            <w:proofErr w:type="gramStart"/>
+            <w:r>
+              <w:t>X{</w:t>
+            </w:r>
+            <w:proofErr w:type="gramEnd"/>
+            <w:r>
+              <w:t>% endif %}</w:t>
             </w:r>
           </w:p>
         </w:tc>
@@ -7541,11 +8878,27 @@
             </w:r>
             <w:proofErr w:type="spellStart"/>
             <w:r>
-              <w:t>template_dict.none_author_affiliation</w:t>
+              <w:t>template_</w:t>
+            </w:r>
+            <w:proofErr w:type="gramStart"/>
+            <w:r>
+              <w:t>dict.none</w:t>
+            </w:r>
+            <w:proofErr w:type="gramEnd"/>
+            <w:r>
+              <w:t>_author_affiliation</w:t>
             </w:r>
             <w:proofErr w:type="spellEnd"/>
             <w:r>
-              <w:t xml:space="preserve"> %}X{% endif %}</w:t>
+              <w:t xml:space="preserve"> %}</w:t>
+            </w:r>
+            <w:proofErr w:type="gramStart"/>
+            <w:r>
+              <w:t>X{</w:t>
+            </w:r>
+            <w:proofErr w:type="gramEnd"/>
+            <w:r>
+              <w:t>% endif %}</w:t>
             </w:r>
           </w:p>
         </w:tc>
@@ -7879,7 +9232,11 @@
             </w:r>
             <w:proofErr w:type="spellStart"/>
             <w:r>
-              <w:t>template_dict</w:t>
+              <w:t>template_</w:t>
+            </w:r>
+            <w:proofErr w:type="gramStart"/>
+            <w:r>
+              <w:t>dict</w:t>
             </w:r>
             <w:proofErr w:type="spellEnd"/>
             <w:r>
@@ -7890,11 +9247,26 @@
               <w:rPr>
                 <w:lang w:val="en-US"/>
               </w:rPr>
-              <w:t>none_author_affiliation_UT</w:t>
+              <w:t>none</w:t>
+            </w:r>
+            <w:proofErr w:type="gramEnd"/>
+            <w:r>
+              <w:rPr>
+                <w:lang w:val="en-US"/>
+              </w:rPr>
+              <w:t>_author_affiliation_UT</w:t>
             </w:r>
             <w:proofErr w:type="spellEnd"/>
             <w:r>
-              <w:t>%}X{% endif %}</w:t>
+              <w:t>%}</w:t>
+            </w:r>
+            <w:proofErr w:type="gramStart"/>
+            <w:r>
+              <w:t>X{</w:t>
+            </w:r>
+            <w:proofErr w:type="gramEnd"/>
+            <w:r>
+              <w:t>% endif %}</w:t>
             </w:r>
           </w:p>
         </w:tc>
@@ -7920,7 +9292,11 @@
             </w:r>
             <w:proofErr w:type="spellStart"/>
             <w:r>
-              <w:t>template_dict</w:t>
+              <w:t>template_</w:t>
+            </w:r>
+            <w:proofErr w:type="gramStart"/>
+            <w:r>
+              <w:t>dict</w:t>
             </w:r>
             <w:proofErr w:type="spellEnd"/>
             <w:r>
@@ -7931,11 +9307,26 @@
               <w:rPr>
                 <w:lang w:val="en-US"/>
               </w:rPr>
-              <w:t>none_author_affiliation_UT</w:t>
+              <w:t>none</w:t>
+            </w:r>
+            <w:proofErr w:type="gramEnd"/>
+            <w:r>
+              <w:rPr>
+                <w:lang w:val="en-US"/>
+              </w:rPr>
+              <w:t>_author_affiliation_UT</w:t>
             </w:r>
             <w:proofErr w:type="spellEnd"/>
             <w:r>
-              <w:t xml:space="preserve"> %}X{% endif %}</w:t>
+              <w:t xml:space="preserve"> %}</w:t>
+            </w:r>
+            <w:proofErr w:type="gramStart"/>
+            <w:r>
+              <w:t>X{</w:t>
+            </w:r>
+            <w:proofErr w:type="gramEnd"/>
+            <w:r>
+              <w:t>% endif %}</w:t>
             </w:r>
           </w:p>
         </w:tc>
@@ -8508,12 +9899,14 @@
               <w:t xml:space="preserve">Does the dataset contain any obvious sensitivity issues, such as direct </w:t>
             </w:r>
             <w:proofErr w:type="spellStart"/>
+            <w:proofErr w:type="gramStart"/>
             <w:r>
               <w:rPr>
                 <w:b/>
                 <w:bCs/>
                 <w:lang w:val="en-US"/>
               </w:rPr>
+              <w:lastRenderedPageBreak/>
               <w:t>identifiers?</w:t>
             </w:r>
             <w:r>
@@ -8526,6 +9919,7 @@
               <w:t>R</w:t>
             </w:r>
             <w:proofErr w:type="spellEnd"/>
+            <w:proofErr w:type="gramEnd"/>
           </w:p>
         </w:tc>
         <w:tc>
@@ -8559,14 +9953,15 @@
               <w:rPr>
                 <w:lang w:val="en-US"/>
               </w:rPr>
-              <w:t xml:space="preserve">Review documentation and file names and see if there are any that should be opened and reviewed (e.g. if a </w:t>
-            </w:r>
-            <w:r>
-              <w:rPr>
-                <w:lang w:val="en-US"/>
-              </w:rPr>
               <w:lastRenderedPageBreak/>
-              <w:t>file is named “participant survey”, etc.) </w:t>
+              <w:t xml:space="preserve">Review documentation and file names and see if there are any that should be opened </w:t>
+            </w:r>
+            <w:r>
+              <w:rPr>
+                <w:lang w:val="en-US"/>
+              </w:rPr>
+              <w:lastRenderedPageBreak/>
+              <w:t>and reviewed (e.g. if a file is named “participant survey”, etc.) </w:t>
             </w:r>
           </w:p>
           <w:p>
@@ -8622,11 +10017,11 @@
               </w:numPr>
             </w:pPr>
             <w:r>
-              <w:t>Canadi</w:t>
+              <w:t>Ca</w:t>
             </w:r>
             <w:r>
               <w:lastRenderedPageBreak/>
-              <w:t>an Social Insurance Number (SINs)</w:t>
+              <w:t>nadian Social Insurance Number (SINs)</w:t>
             </w:r>
           </w:p>
           <w:p>
@@ -8648,7 +10043,11 @@
               </w:numPr>
             </w:pPr>
             <w:r>
-              <w:t>Email addresses</w:t>
+              <w:t>Email addres</w:t>
+            </w:r>
+            <w:r>
+              <w:lastRenderedPageBreak/>
+              <w:t>ses</w:t>
             </w:r>
           </w:p>
           <w:p>
@@ -8659,7 +10058,6 @@
               </w:numPr>
             </w:pPr>
             <w:r>
-              <w:lastRenderedPageBreak/>
               <w:t>Phone numbers</w:t>
             </w:r>
           </w:p>
@@ -9040,14 +10438,14 @@
               <w:rPr>
                 <w:lang w:val="en-US"/>
               </w:rPr>
-              <w:t xml:space="preserve">If something is flagged in the sensitive data review (see question above), check the intake form to confirm information about </w:t>
+              <w:t xml:space="preserve">If something is flagged in the sensitive data review (see question above), check the intake form to </w:t>
             </w:r>
             <w:r>
               <w:rPr>
                 <w:lang w:val="en-US"/>
               </w:rPr>
               <w:lastRenderedPageBreak/>
-              <w:t>their REB status.</w:t>
+              <w:t>confirm information about their REB status.</w:t>
             </w:r>
           </w:p>
         </w:tc>
@@ -9542,6 +10940,7 @@
               </w:rPr>
               <w:t xml:space="preserve">List any restricted files in </w:t>
             </w:r>
+            <w:proofErr w:type="gramStart"/>
             <w:r>
               <w:rPr>
                 <w:u w:val="single"/>
@@ -9552,7 +10951,14 @@
               <w:rPr>
                 <w:u w:val="single"/>
               </w:rPr>
-              <w:t xml:space="preserve"> dataset:</w:t>
+              <w:t xml:space="preserve"> dataset</w:t>
+            </w:r>
+            <w:proofErr w:type="gramEnd"/>
+            <w:r>
+              <w:rPr>
+                <w:u w:val="single"/>
+              </w:rPr>
+              <w:t>:</w:t>
             </w:r>
             <w:r>
               <w:br/>
@@ -9562,7 +10968,19 @@
             </w:r>
             <w:proofErr w:type="spellStart"/>
             <w:r>
-              <w:t>template_dict.restricted_files.comment</w:t>
+              <w:t>template_</w:t>
+            </w:r>
+            <w:proofErr w:type="gramStart"/>
+            <w:r>
+              <w:t>dict.restricted</w:t>
+            </w:r>
+            <w:proofErr w:type="gramEnd"/>
+            <w:r>
+              <w:t>_</w:t>
+            </w:r>
+            <w:proofErr w:type="gramStart"/>
+            <w:r>
+              <w:t>files.comment</w:t>
             </w:r>
             <w:r>
               <w:rPr>
@@ -9570,6 +10988,7 @@
               </w:rPr>
               <w:t>s</w:t>
             </w:r>
+            <w:proofErr w:type="gramEnd"/>
             <w:r>
               <w:t>|length</w:t>
             </w:r>
@@ -9582,9 +11001,22 @@
             </w:r>
             <w:proofErr w:type="spellStart"/>
             <w:r>
-              <w:t>template_dict.restricted_files.comments</w:t>
+              <w:t>template_</w:t>
+            </w:r>
+            <w:proofErr w:type="gramStart"/>
+            <w:r>
+              <w:t>dict.restricted</w:t>
+            </w:r>
+            <w:proofErr w:type="gramEnd"/>
+            <w:r>
+              <w:t>_</w:t>
+            </w:r>
+            <w:proofErr w:type="gramStart"/>
+            <w:r>
+              <w:t>files.comments</w:t>
             </w:r>
             <w:proofErr w:type="spellEnd"/>
+            <w:proofErr w:type="gramEnd"/>
             <w:r>
               <w:t xml:space="preserve"> %} </w:t>
             </w:r>
@@ -9597,16 +11029,29 @@
                 <w:numId w:val="29"/>
               </w:numPr>
             </w:pPr>
+            <w:proofErr w:type="gramStart"/>
             <w:r>
               <w:t xml:space="preserve">{{ </w:t>
             </w:r>
             <w:proofErr w:type="spellStart"/>
             <w:r>
-              <w:t>item.file_name</w:t>
+              <w:t>item</w:t>
+            </w:r>
+            <w:proofErr w:type="gramEnd"/>
+            <w:r>
+              <w:t>.file_</w:t>
+            </w:r>
+            <w:proofErr w:type="gramStart"/>
+            <w:r>
+              <w:t>name</w:t>
             </w:r>
             <w:proofErr w:type="spellEnd"/>
             <w:r>
-              <w:t xml:space="preserve"> }} {% </w:t>
+              <w:t xml:space="preserve"> }</w:t>
+            </w:r>
+            <w:proofErr w:type="gramEnd"/>
+            <w:r>
+              <w:t xml:space="preserve">} {% </w:t>
             </w:r>
             <w:proofErr w:type="spellStart"/>
             <w:r>
@@ -9619,7 +11064,23 @@
           </w:p>
           <w:p>
             <w:r>
-              <w:t>{% else %}(NONE){% endif %}</w:t>
+              <w:t xml:space="preserve">{% else </w:t>
+            </w:r>
+            <w:proofErr w:type="gramStart"/>
+            <w:r>
+              <w:t>%}(</w:t>
+            </w:r>
+            <w:proofErr w:type="gramEnd"/>
+            <w:r>
+              <w:t>NONE</w:t>
+            </w:r>
+            <w:proofErr w:type="gramStart"/>
+            <w:r>
+              <w:t>){</w:t>
+            </w:r>
+            <w:proofErr w:type="gramEnd"/>
+            <w:r>
+              <w:t>% endif %}</w:t>
             </w:r>
           </w:p>
           <w:p>
@@ -9667,19 +11128,77 @@
             </w:r>
             <w:proofErr w:type="spellStart"/>
             <w:r>
-              <w:t>template_dict.terms_license.licenseName</w:t>
+              <w:t>template_</w:t>
+            </w:r>
+            <w:proofErr w:type="gramStart"/>
+            <w:r>
+              <w:t>dict.terms</w:t>
+            </w:r>
+            <w:proofErr w:type="gramEnd"/>
+            <w:r>
+              <w:t>_</w:t>
+            </w:r>
+            <w:proofErr w:type="gramStart"/>
+            <w:r>
+              <w:t>license.licenseName</w:t>
             </w:r>
             <w:proofErr w:type="spellEnd"/>
-            <w:r>
-              <w:t xml:space="preserve"> is not none %}{{ </w:t>
+            <w:proofErr w:type="gramEnd"/>
+            <w:r>
+              <w:t xml:space="preserve"> is not none </w:t>
+            </w:r>
+            <w:proofErr w:type="gramStart"/>
+            <w:r>
+              <w:t xml:space="preserve">%}{{ </w:t>
             </w:r>
             <w:proofErr w:type="spellStart"/>
             <w:r>
-              <w:t>template_dict.terms_license.licenseName</w:t>
+              <w:t>template</w:t>
+            </w:r>
+            <w:proofErr w:type="gramEnd"/>
+            <w:r>
+              <w:t>_</w:t>
+            </w:r>
+            <w:proofErr w:type="gramStart"/>
+            <w:r>
+              <w:t>dict.terms</w:t>
+            </w:r>
+            <w:proofErr w:type="gramEnd"/>
+            <w:r>
+              <w:t>_</w:t>
+            </w:r>
+            <w:proofErr w:type="gramStart"/>
+            <w:r>
+              <w:t>license.licenseName</w:t>
             </w:r>
             <w:proofErr w:type="spellEnd"/>
-            <w:r>
-              <w:t xml:space="preserve"> }}{% else %}(NONE){% endif %}</w:t>
+            <w:proofErr w:type="gramEnd"/>
+            <w:r>
+              <w:t xml:space="preserve"> </w:t>
+            </w:r>
+            <w:proofErr w:type="gramStart"/>
+            <w:r>
+              <w:t>}}{</w:t>
+            </w:r>
+            <w:proofErr w:type="gramEnd"/>
+            <w:r>
+              <w:t xml:space="preserve">% else </w:t>
+            </w:r>
+            <w:proofErr w:type="gramStart"/>
+            <w:r>
+              <w:t>%}(</w:t>
+            </w:r>
+            <w:proofErr w:type="gramEnd"/>
+            <w:r>
+              <w:t>NONE</w:t>
+            </w:r>
+            <w:proofErr w:type="gramStart"/>
+            <w:r>
+              <w:t>){</w:t>
+            </w:r>
+            <w:proofErr w:type="gramEnd"/>
+            <w:r>
+              <w:t>% endif %}</w:t>
             </w:r>
           </w:p>
           <w:p>
@@ -9723,7 +11242,7 @@
               <w:tblLook w:val="04A0" w:firstRow="1" w:lastRow="0" w:firstColumn="1" w:lastColumn="0" w:noHBand="0" w:noVBand="1"/>
             </w:tblPr>
             <w:tblGrid>
-              <w:gridCol w:w="3820"/>
+              <w:gridCol w:w="3885"/>
             </w:tblGrid>
             <w:tr>
               <w:tc>
@@ -9741,25 +11260,83 @@
                   </w:r>
                   <w:proofErr w:type="spellStart"/>
                   <w:r>
-                    <w:t>template_dict.terms_license.</w:t>
+                    <w:t>template_</w:t>
+                  </w:r>
+                  <w:proofErr w:type="gramStart"/>
+                  <w:r>
+                    <w:t>dict.terms</w:t>
+                  </w:r>
+                  <w:proofErr w:type="gramEnd"/>
+                  <w:r>
+                    <w:t>_</w:t>
+                  </w:r>
+                  <w:proofErr w:type="gramStart"/>
+                  <w:r>
+                    <w:t>license.</w:t>
                   </w:r>
                   <w:r>
                     <w:t>termsOfUse</w:t>
                   </w:r>
                   <w:proofErr w:type="spellEnd"/>
+                  <w:proofErr w:type="gramEnd"/>
                   <w:r>
-                    <w:t xml:space="preserve"> is not none %}{{ </w:t>
+                    <w:t xml:space="preserve"> is not none </w:t>
+                  </w:r>
+                  <w:proofErr w:type="gramStart"/>
+                  <w:r>
+                    <w:t xml:space="preserve">%}{{ </w:t>
                   </w:r>
                   <w:proofErr w:type="spellStart"/>
                   <w:r>
-                    <w:t>template_dict.terms_license.</w:t>
+                    <w:t>template</w:t>
+                  </w:r>
+                  <w:proofErr w:type="gramEnd"/>
+                  <w:r>
+                    <w:t>_</w:t>
+                  </w:r>
+                  <w:proofErr w:type="gramStart"/>
+                  <w:r>
+                    <w:t>dict.terms</w:t>
+                  </w:r>
+                  <w:proofErr w:type="gramEnd"/>
+                  <w:r>
+                    <w:t>_</w:t>
+                  </w:r>
+                  <w:proofErr w:type="gramStart"/>
+                  <w:r>
+                    <w:t>license.</w:t>
                   </w:r>
                   <w:r>
                     <w:t>termsOfUse</w:t>
                   </w:r>
                   <w:proofErr w:type="spellEnd"/>
+                  <w:proofErr w:type="gramEnd"/>
                   <w:r>
-                    <w:t xml:space="preserve"> }}{% else %}(NONE){% endif %}</w:t>
+                    <w:t xml:space="preserve"> </w:t>
+                  </w:r>
+                  <w:proofErr w:type="gramStart"/>
+                  <w:r>
+                    <w:t>}}{</w:t>
+                  </w:r>
+                  <w:proofErr w:type="gramEnd"/>
+                  <w:r>
+                    <w:t xml:space="preserve">% else </w:t>
+                  </w:r>
+                  <w:proofErr w:type="gramStart"/>
+                  <w:r>
+                    <w:t>%}(</w:t>
+                  </w:r>
+                  <w:proofErr w:type="gramEnd"/>
+                  <w:r>
+                    <w:t>NONE</w:t>
+                  </w:r>
+                  <w:proofErr w:type="gramStart"/>
+                  <w:r>
+                    <w:t>){</w:t>
+                  </w:r>
+                  <w:proofErr w:type="gramEnd"/>
+                  <w:r>
+                    <w:t>% endif %}</w:t>
                   </w:r>
                 </w:p>
               </w:tc>
@@ -9961,14 +11538,8 @@
               <w:rPr>
                 <w:lang w:val="en-US"/>
               </w:rPr>
-              <w:t xml:space="preserve">If there are Terms </w:t>
-            </w:r>
-            <w:r>
-              <w:rPr>
-                <w:lang w:val="en-US"/>
-              </w:rPr>
               <w:lastRenderedPageBreak/>
-              <w:t>of Access, review to ensure they are clear.</w:t>
+              <w:t>If there are Terms of Access, review to ensure they are clear.</w:t>
             </w:r>
           </w:p>
         </w:tc>
@@ -10030,7 +11601,11 @@
             </w:r>
             <w:proofErr w:type="spellStart"/>
             <w:r>
-              <w:t>restricted_files</w:t>
+              <w:t>restricted_</w:t>
+            </w:r>
+            <w:proofErr w:type="gramStart"/>
+            <w:r>
+              <w:t>files</w:t>
             </w:r>
             <w:proofErr w:type="spellEnd"/>
             <w:r>
@@ -10046,6 +11621,7 @@
               </w:rPr>
               <w:t>comments</w:t>
             </w:r>
+            <w:proofErr w:type="gramEnd"/>
             <w:r>
               <w:rPr>
                 <w:rFonts w:hint="eastAsia"/>
@@ -10076,12 +11652,25 @@
             </w:r>
             <w:proofErr w:type="spellStart"/>
             <w:r>
-              <w:t>template_dict.terms_license.</w:t>
+              <w:t>template_</w:t>
+            </w:r>
+            <w:proofErr w:type="gramStart"/>
+            <w:r>
+              <w:t>dict.terms</w:t>
+            </w:r>
+            <w:proofErr w:type="gramEnd"/>
+            <w:r>
+              <w:t>_</w:t>
+            </w:r>
+            <w:proofErr w:type="gramStart"/>
+            <w:r>
+              <w:t>license.</w:t>
             </w:r>
             <w:r>
               <w:t>termsOfAccess</w:t>
             </w:r>
             <w:proofErr w:type="spellEnd"/>
+            <w:proofErr w:type="gramEnd"/>
             <w:r>
               <w:t xml:space="preserve"> is not none</w:t>
             </w:r>
@@ -10091,8 +11680,13 @@
               </w:rPr>
               <w:t xml:space="preserve"> %}</w:t>
             </w:r>
-            <w:r>
-              <w:t>X{% endif %}</w:t>
+            <w:proofErr w:type="gramStart"/>
+            <w:r>
+              <w:t>X{</w:t>
+            </w:r>
+            <w:proofErr w:type="gramEnd"/>
+            <w:r>
+              <w:t>% endif %}</w:t>
             </w:r>
           </w:p>
         </w:tc>
@@ -10178,7 +11772,11 @@
             </w:r>
             <w:proofErr w:type="spellStart"/>
             <w:r>
-              <w:t>restricted_files</w:t>
+              <w:t>restricted_</w:t>
+            </w:r>
+            <w:proofErr w:type="gramStart"/>
+            <w:r>
+              <w:t>files</w:t>
             </w:r>
             <w:proofErr w:type="spellEnd"/>
             <w:r>
@@ -10194,6 +11792,7 @@
               </w:rPr>
               <w:t>comments</w:t>
             </w:r>
+            <w:proofErr w:type="gramEnd"/>
             <w:r>
               <w:rPr>
                 <w:rFonts w:hint="eastAsia"/>
@@ -10224,12 +11823,25 @@
             </w:r>
             <w:proofErr w:type="spellStart"/>
             <w:r>
-              <w:t>template_dict.terms_license.</w:t>
+              <w:t>template_</w:t>
+            </w:r>
+            <w:proofErr w:type="gramStart"/>
+            <w:r>
+              <w:t>dict.terms</w:t>
+            </w:r>
+            <w:proofErr w:type="gramEnd"/>
+            <w:r>
+              <w:t>_</w:t>
+            </w:r>
+            <w:proofErr w:type="gramStart"/>
+            <w:r>
+              <w:t>license.</w:t>
             </w:r>
             <w:r>
               <w:t>termsOfAccess</w:t>
             </w:r>
             <w:proofErr w:type="spellEnd"/>
+            <w:proofErr w:type="gramEnd"/>
             <w:r>
               <w:t xml:space="preserve"> is none</w:t>
             </w:r>
@@ -10239,8 +11851,13 @@
               </w:rPr>
               <w:t xml:space="preserve"> %}</w:t>
             </w:r>
-            <w:r>
-              <w:t>X{% endif %}</w:t>
+            <w:proofErr w:type="gramStart"/>
+            <w:r>
+              <w:t>X{</w:t>
+            </w:r>
+            <w:proofErr w:type="gramEnd"/>
+            <w:r>
+              <w:t>% endif %}</w:t>
             </w:r>
           </w:p>
         </w:tc>
@@ -10326,7 +11943,11 @@
             </w:r>
             <w:proofErr w:type="spellStart"/>
             <w:r>
-              <w:t>restricted_files</w:t>
+              <w:t>restricted_</w:t>
+            </w:r>
+            <w:proofErr w:type="gramStart"/>
+            <w:r>
+              <w:t>files</w:t>
             </w:r>
             <w:proofErr w:type="spellEnd"/>
             <w:r>
@@ -10342,6 +11963,7 @@
               </w:rPr>
               <w:t>comments</w:t>
             </w:r>
+            <w:proofErr w:type="gramEnd"/>
             <w:r>
               <w:rPr>
                 <w:rFonts w:hint="eastAsia"/>
@@ -10368,13 +11990,28 @@
                 <w:rFonts w:hint="eastAsia"/>
                 <w:lang w:val="en-US"/>
               </w:rPr>
-              <w:t xml:space="preserve"> %}X</w:t>
-            </w:r>
-            <w:r>
-              <w:rPr>
-                <w:lang w:val="en-US"/>
-              </w:rPr>
-              <w:t>{% endif %}</w:t>
+              <w:t xml:space="preserve"> %}</w:t>
+            </w:r>
+            <w:proofErr w:type="gramStart"/>
+            <w:r>
+              <w:rPr>
+                <w:rFonts w:hint="eastAsia"/>
+                <w:lang w:val="en-US"/>
+              </w:rPr>
+              <w:t>X</w:t>
+            </w:r>
+            <w:r>
+              <w:rPr>
+                <w:lang w:val="en-US"/>
+              </w:rPr>
+              <w:t>{</w:t>
+            </w:r>
+            <w:proofErr w:type="gramEnd"/>
+            <w:r>
+              <w:rPr>
+                <w:lang w:val="en-US"/>
+              </w:rPr>
+              <w:t>% endif %}</w:t>
             </w:r>
           </w:p>
         </w:tc>
@@ -10433,7 +12070,7 @@
               <w:tblLook w:val="04A0" w:firstRow="1" w:lastRow="0" w:firstColumn="1" w:lastColumn="0" w:noHBand="0" w:noVBand="1"/>
             </w:tblPr>
             <w:tblGrid>
-              <w:gridCol w:w="3820"/>
+              <w:gridCol w:w="3885"/>
             </w:tblGrid>
             <w:tr>
               <w:tc>
@@ -10451,25 +12088,83 @@
                   </w:r>
                   <w:proofErr w:type="spellStart"/>
                   <w:r>
-                    <w:t>template_dict.terms_license.</w:t>
+                    <w:t>template_</w:t>
+                  </w:r>
+                  <w:proofErr w:type="gramStart"/>
+                  <w:r>
+                    <w:t>dict.terms</w:t>
+                  </w:r>
+                  <w:proofErr w:type="gramEnd"/>
+                  <w:r>
+                    <w:t>_</w:t>
+                  </w:r>
+                  <w:proofErr w:type="gramStart"/>
+                  <w:r>
+                    <w:t>license.</w:t>
                   </w:r>
                   <w:r>
                     <w:t>termsOfAccess</w:t>
                   </w:r>
                   <w:proofErr w:type="spellEnd"/>
+                  <w:proofErr w:type="gramEnd"/>
                   <w:r>
-                    <w:t xml:space="preserve"> is not none %}{{ </w:t>
+                    <w:t xml:space="preserve"> is not none </w:t>
+                  </w:r>
+                  <w:proofErr w:type="gramStart"/>
+                  <w:r>
+                    <w:t xml:space="preserve">%}{{ </w:t>
                   </w:r>
                   <w:proofErr w:type="spellStart"/>
                   <w:r>
-                    <w:t>template_dict.terms_license.</w:t>
+                    <w:t>template</w:t>
+                  </w:r>
+                  <w:proofErr w:type="gramEnd"/>
+                  <w:r>
+                    <w:t>_</w:t>
+                  </w:r>
+                  <w:proofErr w:type="gramStart"/>
+                  <w:r>
+                    <w:t>dict.terms</w:t>
+                  </w:r>
+                  <w:proofErr w:type="gramEnd"/>
+                  <w:r>
+                    <w:t>_</w:t>
+                  </w:r>
+                  <w:proofErr w:type="gramStart"/>
+                  <w:r>
+                    <w:t>license.</w:t>
                   </w:r>
                   <w:r>
                     <w:t>termsOfAccess</w:t>
                   </w:r>
                   <w:proofErr w:type="spellEnd"/>
+                  <w:proofErr w:type="gramEnd"/>
                   <w:r>
-                    <w:t xml:space="preserve"> }}{% else %}(NONE){% endif %}</w:t>
+                    <w:t xml:space="preserve"> </w:t>
+                  </w:r>
+                  <w:proofErr w:type="gramStart"/>
+                  <w:r>
+                    <w:t>}}{</w:t>
+                  </w:r>
+                  <w:proofErr w:type="gramEnd"/>
+                  <w:r>
+                    <w:t xml:space="preserve">% else </w:t>
+                  </w:r>
+                  <w:proofErr w:type="gramStart"/>
+                  <w:r>
+                    <w:t>%}(</w:t>
+                  </w:r>
+                  <w:proofErr w:type="gramEnd"/>
+                  <w:r>
+                    <w:t>NONE</w:t>
+                  </w:r>
+                  <w:proofErr w:type="gramStart"/>
+                  <w:r>
+                    <w:t>){</w:t>
+                  </w:r>
+                  <w:proofErr w:type="gramEnd"/>
+                  <w:r>
+                    <w:t>% endif %}</w:t>
                   </w:r>
                 </w:p>
               </w:tc>
@@ -10802,12 +12497,21 @@
                 <w:lang w:val="en-US"/>
               </w:rPr>
             </w:pPr>
+            <w:proofErr w:type="gramStart"/>
             <w:r>
               <w:rPr>
                 <w:u w:val="single"/>
                 <w:lang w:val="en-US"/>
               </w:rPr>
-              <w:t>List files that have been flagged as potential third-party datasets:</w:t>
+              <w:t>List</w:t>
+            </w:r>
+            <w:proofErr w:type="gramEnd"/>
+            <w:r>
+              <w:rPr>
+                <w:u w:val="single"/>
+                <w:lang w:val="en-US"/>
+              </w:rPr>
+              <w:t xml:space="preserve"> files that have been flagged as potential third-party datasets:</w:t>
             </w:r>
           </w:p>
           <w:p>

</xml_diff>

<commit_message>
Hotfix for invalid syntax (endfor) in medium checklist.
</commit_message>
<xml_diff>
--- a/res/template_medium.docx
+++ b/res/template_medium.docx
@@ -1822,22 +1822,54 @@
           <w:p>
             <w:pPr>
               <w:rPr>
-                <w:lang w:val="en-US"/>
-              </w:rPr>
-            </w:pPr>
-            <w:r>
-              <w:rPr>
                 <w:u w:val="single"/>
                 <w:lang w:val="en-US"/>
               </w:rPr>
-              <w:t>List all dataverse collections that contain the depositors' dataset:</w:t>
-            </w:r>
-            <w:r>
-              <w:rPr>
-                <w:lang w:val="en-US"/>
-              </w:rPr>
-              <w:br/>
-            </w:r>
+            </w:pPr>
+            <w:r>
+              <w:rPr>
+                <w:u w:val="single"/>
+                <w:lang w:val="en-US"/>
+              </w:rPr>
+              <w:t>L</w:t>
+            </w:r>
+            <w:r>
+              <w:rPr>
+                <w:u w:val="single"/>
+                <w:lang w:val="en-US"/>
+              </w:rPr>
+              <w:t xml:space="preserve">ist </w:t>
+            </w:r>
+            <w:r>
+              <w:rPr>
+                <w:u w:val="single"/>
+                <w:lang w:val="en-US"/>
+              </w:rPr>
+              <w:t>all Dataverse collections</w:t>
+            </w:r>
+            <w:r>
+              <w:rPr>
+                <w:u w:val="single"/>
+                <w:lang w:val="en-US"/>
+              </w:rPr>
+              <w:t xml:space="preserve"> that </w:t>
+            </w:r>
+            <w:r>
+              <w:rPr>
+                <w:u w:val="single"/>
+                <w:lang w:val="en-US"/>
+              </w:rPr>
+              <w:t>contain</w:t>
+            </w:r>
+            <w:r>
+              <w:rPr>
+                <w:u w:val="single"/>
+                <w:lang w:val="en-US"/>
+              </w:rPr>
+              <w:t xml:space="preserve"> the depositors' dataset:</w:t>
+            </w:r>
+          </w:p>
+          <w:p>
             <w:r>
               <w:t xml:space="preserve">{% for item in template_dict.dv_record.comments %} </w:t>
             </w:r>
@@ -1880,9 +1912,17 @@
               <w:br/>
             </w:r>
             <w:r>
-              <w:t>{% endfor %}</w:t>
-            </w:r>
-          </w:p>
+              <w:t>{% endfor %}{% endfor %}</w:t>
+            </w:r>
+          </w:p>
+          <w:p>
+            <w:pPr>
+              <w:rPr>
+                <w:lang w:val="en-US"/>
+              </w:rPr>
+            </w:pPr>
+          </w:p>
+          <w:p/>
         </w:tc>
         <w:tc>
           <w:tcPr>
@@ -2107,14 +2147,14 @@
               <w:rPr>
                 <w:lang w:val="en-US"/>
               </w:rPr>
-              <w:t xml:space="preserve">Confirm with the depositor that they </w:t>
+              <w:t xml:space="preserve">Confirm with the depositor </w:t>
             </w:r>
             <w:r>
               <w:rPr>
                 <w:lang w:val="en-US"/>
               </w:rPr>
               <w:lastRenderedPageBreak/>
-              <w:t>actually require a dataverse (e.g., will there be future deposits?)</w:t>
+              <w:t>that they actually require a dataverse (e.g., will there be future deposits?)</w:t>
             </w:r>
           </w:p>
         </w:tc>
@@ -3162,6 +3202,7 @@
                 <w:bCs/>
                 <w:lang w:val="en-US"/>
               </w:rPr>
+              <w:lastRenderedPageBreak/>
               <w:t>2.2</w:t>
             </w:r>
           </w:p>
@@ -3197,7 +3238,7 @@
                 <w:bCs/>
                 <w:lang w:val="en-US"/>
               </w:rPr>
-              <w:t xml:space="preserve">Are all files free </w:t>
+              <w:t>Are all files free of the following special characters (</w:t>
             </w:r>
             <w:r>
               <w:rPr>
@@ -3205,8 +3246,7 @@
                 <w:bCs/>
                 <w:lang w:val="en-US"/>
               </w:rPr>
-              <w:lastRenderedPageBreak/>
-              <w:t>of the following special characters (</w:t>
+              <w:t>&lt;&gt;:"/\|?*</w:t>
             </w:r>
             <w:r>
               <w:rPr>
@@ -3214,14 +3254,6 @@
                 <w:bCs/>
                 <w:lang w:val="en-US"/>
               </w:rPr>
-              <w:t>&lt;&gt;:"/\|?*</w:t>
-            </w:r>
-            <w:r>
-              <w:rPr>
-                <w:b/>
-                <w:bCs/>
-                <w:lang w:val="en-US"/>
-              </w:rPr>
               <w:t>,@$~)?</w:t>
             </w:r>
           </w:p>
@@ -3253,7 +3285,6 @@
               <w:rPr>
                 <w:lang w:val="en-US"/>
               </w:rPr>
-              <w:lastRenderedPageBreak/>
               <w:t>Python scripted.</w:t>
             </w:r>
           </w:p>
@@ -3285,77 +3316,63 @@
               <w:rPr>
                 <w:lang w:val="en-US"/>
               </w:rPr>
-              <w:t>{% if template_dict.special_characters.</w:t>
-            </w:r>
-            <w:r>
-              <w:rPr>
-                <w:lang w:val="en-US"/>
-              </w:rPr>
-              <w:lastRenderedPageBreak/>
-              <w:t>comments|length == 0 %}X{% endif %}</w:t>
-            </w:r>
-          </w:p>
-        </w:tc>
-        <w:tc>
-          <w:tcPr>
-            <w:tcW w:w="0" w:type="auto"/>
-            <w:tcBorders>
-              <w:top w:val="single" w:sz="8" w:space="0" w:color="000000"/>
-              <w:left w:val="single" w:sz="8" w:space="0" w:color="000000"/>
-              <w:bottom w:val="single" w:sz="8" w:space="0" w:color="000000"/>
-              <w:right w:val="single" w:sz="8" w:space="0" w:color="000000"/>
-            </w:tcBorders>
-            <w:tcMar>
-              <w:top w:w="100" w:type="dxa"/>
-              <w:left w:w="100" w:type="dxa"/>
-              <w:bottom w:w="100" w:type="dxa"/>
-              <w:right w:w="100" w:type="dxa"/>
-            </w:tcMar>
-            <w:hideMark/>
-          </w:tcPr>
-          <w:p>
-            <w:pPr>
-              <w:rPr>
-                <w:lang w:val="en-US"/>
-              </w:rPr>
-            </w:pPr>
-          </w:p>
-        </w:tc>
-        <w:tc>
-          <w:tcPr>
-            <w:tcW w:w="0" w:type="auto"/>
-            <w:tcBorders>
-              <w:top w:val="single" w:sz="8" w:space="0" w:color="000000"/>
-              <w:left w:val="single" w:sz="8" w:space="0" w:color="000000"/>
-              <w:bottom w:val="single" w:sz="8" w:space="0" w:color="000000"/>
-              <w:right w:val="single" w:sz="8" w:space="0" w:color="000000"/>
-            </w:tcBorders>
-            <w:tcMar>
-              <w:top w:w="100" w:type="dxa"/>
-              <w:left w:w="100" w:type="dxa"/>
-              <w:bottom w:w="100" w:type="dxa"/>
-              <w:right w:w="100" w:type="dxa"/>
-            </w:tcMar>
-            <w:hideMark/>
-          </w:tcPr>
-          <w:p>
-            <w:pPr>
-              <w:rPr>
-                <w:lang w:val="en-US"/>
-              </w:rPr>
-            </w:pPr>
-            <w:r>
-              <w:rPr>
-                <w:lang w:val="en-US"/>
-              </w:rPr>
-              <w:t>{% if template_dict.special_characters.</w:t>
-            </w:r>
-            <w:r>
-              <w:rPr>
-                <w:lang w:val="en-US"/>
-              </w:rPr>
-              <w:lastRenderedPageBreak/>
-              <w:t>comments|length &gt; 0 %}X{% endif %}</w:t>
+              <w:t>{% if template_dict.special_characters.comments|length == 0 %}X{% endif %}</w:t>
+            </w:r>
+          </w:p>
+        </w:tc>
+        <w:tc>
+          <w:tcPr>
+            <w:tcW w:w="0" w:type="auto"/>
+            <w:tcBorders>
+              <w:top w:val="single" w:sz="8" w:space="0" w:color="000000"/>
+              <w:left w:val="single" w:sz="8" w:space="0" w:color="000000"/>
+              <w:bottom w:val="single" w:sz="8" w:space="0" w:color="000000"/>
+              <w:right w:val="single" w:sz="8" w:space="0" w:color="000000"/>
+            </w:tcBorders>
+            <w:tcMar>
+              <w:top w:w="100" w:type="dxa"/>
+              <w:left w:w="100" w:type="dxa"/>
+              <w:bottom w:w="100" w:type="dxa"/>
+              <w:right w:w="100" w:type="dxa"/>
+            </w:tcMar>
+            <w:hideMark/>
+          </w:tcPr>
+          <w:p>
+            <w:pPr>
+              <w:rPr>
+                <w:lang w:val="en-US"/>
+              </w:rPr>
+            </w:pPr>
+          </w:p>
+        </w:tc>
+        <w:tc>
+          <w:tcPr>
+            <w:tcW w:w="0" w:type="auto"/>
+            <w:tcBorders>
+              <w:top w:val="single" w:sz="8" w:space="0" w:color="000000"/>
+              <w:left w:val="single" w:sz="8" w:space="0" w:color="000000"/>
+              <w:bottom w:val="single" w:sz="8" w:space="0" w:color="000000"/>
+              <w:right w:val="single" w:sz="8" w:space="0" w:color="000000"/>
+            </w:tcBorders>
+            <w:tcMar>
+              <w:top w:w="100" w:type="dxa"/>
+              <w:left w:w="100" w:type="dxa"/>
+              <w:bottom w:w="100" w:type="dxa"/>
+              <w:right w:w="100" w:type="dxa"/>
+            </w:tcMar>
+            <w:hideMark/>
+          </w:tcPr>
+          <w:p>
+            <w:pPr>
+              <w:rPr>
+                <w:lang w:val="en-US"/>
+              </w:rPr>
+            </w:pPr>
+            <w:r>
+              <w:rPr>
+                <w:lang w:val="en-US"/>
+              </w:rPr>
+              <w:t>{% if template_dict.special_characters.comments|length &gt; 0 %}X{% endif %}</w:t>
             </w:r>
           </w:p>
         </w:tc>
@@ -3445,7 +3462,6 @@
               <w:br/>
             </w:r>
             <w:r>
-              <w:lastRenderedPageBreak/>
               <w:t>{% if template_dict.restricted_files.comments|length &gt; 0 and template_dict.restricted_files.comments|length &lt; 50 %}{% for item in template_dict.special_characters.comments %}</w:t>
             </w:r>
           </w:p>
@@ -3522,7 +3538,6 @@
               <w:rPr>
                 <w:lang w:val="en-US"/>
               </w:rPr>
-              <w:lastRenderedPageBreak/>
               <w:t>Recommend</w:t>
             </w:r>
           </w:p>
@@ -4038,37 +4053,46 @@
                 <w:b/>
                 <w:bCs/>
               </w:rPr>
-              <w:t>Do all files appear on the common file format list?</w:t>
-            </w:r>
-          </w:p>
-        </w:tc>
-        <w:tc>
-          <w:tcPr>
-            <w:tcW w:w="0" w:type="auto"/>
-            <w:tcBorders>
-              <w:top w:val="single" w:sz="8" w:space="0" w:color="000000"/>
-              <w:left w:val="single" w:sz="8" w:space="0" w:color="000000"/>
-              <w:bottom w:val="single" w:sz="8" w:space="0" w:color="000000"/>
-              <w:right w:val="single" w:sz="8" w:space="0" w:color="000000"/>
-            </w:tcBorders>
-            <w:tcMar>
-              <w:top w:w="100" w:type="dxa"/>
-              <w:left w:w="100" w:type="dxa"/>
-              <w:bottom w:w="100" w:type="dxa"/>
-              <w:right w:w="100" w:type="dxa"/>
-            </w:tcMar>
-            <w:hideMark/>
-          </w:tcPr>
-          <w:p>
-            <w:pPr>
-              <w:rPr>
-                <w:lang w:val="en-US"/>
-              </w:rPr>
-            </w:pPr>
-            <w:r>
-              <w:rPr>
-                <w:lang w:val="en-US"/>
-              </w:rPr>
+              <w:t xml:space="preserve">Do all files appear on the common </w:t>
+            </w:r>
+            <w:r>
+              <w:rPr>
+                <w:b/>
+                <w:bCs/>
+              </w:rPr>
+              <w:lastRenderedPageBreak/>
+              <w:t>file format list?</w:t>
+            </w:r>
+          </w:p>
+        </w:tc>
+        <w:tc>
+          <w:tcPr>
+            <w:tcW w:w="0" w:type="auto"/>
+            <w:tcBorders>
+              <w:top w:val="single" w:sz="8" w:space="0" w:color="000000"/>
+              <w:left w:val="single" w:sz="8" w:space="0" w:color="000000"/>
+              <w:bottom w:val="single" w:sz="8" w:space="0" w:color="000000"/>
+              <w:right w:val="single" w:sz="8" w:space="0" w:color="000000"/>
+            </w:tcBorders>
+            <w:tcMar>
+              <w:top w:w="100" w:type="dxa"/>
+              <w:left w:w="100" w:type="dxa"/>
+              <w:bottom w:w="100" w:type="dxa"/>
+              <w:right w:w="100" w:type="dxa"/>
+            </w:tcMar>
+            <w:hideMark/>
+          </w:tcPr>
+          <w:p>
+            <w:pPr>
+              <w:rPr>
+                <w:lang w:val="en-US"/>
+              </w:rPr>
+            </w:pPr>
+            <w:r>
+              <w:rPr>
+                <w:lang w:val="en-US"/>
+              </w:rPr>
+              <w:lastRenderedPageBreak/>
               <w:t>Python scripted.</w:t>
             </w:r>
           </w:p>
@@ -4237,11 +4261,11 @@
               <w:br/>
             </w:r>
             <w:r>
-              <w:t xml:space="preserve">{% if template_dict.common_file_format.comments|length &gt; 0 and template_dict.common_file_format.comments|length &lt; 50 %}{% for item in </w:t>
+              <w:t xml:space="preserve">{% if template_dict.common_file_format.comments|length &gt; 0 and </w:t>
             </w:r>
             <w:r>
               <w:lastRenderedPageBreak/>
-              <w:t>template_dict.common_file_format.comments %}</w:t>
+              <w:t>template_dict.common_file_format.comments|length &lt; 50 %}{% for item in template_dict.common_file_format.comments %}</w:t>
             </w:r>
           </w:p>
           <w:p>
@@ -5183,14 +5207,14 @@
               <w:rPr>
                 <w:lang w:val="en-US"/>
               </w:rPr>
-              <w:t xml:space="preserve">Read the `ds_tree.txt` file in the log_files folder to identify whether there is a README file, but it is not </w:t>
+              <w:t xml:space="preserve">Read the `ds_tree.txt` file in the log_files folder to identify whether there is a README </w:t>
             </w:r>
             <w:r>
               <w:rPr>
                 <w:lang w:val="en-US"/>
               </w:rPr>
               <w:lastRenderedPageBreak/>
-              <w:t>named with ‘README’</w:t>
+              <w:t>file, but it is not named with ‘README’</w:t>
             </w:r>
           </w:p>
         </w:tc>
@@ -5472,6 +5496,7 @@
               <w:rPr>
                 <w:lang w:val="en-US"/>
               </w:rPr>
+              <w:lastRenderedPageBreak/>
               <w:t>Require</w:t>
             </w:r>
           </w:p>
@@ -6447,7 +6472,7 @@
                 <w:bCs/>
                 <w:lang w:val="en-US"/>
               </w:rPr>
-              <w:t xml:space="preserve">Do the metadata fields contain a valid entry (e.g. the content of the metadata field is relevant and </w:t>
+              <w:t xml:space="preserve">Do the metadata fields contain a valid entry (e.g. the content of the metadata field is </w:t>
             </w:r>
             <w:r>
               <w:rPr>
@@ -6456,7 +6481,7 @@
                 <w:lang w:val="en-US"/>
               </w:rPr>
               <w:lastRenderedPageBreak/>
-              <w:t>meaningful)?</w:t>
+              <w:t>relevant and meaningful)?</w:t>
             </w:r>
           </w:p>
         </w:tc>
@@ -6539,6 +6564,7 @@
               <w:rPr>
                 <w:lang w:val="en-US"/>
               </w:rPr>
+              <w:lastRenderedPageBreak/>
               <w:t>Subject</w:t>
             </w:r>
           </w:p>
@@ -6556,7 +6582,6 @@
               <w:rPr>
                 <w:lang w:val="en-US"/>
               </w:rPr>
-              <w:lastRenderedPageBreak/>
               <w:t>Author name &amp; affiliation</w:t>
             </w:r>
           </w:p>
@@ -7942,16 +7967,23 @@
                 <w:bCs/>
                 <w:lang w:val="en-US"/>
               </w:rPr>
-              <w:t>Does the dataset contain any obvious sensitivity issues, such as direct identifiers?</w:t>
-            </w:r>
-            <w:r>
-              <w:rPr>
-                <w:rFonts w:hint="eastAsia"/>
+              <w:t xml:space="preserve">Does the dataset contain any obvious sensitivity issues, such as direct </w:t>
+            </w:r>
+            <w:r>
+              <w:rPr>
                 <w:b/>
                 <w:bCs/>
                 <w:lang w:val="en-US"/>
               </w:rPr>
-              <w:t>R</w:t>
+              <w:t>identifiers</w:t>
+            </w:r>
+            <w:r>
+              <w:rPr>
+                <w:b/>
+                <w:bCs/>
+                <w:lang w:val="en-US"/>
+              </w:rPr>
+              <w:t>?</w:t>
             </w:r>
           </w:p>
         </w:tc>
@@ -8302,12 +8334,6 @@
                 <w:numId w:val="43"/>
               </w:numPr>
             </w:pPr>
-            <w:r>
-              <w:rPr>
-                <w:lang w:val="en-US"/>
-              </w:rPr>
-              <w:t>{{ item }}{% endfor %}</w:t>
-            </w:r>
           </w:p>
           <w:p>
             <w:pPr>

</xml_diff>